<commit_message>
docs: generar modelo ER con Mermaid
</commit_message>
<xml_diff>
--- a/docs/Documentacion_Base_de_Datos_Eventos_Culturales.docx
+++ b/docs/Documentacion_Base_de_Datos_Eventos_Culturales.docx
@@ -360,7 +360,7 @@
       <w:r>
         <w:drawing>
           <wp:inline distT="0" distB="0" distL="0" distR="0">
-            <wp:extent cx="5905500" cy="2867025"/>
+            <wp:extent cx="5905500" cy="2343150"/>
             <wp:effectExtent t="0" r="0" b="0" l="0"/>
             <wp:docPr id="1" name="" descr="" title=""/>
             <wp:cNvGraphicFramePr>
@@ -385,7 +385,7 @@
                   <pic:spPr bwMode="auto">
                     <a:xfrm>
                       <a:off x="0" y="0"/>
-                      <a:ext cx="5905500" cy="2867025"/>
+                      <a:ext cx="5905500" cy="2343150"/>
                     </a:xfrm>
                     <a:prstGeom prst="rect">
                       <a:avLst/>

</xml_diff>

<commit_message>
docs: mejorar diagrama visual de datos
</commit_message>
<xml_diff>
--- a/docs/Documentacion_Base_de_Datos_Eventos_Culturales.docx
+++ b/docs/Documentacion_Base_de_Datos_Eventos_Culturales.docx
@@ -360,7 +360,7 @@
       <w:r>
         <w:drawing>
           <wp:inline distT="0" distB="0" distL="0" distR="0">
-            <wp:extent cx="5905500" cy="2343150"/>
+            <wp:extent cx="5429250" cy="6162675"/>
             <wp:effectExtent t="0" r="0" b="0" l="0"/>
             <wp:docPr id="1" name="" descr="" title=""/>
             <wp:cNvGraphicFramePr>
@@ -385,7 +385,7 @@
                   <pic:spPr bwMode="auto">
                     <a:xfrm>
                       <a:off x="0" y="0"/>
-                      <a:ext cx="5905500" cy="2343150"/>
+                      <a:ext cx="5429250" cy="6162675"/>
                     </a:xfrm>
                     <a:prstGeom prst="rect">
                       <a:avLst/>
@@ -412,7 +412,41 @@
           <w:sz w:val="15"/>
           <w:szCs w:val="15"/>
         </w:rPr>
-        <w:t xml:space="preserve">Figura 1. Relaciones principales del esquema vigente.</w:t>
+        <w:t xml:space="preserve">Figura 1. Vista por capas del modelo de datos vigente.</w:t>
+      </w:r>
+    </w:p>
+    <w:p>
+      <w:pPr>
+        <w:spacing w:after="90" w:line="270"/>
+        <w:jc w:val="both"/>
+      </w:pPr>
+      <w:r>
+        <w:rPr>
+          <w:rFonts w:ascii="Arial" w:cs="Arial" w:eastAsia="Arial" w:hAnsi="Arial"/>
+          <w:color w:val="26343B"/>
+          <w:sz w:val="18"/>
+          <w:szCs w:val="18"/>
+        </w:rPr>
+        <w:t xml:space="preserve">Esta vista prioriza la lectura arquitectónica. Las cardinalidades formales se conservan en el archivo técnico </w:t>
+      </w:r>
+      <w:r>
+        <w:rPr>
+          <w:rFonts w:ascii="Consolas" w:cs="Consolas" w:eastAsia="Consolas" w:hAnsi="Consolas"/>
+          <w:color w:val="368991"/>
+          <w:sz w:val="17"/>
+          <w:szCs w:val="17"/>
+          <w:shd w:fill="EAF2F3" w:val="clear"/>
+        </w:rPr>
+        <w:t xml:space="preserve">modelo_er.mmd</w:t>
+      </w:r>
+      <w:r>
+        <w:rPr>
+          <w:rFonts w:ascii="Arial" w:cs="Arial" w:eastAsia="Arial" w:hAnsi="Arial"/>
+          <w:color w:val="26343B"/>
+          <w:sz w:val="18"/>
+          <w:szCs w:val="18"/>
+        </w:rPr>
+        <w:t xml:space="preserve">, que funciona como referencia relacional versionada.</w:t>
       </w:r>
     </w:p>
     <w:p>

</xml_diff>

<commit_message>
docs: alinear diccionario Word con Markdown
</commit_message>
<xml_diff>
--- a/docs/Documentacion_Base_de_Datos_Eventos_Culturales.docx
+++ b/docs/Documentacion_Base_de_Datos_Eventos_Culturales.docx
@@ -40,24 +40,7 @@
           <w:sz w:val="34"/>
           <w:szCs w:val="34"/>
         </w:rPr>
-        <w:t xml:space="preserve">Base de datos de</w:t>
-      </w:r>
-    </w:p>
-    <w:p>
-      <w:pPr>
-        <w:spacing w:after="190"/>
-        <w:jc w:val="center"/>
-      </w:pPr>
-      <w:r>
-        <w:rPr>
-          <w:rFonts w:ascii="Cambria" w:cs="Cambria" w:eastAsia="Cambria" w:hAnsi="Cambria"/>
-          <w:b/>
-          <w:bCs/>
-          <w:color w:val="26343B"/>
-          <w:sz w:val="38"/>
-          <w:szCs w:val="38"/>
-        </w:rPr>
-        <w:t xml:space="preserve">eventos culturales</w:t>
+        <w:t xml:space="preserve">Base de datos de eventos culturales</w:t>
       </w:r>
     </w:p>
     <w:p>
@@ -173,7 +156,7 @@
           <w:sz w:val="17"/>
           <w:szCs w:val="17"/>
         </w:rPr>
-        <w:t xml:space="preserve">01  Vista general</w:t>
+        <w:t xml:space="preserve">00  Control documental</w:t>
       </w:r>
     </w:p>
     <w:p>
@@ -187,7 +170,7 @@
           <w:sz w:val="17"/>
           <w:szCs w:val="17"/>
         </w:rPr>
-        <w:t xml:space="preserve">02  Convenciones generales</w:t>
+        <w:t xml:space="preserve">01  Vista general</w:t>
       </w:r>
     </w:p>
     <w:p>
@@ -201,7 +184,7 @@
           <w:sz w:val="17"/>
           <w:szCs w:val="17"/>
         </w:rPr>
-        <w:t xml:space="preserve">03  Diccionario de tablas y columnas</w:t>
+        <w:t xml:space="preserve">02  Convenciones generales</w:t>
       </w:r>
     </w:p>
     <w:p>
@@ -215,7 +198,7 @@
           <w:sz w:val="17"/>
           <w:szCs w:val="17"/>
         </w:rPr>
-        <w:t xml:space="preserve">04  Índices y reglas de integridad</w:t>
+        <w:t xml:space="preserve">03  Diccionario de tablas y columnas</w:t>
       </w:r>
     </w:p>
     <w:p>
@@ -229,7 +212,7 @@
           <w:sz w:val="17"/>
           <w:szCs w:val="17"/>
         </w:rPr>
-        <w:t xml:space="preserve">05  Diccionario de categorías observadas</w:t>
+        <w:t xml:space="preserve">04  Índices y reglas de integridad</w:t>
       </w:r>
     </w:p>
     <w:p>
@@ -243,7 +226,7 @@
           <w:sz w:val="17"/>
           <w:szCs w:val="17"/>
         </w:rPr>
-        <w:t xml:space="preserve">06  Recomendación de taxonomía</w:t>
+        <w:t xml:space="preserve">05  Diccionario de categorías observadas</w:t>
       </w:r>
     </w:p>
     <w:p>
@@ -257,7 +240,7 @@
           <w:sz w:val="17"/>
           <w:szCs w:val="17"/>
         </w:rPr>
-        <w:t xml:space="preserve">07  Seguridad y acceso</w:t>
+        <w:t xml:space="preserve">06  Recomendación de taxonomía</w:t>
       </w:r>
     </w:p>
     <w:p>
@@ -271,7 +254,7 @@
           <w:sz w:val="17"/>
           <w:szCs w:val="17"/>
         </w:rPr>
-        <w:t xml:space="preserve">08  Ciclo de carga</w:t>
+        <w:t xml:space="preserve">07  Seguridad y acceso</w:t>
       </w:r>
     </w:p>
     <w:p>
@@ -285,7 +268,7 @@
           <w:sz w:val="17"/>
           <w:szCs w:val="17"/>
         </w:rPr>
-        <w:t xml:space="preserve">09  Consultas útiles</w:t>
+        <w:t xml:space="preserve">08  Ciclo de carga</w:t>
       </w:r>
     </w:p>
     <w:p>
@@ -299,39 +282,1426 @@
           <w:sz w:val="17"/>
           <w:szCs w:val="17"/>
         </w:rPr>
+        <w:t xml:space="preserve">09  Consultas útiles</w:t>
+      </w:r>
+    </w:p>
+    <w:p>
+      <w:pPr>
+        <w:spacing w:after="90"/>
+      </w:pPr>
+      <w:r>
+        <w:rPr>
+          <w:rFonts w:ascii="Arial" w:cs="Arial" w:eastAsia="Arial" w:hAnsi="Arial"/>
+          <w:color w:val="26343B"/>
+          <w:sz w:val="17"/>
+          <w:szCs w:val="17"/>
+        </w:rPr>
         <w:t xml:space="preserve">10  Limitaciones conocidas</w:t>
       </w:r>
     </w:p>
     <w:p>
+      <w:r>
+        <w:br w:type="page"/>
+      </w:r>
+    </w:p>
+    <w:p>
       <w:pPr>
-        <w:spacing w:after="70" w:before="240"/>
+        <w:pStyle w:val="Heading1"/>
+        <w:keepNext/>
+        <w:spacing w:after="70" w:before="210"/>
+      </w:pPr>
+      <w:r>
+        <w:rPr>
+          <w:rFonts w:ascii="Cambria" w:cs="Cambria" w:eastAsia="Cambria" w:hAnsi="Cambria"/>
+          <w:b/>
+          <w:bCs/>
+          <w:color w:val="368991"/>
+          <w:sz w:val="28"/>
+          <w:szCs w:val="28"/>
+        </w:rPr>
+        <w:t xml:space="preserve">0. Control documental</w:t>
+      </w:r>
+    </w:p>
+    <w:tbl>
+      <w:tblPr>
+        <w:tblW w:type="dxa" w:w="9500"/>
+        <w:tblBorders>
+          <w:top w:val="single" w:color="auto" w:sz="4"/>
+          <w:left w:val="single" w:color="auto" w:sz="4"/>
+          <w:bottom w:val="single" w:color="auto" w:sz="4"/>
+          <w:right w:val="single" w:color="auto" w:sz="4"/>
+          <w:insideH w:val="single" w:color="auto" w:sz="4"/>
+          <w:insideV w:val="single" w:color="auto" w:sz="4"/>
+        </w:tblBorders>
+      </w:tblPr>
+      <w:tblGrid>
+        <w:gridCol w:w="3000"/>
+        <w:gridCol w:w="6500"/>
+      </w:tblGrid>
+      <w:tr>
+        <w:trPr>
+          <w:cantSplit/>
+          <w:tblHeader/>
+        </w:trPr>
+        <w:tc>
+          <w:tcPr>
+            <w:tcW w:type="dxa" w:w="3000"/>
+            <w:tcBorders>
+              <w:top w:val="single" w:color="C9D5DB" w:sz="4"/>
+              <w:left w:val="single" w:color="C9D5DB" w:sz="4"/>
+              <w:bottom w:val="single" w:color="C9D5DB" w:sz="4"/>
+              <w:right w:val="single" w:color="C9D5DB" w:sz="4"/>
+            </w:tcBorders>
+            <w:shd w:fill="DCE8EE" w:val="clear"/>
+            <w:tcMar>
+              <w:top w:type="dxa" w:w="70"/>
+              <w:left w:type="dxa" w:w="90"/>
+              <w:bottom w:type="dxa" w:w="70"/>
+              <w:right w:type="dxa" w:w="90"/>
+            </w:tcMar>
+            <w:vAlign w:val="center"/>
+          </w:tcPr>
+          <w:p>
+            <w:pPr>
+              <w:spacing w:after="0"/>
+            </w:pPr>
+            <w:r>
+              <w:rPr>
+                <w:rFonts w:ascii="Arial" w:cs="Arial" w:eastAsia="Arial" w:hAnsi="Arial"/>
+                <w:b/>
+                <w:bCs/>
+                <w:color w:val="334955"/>
+                <w:sz w:val="15"/>
+                <w:szCs w:val="15"/>
+              </w:rPr>
+              <w:t xml:space="preserve">Campo</w:t>
+            </w:r>
+          </w:p>
+        </w:tc>
+        <w:tc>
+          <w:tcPr>
+            <w:tcW w:type="dxa" w:w="6500"/>
+            <w:tcBorders>
+              <w:top w:val="single" w:color="C9D5DB" w:sz="4"/>
+              <w:left w:val="single" w:color="C9D5DB" w:sz="4"/>
+              <w:bottom w:val="single" w:color="C9D5DB" w:sz="4"/>
+              <w:right w:val="single" w:color="C9D5DB" w:sz="4"/>
+            </w:tcBorders>
+            <w:shd w:fill="DCE8EE" w:val="clear"/>
+            <w:tcMar>
+              <w:top w:type="dxa" w:w="70"/>
+              <w:left w:type="dxa" w:w="90"/>
+              <w:bottom w:type="dxa" w:w="70"/>
+              <w:right w:type="dxa" w:w="90"/>
+            </w:tcMar>
+            <w:vAlign w:val="center"/>
+          </w:tcPr>
+          <w:p>
+            <w:pPr>
+              <w:spacing w:after="0"/>
+            </w:pPr>
+            <w:r>
+              <w:rPr>
+                <w:rFonts w:ascii="Arial" w:cs="Arial" w:eastAsia="Arial" w:hAnsi="Arial"/>
+                <w:b/>
+                <w:bCs/>
+                <w:color w:val="334955"/>
+                <w:sz w:val="15"/>
+                <w:szCs w:val="15"/>
+              </w:rPr>
+              <w:t xml:space="preserve">Valor</w:t>
+            </w:r>
+          </w:p>
+        </w:tc>
+      </w:tr>
+      <w:tr>
+        <w:trPr>
+          <w:cantSplit/>
+        </w:trPr>
+        <w:tc>
+          <w:tcPr>
+            <w:tcW w:type="dxa" w:w="3000"/>
+            <w:tcBorders>
+              <w:top w:val="single" w:color="C9D5DB" w:sz="4"/>
+              <w:left w:val="single" w:color="C9D5DB" w:sz="4"/>
+              <w:bottom w:val="single" w:color="C9D5DB" w:sz="4"/>
+              <w:right w:val="single" w:color="C9D5DB" w:sz="4"/>
+            </w:tcBorders>
+            <w:shd w:fill="FFFFFF" w:val="clear"/>
+            <w:tcMar>
+              <w:top w:type="dxa" w:w="70"/>
+              <w:left w:type="dxa" w:w="90"/>
+              <w:bottom w:type="dxa" w:w="70"/>
+              <w:right w:type="dxa" w:w="90"/>
+            </w:tcMar>
+            <w:vAlign w:val="center"/>
+          </w:tcPr>
+          <w:p>
+            <w:pPr>
+              <w:spacing w:after="0"/>
+            </w:pPr>
+            <w:r>
+              <w:rPr>
+                <w:rFonts w:ascii="Arial" w:cs="Arial" w:eastAsia="Arial" w:hAnsi="Arial"/>
+                <w:color w:val="26343B"/>
+                <w:sz w:val="15"/>
+                <w:szCs w:val="15"/>
+              </w:rPr>
+              <w:t xml:space="preserve">Tipo de documento</w:t>
+            </w:r>
+          </w:p>
+        </w:tc>
+        <w:tc>
+          <w:tcPr>
+            <w:tcW w:type="dxa" w:w="6500"/>
+            <w:tcBorders>
+              <w:top w:val="single" w:color="C9D5DB" w:sz="4"/>
+              <w:left w:val="single" w:color="C9D5DB" w:sz="4"/>
+              <w:bottom w:val="single" w:color="C9D5DB" w:sz="4"/>
+              <w:right w:val="single" w:color="C9D5DB" w:sz="4"/>
+            </w:tcBorders>
+            <w:shd w:fill="FFFFFF" w:val="clear"/>
+            <w:tcMar>
+              <w:top w:type="dxa" w:w="70"/>
+              <w:left w:type="dxa" w:w="90"/>
+              <w:bottom w:type="dxa" w:w="70"/>
+              <w:right w:type="dxa" w:w="90"/>
+            </w:tcMar>
+            <w:vAlign w:val="center"/>
+          </w:tcPr>
+          <w:p>
+            <w:pPr>
+              <w:spacing w:after="0"/>
+            </w:pPr>
+            <w:r>
+              <w:rPr>
+                <w:rFonts w:ascii="Arial" w:cs="Arial" w:eastAsia="Arial" w:hAnsi="Arial"/>
+                <w:color w:val="26343B"/>
+                <w:sz w:val="15"/>
+                <w:szCs w:val="15"/>
+              </w:rPr>
+              <w:t xml:space="preserve">Documentación técnica</w:t>
+            </w:r>
+          </w:p>
+        </w:tc>
+      </w:tr>
+      <w:tr>
+        <w:trPr>
+          <w:cantSplit/>
+        </w:trPr>
+        <w:tc>
+          <w:tcPr>
+            <w:tcW w:type="dxa" w:w="3000"/>
+            <w:tcBorders>
+              <w:top w:val="single" w:color="C9D5DB" w:sz="4"/>
+              <w:left w:val="single" w:color="C9D5DB" w:sz="4"/>
+              <w:bottom w:val="single" w:color="C9D5DB" w:sz="4"/>
+              <w:right w:val="single" w:color="C9D5DB" w:sz="4"/>
+            </w:tcBorders>
+            <w:shd w:fill="F7F9FA" w:val="clear"/>
+            <w:tcMar>
+              <w:top w:type="dxa" w:w="70"/>
+              <w:left w:type="dxa" w:w="90"/>
+              <w:bottom w:type="dxa" w:w="70"/>
+              <w:right w:type="dxa" w:w="90"/>
+            </w:tcMar>
+            <w:vAlign w:val="center"/>
+          </w:tcPr>
+          <w:p>
+            <w:pPr>
+              <w:spacing w:after="0"/>
+            </w:pPr>
+            <w:r>
+              <w:rPr>
+                <w:rFonts w:ascii="Arial" w:cs="Arial" w:eastAsia="Arial" w:hAnsi="Arial"/>
+                <w:color w:val="26343B"/>
+                <w:sz w:val="15"/>
+                <w:szCs w:val="15"/>
+              </w:rPr>
+              <w:t xml:space="preserve">Título de portada</w:t>
+            </w:r>
+          </w:p>
+        </w:tc>
+        <w:tc>
+          <w:tcPr>
+            <w:tcW w:type="dxa" w:w="6500"/>
+            <w:tcBorders>
+              <w:top w:val="single" w:color="C9D5DB" w:sz="4"/>
+              <w:left w:val="single" w:color="C9D5DB" w:sz="4"/>
+              <w:bottom w:val="single" w:color="C9D5DB" w:sz="4"/>
+              <w:right w:val="single" w:color="C9D5DB" w:sz="4"/>
+            </w:tcBorders>
+            <w:shd w:fill="F7F9FA" w:val="clear"/>
+            <w:tcMar>
+              <w:top w:type="dxa" w:w="70"/>
+              <w:left w:type="dxa" w:w="90"/>
+              <w:bottom w:type="dxa" w:w="70"/>
+              <w:right w:type="dxa" w:w="90"/>
+            </w:tcMar>
+            <w:vAlign w:val="center"/>
+          </w:tcPr>
+          <w:p>
+            <w:pPr>
+              <w:spacing w:after="0"/>
+            </w:pPr>
+            <w:r>
+              <w:rPr>
+                <w:rFonts w:ascii="Arial" w:cs="Arial" w:eastAsia="Arial" w:hAnsi="Arial"/>
+                <w:color w:val="26343B"/>
+                <w:sz w:val="15"/>
+                <w:szCs w:val="15"/>
+              </w:rPr>
+              <w:t xml:space="preserve">Base de datos de eventos culturales</w:t>
+            </w:r>
+          </w:p>
+        </w:tc>
+      </w:tr>
+      <w:tr>
+        <w:trPr>
+          <w:cantSplit/>
+        </w:trPr>
+        <w:tc>
+          <w:tcPr>
+            <w:tcW w:type="dxa" w:w="3000"/>
+            <w:tcBorders>
+              <w:top w:val="single" w:color="C9D5DB" w:sz="4"/>
+              <w:left w:val="single" w:color="C9D5DB" w:sz="4"/>
+              <w:bottom w:val="single" w:color="C9D5DB" w:sz="4"/>
+              <w:right w:val="single" w:color="C9D5DB" w:sz="4"/>
+            </w:tcBorders>
+            <w:shd w:fill="FFFFFF" w:val="clear"/>
+            <w:tcMar>
+              <w:top w:type="dxa" w:w="70"/>
+              <w:left w:type="dxa" w:w="90"/>
+              <w:bottom w:type="dxa" w:w="70"/>
+              <w:right w:type="dxa" w:w="90"/>
+            </w:tcMar>
+            <w:vAlign w:val="center"/>
+          </w:tcPr>
+          <w:p>
+            <w:pPr>
+              <w:spacing w:after="0"/>
+            </w:pPr>
+            <w:r>
+              <w:rPr>
+                <w:rFonts w:ascii="Arial" w:cs="Arial" w:eastAsia="Arial" w:hAnsi="Arial"/>
+                <w:color w:val="26343B"/>
+                <w:sz w:val="15"/>
+                <w:szCs w:val="15"/>
+              </w:rPr>
+              <w:t xml:space="preserve">Proyecto</w:t>
+            </w:r>
+          </w:p>
+        </w:tc>
+        <w:tc>
+          <w:tcPr>
+            <w:tcW w:type="dxa" w:w="6500"/>
+            <w:tcBorders>
+              <w:top w:val="single" w:color="C9D5DB" w:sz="4"/>
+              <w:left w:val="single" w:color="C9D5DB" w:sz="4"/>
+              <w:bottom w:val="single" w:color="C9D5DB" w:sz="4"/>
+              <w:right w:val="single" w:color="C9D5DB" w:sz="4"/>
+            </w:tcBorders>
+            <w:shd w:fill="FFFFFF" w:val="clear"/>
+            <w:tcMar>
+              <w:top w:type="dxa" w:w="70"/>
+              <w:left w:type="dxa" w:w="90"/>
+              <w:bottom w:type="dxa" w:w="70"/>
+              <w:right w:type="dxa" w:w="90"/>
+            </w:tcMar>
+            <w:vAlign w:val="center"/>
+          </w:tcPr>
+          <w:p>
+            <w:pPr>
+              <w:spacing w:after="0"/>
+            </w:pPr>
+            <w:r>
+              <w:rPr>
+                <w:rFonts w:ascii="Arial" w:cs="Arial" w:eastAsia="Arial" w:hAnsi="Arial"/>
+                <w:color w:val="26343B"/>
+                <w:sz w:val="15"/>
+                <w:szCs w:val="15"/>
+              </w:rPr>
+              <w:t xml:space="preserve">MVP · Agregador de eventos culturales de Chile</w:t>
+            </w:r>
+          </w:p>
+        </w:tc>
+      </w:tr>
+      <w:tr>
+        <w:trPr>
+          <w:cantSplit/>
+        </w:trPr>
+        <w:tc>
+          <w:tcPr>
+            <w:tcW w:type="dxa" w:w="3000"/>
+            <w:tcBorders>
+              <w:top w:val="single" w:color="C9D5DB" w:sz="4"/>
+              <w:left w:val="single" w:color="C9D5DB" w:sz="4"/>
+              <w:bottom w:val="single" w:color="C9D5DB" w:sz="4"/>
+              <w:right w:val="single" w:color="C9D5DB" w:sz="4"/>
+            </w:tcBorders>
+            <w:shd w:fill="F7F9FA" w:val="clear"/>
+            <w:tcMar>
+              <w:top w:type="dxa" w:w="70"/>
+              <w:left w:type="dxa" w:w="90"/>
+              <w:bottom w:type="dxa" w:w="70"/>
+              <w:right w:type="dxa" w:w="90"/>
+            </w:tcMar>
+            <w:vAlign w:val="center"/>
+          </w:tcPr>
+          <w:p>
+            <w:pPr>
+              <w:spacing w:after="0"/>
+            </w:pPr>
+            <w:r>
+              <w:rPr>
+                <w:rFonts w:ascii="Arial" w:cs="Arial" w:eastAsia="Arial" w:hAnsi="Arial"/>
+                <w:color w:val="26343B"/>
+                <w:sz w:val="15"/>
+                <w:szCs w:val="15"/>
+              </w:rPr>
+              <w:t xml:space="preserve">Subtítulo</w:t>
+            </w:r>
+          </w:p>
+        </w:tc>
+        <w:tc>
+          <w:tcPr>
+            <w:tcW w:type="dxa" w:w="6500"/>
+            <w:tcBorders>
+              <w:top w:val="single" w:color="C9D5DB" w:sz="4"/>
+              <w:left w:val="single" w:color="C9D5DB" w:sz="4"/>
+              <w:bottom w:val="single" w:color="C9D5DB" w:sz="4"/>
+              <w:right w:val="single" w:color="C9D5DB" w:sz="4"/>
+            </w:tcBorders>
+            <w:shd w:fill="F7F9FA" w:val="clear"/>
+            <w:tcMar>
+              <w:top w:type="dxa" w:w="70"/>
+              <w:left w:type="dxa" w:w="90"/>
+              <w:bottom w:type="dxa" w:w="70"/>
+              <w:right w:type="dxa" w:w="90"/>
+            </w:tcMar>
+            <w:vAlign w:val="center"/>
+          </w:tcPr>
+          <w:p>
+            <w:pPr>
+              <w:spacing w:after="0"/>
+            </w:pPr>
+            <w:r>
+              <w:rPr>
+                <w:rFonts w:ascii="Arial" w:cs="Arial" w:eastAsia="Arial" w:hAnsi="Arial"/>
+                <w:color w:val="26343B"/>
+                <w:sz w:val="15"/>
+                <w:szCs w:val="15"/>
+              </w:rPr>
+              <w:t xml:space="preserve">Diccionario de tablas, columnas, relaciones y categorías</w:t>
+            </w:r>
+          </w:p>
+        </w:tc>
+      </w:tr>
+      <w:tr>
+        <w:trPr>
+          <w:cantSplit/>
+        </w:trPr>
+        <w:tc>
+          <w:tcPr>
+            <w:tcW w:type="dxa" w:w="3000"/>
+            <w:tcBorders>
+              <w:top w:val="single" w:color="C9D5DB" w:sz="4"/>
+              <w:left w:val="single" w:color="C9D5DB" w:sz="4"/>
+              <w:bottom w:val="single" w:color="C9D5DB" w:sz="4"/>
+              <w:right w:val="single" w:color="C9D5DB" w:sz="4"/>
+            </w:tcBorders>
+            <w:shd w:fill="FFFFFF" w:val="clear"/>
+            <w:tcMar>
+              <w:top w:type="dxa" w:w="70"/>
+              <w:left w:type="dxa" w:w="90"/>
+              <w:bottom w:type="dxa" w:w="70"/>
+              <w:right w:type="dxa" w:w="90"/>
+            </w:tcMar>
+            <w:vAlign w:val="center"/>
+          </w:tcPr>
+          <w:p>
+            <w:pPr>
+              <w:spacing w:after="0"/>
+            </w:pPr>
+            <w:r>
+              <w:rPr>
+                <w:rFonts w:ascii="Arial" w:cs="Arial" w:eastAsia="Arial" w:hAnsi="Arial"/>
+                <w:color w:val="26343B"/>
+                <w:sz w:val="15"/>
+                <w:szCs w:val="15"/>
+              </w:rPr>
+              <w:t xml:space="preserve">Versión documentada</w:t>
+            </w:r>
+          </w:p>
+        </w:tc>
+        <w:tc>
+          <w:tcPr>
+            <w:tcW w:type="dxa" w:w="6500"/>
+            <w:tcBorders>
+              <w:top w:val="single" w:color="C9D5DB" w:sz="4"/>
+              <w:left w:val="single" w:color="C9D5DB" w:sz="4"/>
+              <w:bottom w:val="single" w:color="C9D5DB" w:sz="4"/>
+              <w:right w:val="single" w:color="C9D5DB" w:sz="4"/>
+            </w:tcBorders>
+            <w:shd w:fill="FFFFFF" w:val="clear"/>
+            <w:tcMar>
+              <w:top w:type="dxa" w:w="70"/>
+              <w:left w:type="dxa" w:w="90"/>
+              <w:bottom w:type="dxa" w:w="70"/>
+              <w:right w:type="dxa" w:w="90"/>
+            </w:tcMar>
+            <w:vAlign w:val="center"/>
+          </w:tcPr>
+          <w:p>
+            <w:pPr>
+              <w:spacing w:after="0"/>
+            </w:pPr>
+            <w:r>
+              <w:rPr>
+                <w:rFonts w:ascii="Arial" w:cs="Arial" w:eastAsia="Arial" w:hAnsi="Arial"/>
+                <w:color w:val="26343B"/>
+                <w:sz w:val="15"/>
+                <w:szCs w:val="15"/>
+              </w:rPr>
+              <w:t xml:space="preserve">3 de octubre de 2026</w:t>
+            </w:r>
+          </w:p>
+        </w:tc>
+      </w:tr>
+      <w:tr>
+        <w:trPr>
+          <w:cantSplit/>
+        </w:trPr>
+        <w:tc>
+          <w:tcPr>
+            <w:tcW w:type="dxa" w:w="3000"/>
+            <w:tcBorders>
+              <w:top w:val="single" w:color="C9D5DB" w:sz="4"/>
+              <w:left w:val="single" w:color="C9D5DB" w:sz="4"/>
+              <w:bottom w:val="single" w:color="C9D5DB" w:sz="4"/>
+              <w:right w:val="single" w:color="C9D5DB" w:sz="4"/>
+            </w:tcBorders>
+            <w:shd w:fill="F7F9FA" w:val="clear"/>
+            <w:tcMar>
+              <w:top w:type="dxa" w:w="70"/>
+              <w:left w:type="dxa" w:w="90"/>
+              <w:bottom w:type="dxa" w:w="70"/>
+              <w:right w:type="dxa" w:w="90"/>
+            </w:tcMar>
+            <w:vAlign w:val="center"/>
+          </w:tcPr>
+          <w:p>
+            <w:pPr>
+              <w:spacing w:after="0"/>
+            </w:pPr>
+            <w:r>
+              <w:rPr>
+                <w:rFonts w:ascii="Arial" w:cs="Arial" w:eastAsia="Arial" w:hAnsi="Arial"/>
+                <w:color w:val="26343B"/>
+                <w:sz w:val="15"/>
+                <w:szCs w:val="15"/>
+              </w:rPr>
+              <w:t xml:space="preserve">Esquema</w:t>
+            </w:r>
+          </w:p>
+        </w:tc>
+        <w:tc>
+          <w:tcPr>
+            <w:tcW w:type="dxa" w:w="6500"/>
+            <w:tcBorders>
+              <w:top w:val="single" w:color="C9D5DB" w:sz="4"/>
+              <w:left w:val="single" w:color="C9D5DB" w:sz="4"/>
+              <w:bottom w:val="single" w:color="C9D5DB" w:sz="4"/>
+              <w:right w:val="single" w:color="C9D5DB" w:sz="4"/>
+            </w:tcBorders>
+            <w:shd w:fill="F7F9FA" w:val="clear"/>
+            <w:tcMar>
+              <w:top w:type="dxa" w:w="70"/>
+              <w:left w:type="dxa" w:w="90"/>
+              <w:bottom w:type="dxa" w:w="70"/>
+              <w:right w:type="dxa" w:w="90"/>
+            </w:tcMar>
+            <w:vAlign w:val="center"/>
+          </w:tcPr>
+          <w:p>
+            <w:pPr>
+              <w:spacing w:after="0"/>
+            </w:pPr>
+            <w:r>
+              <w:rPr>
+                <w:rFonts w:ascii="Consolas" w:cs="Consolas" w:eastAsia="Consolas" w:hAnsi="Consolas"/>
+                <w:color w:val="368991"/>
+                <w:sz w:val="14"/>
+                <w:szCs w:val="14"/>
+                <w:shd w:fill="EAF2F3" w:val="clear"/>
+              </w:rPr>
+              <w:t xml:space="preserve">public</w:t>
+            </w:r>
+            <w:r>
+              <w:rPr>
+                <w:rFonts w:ascii="Arial" w:cs="Arial" w:eastAsia="Arial" w:hAnsi="Arial"/>
+                <w:color w:val="26343B"/>
+                <w:sz w:val="15"/>
+                <w:szCs w:val="15"/>
+              </w:rPr>
+              <w:t xml:space="preserve"> de Supabase/PostgreSQL</w:t>
+            </w:r>
+          </w:p>
+        </w:tc>
+      </w:tr>
+      <w:tr>
+        <w:trPr>
+          <w:cantSplit/>
+        </w:trPr>
+        <w:tc>
+          <w:tcPr>
+            <w:tcW w:type="dxa" w:w="3000"/>
+            <w:tcBorders>
+              <w:top w:val="single" w:color="C9D5DB" w:sz="4"/>
+              <w:left w:val="single" w:color="C9D5DB" w:sz="4"/>
+              <w:bottom w:val="single" w:color="C9D5DB" w:sz="4"/>
+              <w:right w:val="single" w:color="C9D5DB" w:sz="4"/>
+            </w:tcBorders>
+            <w:shd w:fill="FFFFFF" w:val="clear"/>
+            <w:tcMar>
+              <w:top w:type="dxa" w:w="70"/>
+              <w:left w:type="dxa" w:w="90"/>
+              <w:bottom w:type="dxa" w:w="70"/>
+              <w:right w:type="dxa" w:w="90"/>
+            </w:tcMar>
+            <w:vAlign w:val="center"/>
+          </w:tcPr>
+          <w:p>
+            <w:pPr>
+              <w:spacing w:after="0"/>
+            </w:pPr>
+            <w:r>
+              <w:rPr>
+                <w:rFonts w:ascii="Arial" w:cs="Arial" w:eastAsia="Arial" w:hAnsi="Arial"/>
+                <w:color w:val="26343B"/>
+                <w:sz w:val="15"/>
+                <w:szCs w:val="15"/>
+              </w:rPr>
+              <w:t xml:space="preserve">Uso</w:t>
+            </w:r>
+          </w:p>
+        </w:tc>
+        <w:tc>
+          <w:tcPr>
+            <w:tcW w:type="dxa" w:w="6500"/>
+            <w:tcBorders>
+              <w:top w:val="single" w:color="C9D5DB" w:sz="4"/>
+              <w:left w:val="single" w:color="C9D5DB" w:sz="4"/>
+              <w:bottom w:val="single" w:color="C9D5DB" w:sz="4"/>
+              <w:right w:val="single" w:color="C9D5DB" w:sz="4"/>
+            </w:tcBorders>
+            <w:shd w:fill="FFFFFF" w:val="clear"/>
+            <w:tcMar>
+              <w:top w:type="dxa" w:w="70"/>
+              <w:left w:type="dxa" w:w="90"/>
+              <w:bottom w:type="dxa" w:w="70"/>
+              <w:right w:type="dxa" w:w="90"/>
+            </w:tcMar>
+            <w:vAlign w:val="center"/>
+          </w:tcPr>
+          <w:p>
+            <w:pPr>
+              <w:spacing w:after="0"/>
+            </w:pPr>
+            <w:r>
+              <w:rPr>
+                <w:rFonts w:ascii="Arial" w:cs="Arial" w:eastAsia="Arial" w:hAnsi="Arial"/>
+                <w:color w:val="26343B"/>
+                <w:sz w:val="15"/>
+                <w:szCs w:val="15"/>
+              </w:rPr>
+              <w:t xml:space="preserve">Documento de uso personal</w:t>
+            </w:r>
+          </w:p>
+        </w:tc>
+      </w:tr>
+      <w:tr>
+        <w:trPr>
+          <w:cantSplit/>
+        </w:trPr>
+        <w:tc>
+          <w:tcPr>
+            <w:tcW w:type="dxa" w:w="3000"/>
+            <w:tcBorders>
+              <w:top w:val="single" w:color="C9D5DB" w:sz="4"/>
+              <w:left w:val="single" w:color="C9D5DB" w:sz="4"/>
+              <w:bottom w:val="single" w:color="C9D5DB" w:sz="4"/>
+              <w:right w:val="single" w:color="C9D5DB" w:sz="4"/>
+            </w:tcBorders>
+            <w:shd w:fill="F7F9FA" w:val="clear"/>
+            <w:tcMar>
+              <w:top w:type="dxa" w:w="70"/>
+              <w:left w:type="dxa" w:w="90"/>
+              <w:bottom w:type="dxa" w:w="70"/>
+              <w:right w:type="dxa" w:w="90"/>
+            </w:tcMar>
+            <w:vAlign w:val="center"/>
+          </w:tcPr>
+          <w:p>
+            <w:pPr>
+              <w:spacing w:after="0"/>
+            </w:pPr>
+            <w:r>
+              <w:rPr>
+                <w:rFonts w:ascii="Arial" w:cs="Arial" w:eastAsia="Arial" w:hAnsi="Arial"/>
+                <w:color w:val="26343B"/>
+                <w:sz w:val="15"/>
+                <w:szCs w:val="15"/>
+              </w:rPr>
+              <w:t xml:space="preserve">Encabezado</w:t>
+            </w:r>
+          </w:p>
+        </w:tc>
+        <w:tc>
+          <w:tcPr>
+            <w:tcW w:type="dxa" w:w="6500"/>
+            <w:tcBorders>
+              <w:top w:val="single" w:color="C9D5DB" w:sz="4"/>
+              <w:left w:val="single" w:color="C9D5DB" w:sz="4"/>
+              <w:bottom w:val="single" w:color="C9D5DB" w:sz="4"/>
+              <w:right w:val="single" w:color="C9D5DB" w:sz="4"/>
+            </w:tcBorders>
+            <w:shd w:fill="F7F9FA" w:val="clear"/>
+            <w:tcMar>
+              <w:top w:type="dxa" w:w="70"/>
+              <w:left w:type="dxa" w:w="90"/>
+              <w:bottom w:type="dxa" w:w="70"/>
+              <w:right w:type="dxa" w:w="90"/>
+            </w:tcMar>
+            <w:vAlign w:val="center"/>
+          </w:tcPr>
+          <w:p>
+            <w:pPr>
+              <w:spacing w:after="0"/>
+            </w:pPr>
+            <w:r>
+              <w:rPr>
+                <w:rFonts w:ascii="Arial" w:cs="Arial" w:eastAsia="Arial" w:hAnsi="Arial"/>
+                <w:color w:val="26343B"/>
+                <w:sz w:val="15"/>
+                <w:szCs w:val="15"/>
+              </w:rPr>
+              <w:t xml:space="preserve">EVENTO CULTURAL · DOCUMENTACIÓN 2026</w:t>
+            </w:r>
+          </w:p>
+        </w:tc>
+      </w:tr>
+      <w:tr>
+        <w:trPr>
+          <w:cantSplit/>
+        </w:trPr>
+        <w:tc>
+          <w:tcPr>
+            <w:tcW w:type="dxa" w:w="3000"/>
+            <w:tcBorders>
+              <w:top w:val="single" w:color="C9D5DB" w:sz="4"/>
+              <w:left w:val="single" w:color="C9D5DB" w:sz="4"/>
+              <w:bottom w:val="single" w:color="C9D5DB" w:sz="4"/>
+              <w:right w:val="single" w:color="C9D5DB" w:sz="4"/>
+            </w:tcBorders>
+            <w:shd w:fill="FFFFFF" w:val="clear"/>
+            <w:tcMar>
+              <w:top w:type="dxa" w:w="70"/>
+              <w:left w:type="dxa" w:w="90"/>
+              <w:bottom w:type="dxa" w:w="70"/>
+              <w:right w:type="dxa" w:w="90"/>
+            </w:tcMar>
+            <w:vAlign w:val="center"/>
+          </w:tcPr>
+          <w:p>
+            <w:pPr>
+              <w:spacing w:after="0"/>
+            </w:pPr>
+            <w:r>
+              <w:rPr>
+                <w:rFonts w:ascii="Arial" w:cs="Arial" w:eastAsia="Arial" w:hAnsi="Arial"/>
+                <w:color w:val="26343B"/>
+                <w:sz w:val="15"/>
+                <w:szCs w:val="15"/>
+              </w:rPr>
+              <w:t xml:space="preserve">Pie de página</w:t>
+            </w:r>
+          </w:p>
+        </w:tc>
+        <w:tc>
+          <w:tcPr>
+            <w:tcW w:type="dxa" w:w="6500"/>
+            <w:tcBorders>
+              <w:top w:val="single" w:color="C9D5DB" w:sz="4"/>
+              <w:left w:val="single" w:color="C9D5DB" w:sz="4"/>
+              <w:bottom w:val="single" w:color="C9D5DB" w:sz="4"/>
+              <w:right w:val="single" w:color="C9D5DB" w:sz="4"/>
+            </w:tcBorders>
+            <w:shd w:fill="FFFFFF" w:val="clear"/>
+            <w:tcMar>
+              <w:top w:type="dxa" w:w="70"/>
+              <w:left w:type="dxa" w:w="90"/>
+              <w:bottom w:type="dxa" w:w="70"/>
+              <w:right w:type="dxa" w:w="90"/>
+            </w:tcMar>
+            <w:vAlign w:val="center"/>
+          </w:tcPr>
+          <w:p>
+            <w:pPr>
+              <w:spacing w:after="0"/>
+            </w:pPr>
+            <w:r>
+              <w:rPr>
+                <w:rFonts w:ascii="Arial" w:cs="Arial" w:eastAsia="Arial" w:hAnsi="Arial"/>
+                <w:color w:val="26343B"/>
+                <w:sz w:val="15"/>
+                <w:szCs w:val="15"/>
+              </w:rPr>
+              <w:t xml:space="preserve">Uso personal · Página</w:t>
+            </w:r>
+          </w:p>
+        </w:tc>
+      </w:tr>
+      <w:tr>
+        <w:trPr>
+          <w:cantSplit/>
+        </w:trPr>
+        <w:tc>
+          <w:tcPr>
+            <w:tcW w:type="dxa" w:w="3000"/>
+            <w:tcBorders>
+              <w:top w:val="single" w:color="C9D5DB" w:sz="4"/>
+              <w:left w:val="single" w:color="C9D5DB" w:sz="4"/>
+              <w:bottom w:val="single" w:color="C9D5DB" w:sz="4"/>
+              <w:right w:val="single" w:color="C9D5DB" w:sz="4"/>
+            </w:tcBorders>
+            <w:shd w:fill="F7F9FA" w:val="clear"/>
+            <w:tcMar>
+              <w:top w:type="dxa" w:w="70"/>
+              <w:left w:type="dxa" w:w="90"/>
+              <w:bottom w:type="dxa" w:w="70"/>
+              <w:right w:type="dxa" w:w="90"/>
+            </w:tcMar>
+            <w:vAlign w:val="center"/>
+          </w:tcPr>
+          <w:p>
+            <w:pPr>
+              <w:spacing w:after="0"/>
+            </w:pPr>
+            <w:r>
+              <w:rPr>
+                <w:rFonts w:ascii="Arial" w:cs="Arial" w:eastAsia="Arial" w:hAnsi="Arial"/>
+                <w:color w:val="26343B"/>
+                <w:sz w:val="15"/>
+                <w:szCs w:val="15"/>
+              </w:rPr>
+              <w:t xml:space="preserve">Título del índice</w:t>
+            </w:r>
+          </w:p>
+        </w:tc>
+        <w:tc>
+          <w:tcPr>
+            <w:tcW w:type="dxa" w:w="6500"/>
+            <w:tcBorders>
+              <w:top w:val="single" w:color="C9D5DB" w:sz="4"/>
+              <w:left w:val="single" w:color="C9D5DB" w:sz="4"/>
+              <w:bottom w:val="single" w:color="C9D5DB" w:sz="4"/>
+              <w:right w:val="single" w:color="C9D5DB" w:sz="4"/>
+            </w:tcBorders>
+            <w:shd w:fill="F7F9FA" w:val="clear"/>
+            <w:tcMar>
+              <w:top w:type="dxa" w:w="70"/>
+              <w:left w:type="dxa" w:w="90"/>
+              <w:bottom w:type="dxa" w:w="70"/>
+              <w:right w:type="dxa" w:w="90"/>
+            </w:tcMar>
+            <w:vAlign w:val="center"/>
+          </w:tcPr>
+          <w:p>
+            <w:pPr>
+              <w:spacing w:after="0"/>
+            </w:pPr>
+            <w:r>
+              <w:rPr>
+                <w:rFonts w:ascii="Arial" w:cs="Arial" w:eastAsia="Arial" w:hAnsi="Arial"/>
+                <w:color w:val="26343B"/>
+                <w:sz w:val="15"/>
+                <w:szCs w:val="15"/>
+              </w:rPr>
+              <w:t xml:space="preserve">Contenido</w:t>
+            </w:r>
+          </w:p>
+        </w:tc>
+      </w:tr>
+      <w:tr>
+        <w:trPr>
+          <w:cantSplit/>
+        </w:trPr>
+        <w:tc>
+          <w:tcPr>
+            <w:tcW w:type="dxa" w:w="3000"/>
+            <w:tcBorders>
+              <w:top w:val="single" w:color="C9D5DB" w:sz="4"/>
+              <w:left w:val="single" w:color="C9D5DB" w:sz="4"/>
+              <w:bottom w:val="single" w:color="C9D5DB" w:sz="4"/>
+              <w:right w:val="single" w:color="C9D5DB" w:sz="4"/>
+            </w:tcBorders>
+            <w:shd w:fill="FFFFFF" w:val="clear"/>
+            <w:tcMar>
+              <w:top w:type="dxa" w:w="70"/>
+              <w:left w:type="dxa" w:w="90"/>
+              <w:bottom w:type="dxa" w:w="70"/>
+              <w:right w:type="dxa" w:w="90"/>
+            </w:tcMar>
+            <w:vAlign w:val="center"/>
+          </w:tcPr>
+          <w:p>
+            <w:pPr>
+              <w:spacing w:after="0"/>
+            </w:pPr>
+            <w:r>
+              <w:rPr>
+                <w:rFonts w:ascii="Arial" w:cs="Arial" w:eastAsia="Arial" w:hAnsi="Arial"/>
+                <w:color w:val="26343B"/>
+                <w:sz w:val="15"/>
+                <w:szCs w:val="15"/>
+              </w:rPr>
+              <w:t xml:space="preserve">Leyenda de figura 1</w:t>
+            </w:r>
+          </w:p>
+        </w:tc>
+        <w:tc>
+          <w:tcPr>
+            <w:tcW w:type="dxa" w:w="6500"/>
+            <w:tcBorders>
+              <w:top w:val="single" w:color="C9D5DB" w:sz="4"/>
+              <w:left w:val="single" w:color="C9D5DB" w:sz="4"/>
+              <w:bottom w:val="single" w:color="C9D5DB" w:sz="4"/>
+              <w:right w:val="single" w:color="C9D5DB" w:sz="4"/>
+            </w:tcBorders>
+            <w:shd w:fill="FFFFFF" w:val="clear"/>
+            <w:tcMar>
+              <w:top w:type="dxa" w:w="70"/>
+              <w:left w:type="dxa" w:w="90"/>
+              <w:bottom w:type="dxa" w:w="70"/>
+              <w:right w:type="dxa" w:w="90"/>
+            </w:tcMar>
+            <w:vAlign w:val="center"/>
+          </w:tcPr>
+          <w:p>
+            <w:pPr>
+              <w:spacing w:after="0"/>
+            </w:pPr>
+            <w:r>
+              <w:rPr>
+                <w:rFonts w:ascii="Arial" w:cs="Arial" w:eastAsia="Arial" w:hAnsi="Arial"/>
+                <w:color w:val="26343B"/>
+                <w:sz w:val="15"/>
+                <w:szCs w:val="15"/>
+              </w:rPr>
+              <w:t xml:space="preserve">Figura 1. Vista por capas del modelo de datos vigente.</w:t>
+            </w:r>
+          </w:p>
+        </w:tc>
+      </w:tr>
+    </w:tbl>
+    <w:p>
+      <w:pPr>
+        <w:pStyle w:val="Heading2"/>
+        <w:keepNext/>
+        <w:spacing w:after="70" w:before="130"/>
+      </w:pPr>
+      <w:r>
+        <w:rPr>
+          <w:rFonts w:ascii="Cambria" w:cs="Cambria" w:eastAsia="Cambria" w:hAnsi="Cambria"/>
+          <w:b/>
+          <w:bCs/>
+          <w:color w:val="506874"/>
+          <w:sz w:val="22"/>
+          <w:szCs w:val="22"/>
+        </w:rPr>
+        <w:t xml:space="preserve">Migraciones de referencia</w:t>
+      </w:r>
+    </w:p>
+    <w:p>
+      <w:pPr>
+        <w:pStyle w:val="ListParagraph"/>
+        <w:numPr>
+          <w:ilvl w:val="0"/>
+          <w:numId w:val="2"/>
+        </w:numPr>
+        <w:spacing w:after="70" w:line="280"/>
+      </w:pPr>
+      <w:r>
+        <w:rPr>
+          <w:rFonts w:ascii="Consolas" w:cs="Consolas" w:eastAsia="Consolas" w:hAnsi="Consolas"/>
+          <w:color w:val="368991"/>
+          <w:sz w:val="16"/>
+          <w:szCs w:val="16"/>
+          <w:shd w:fill="EAF2F3" w:val="clear"/>
+        </w:rPr>
+        <w:t xml:space="preserve">supabase/migrations/20260831000100_initial_event_catalog.sql</w:t>
+      </w:r>
+    </w:p>
+    <w:p>
+      <w:pPr>
+        <w:pStyle w:val="ListParagraph"/>
+        <w:numPr>
+          <w:ilvl w:val="0"/>
+          <w:numId w:val="2"/>
+        </w:numPr>
+        <w:spacing w:after="70" w:line="280"/>
+      </w:pPr>
+      <w:r>
+        <w:rPr>
+          <w:rFonts w:ascii="Consolas" w:cs="Consolas" w:eastAsia="Consolas" w:hAnsi="Consolas"/>
+          <w:color w:val="368991"/>
+          <w:sz w:val="16"/>
+          <w:szCs w:val="16"/>
+          <w:shd w:fill="EAF2F3" w:val="clear"/>
+        </w:rPr>
+        <w:t xml:space="preserve">supabase/migrations/20260902000100_event_location_metadata.sql</w:t>
+      </w:r>
+    </w:p>
+    <w:p>
+      <w:pPr>
+        <w:pStyle w:val="ListParagraph"/>
+        <w:numPr>
+          <w:ilvl w:val="0"/>
+          <w:numId w:val="2"/>
+        </w:numPr>
+        <w:spacing w:after="70" w:line="280"/>
+      </w:pPr>
+      <w:r>
+        <w:rPr>
+          <w:rFonts w:ascii="Consolas" w:cs="Consolas" w:eastAsia="Consolas" w:hAnsi="Consolas"/>
+          <w:color w:val="368991"/>
+          <w:sz w:val="16"/>
+          <w:szCs w:val="16"/>
+          <w:shd w:fill="EAF2F3" w:val="clear"/>
+        </w:rPr>
+        <w:t xml:space="preserve">supabase/migrations/20260911000100_content_enrichment_and_organizer_controls.sql</w:t>
+      </w:r>
+    </w:p>
+    <w:p>
+      <w:pPr>
+        <w:pStyle w:val="ListParagraph"/>
+        <w:numPr>
+          <w:ilvl w:val="0"/>
+          <w:numId w:val="2"/>
+        </w:numPr>
+        <w:spacing w:after="70" w:line="280"/>
+      </w:pPr>
+      <w:r>
+        <w:rPr>
+          <w:rFonts w:ascii="Consolas" w:cs="Consolas" w:eastAsia="Consolas" w:hAnsi="Consolas"/>
+          <w:color w:val="368991"/>
+          <w:sz w:val="16"/>
+          <w:szCs w:val="16"/>
+          <w:shd w:fill="EAF2F3" w:val="clear"/>
+        </w:rPr>
+        <w:t xml:space="preserve">supabase/migrations/20260912000100_rewrite_state_and_reconciliation.sql</w:t>
+      </w:r>
+    </w:p>
+    <w:p>
+      <w:pPr>
+        <w:pStyle w:val="ListParagraph"/>
+        <w:numPr>
+          <w:ilvl w:val="0"/>
+          <w:numId w:val="2"/>
+        </w:numPr>
+        <w:spacing w:after="70" w:line="280"/>
+      </w:pPr>
+      <w:r>
+        <w:rPr>
+          <w:rFonts w:ascii="Consolas" w:cs="Consolas" w:eastAsia="Consolas" w:hAnsi="Consolas"/>
+          <w:color w:val="368991"/>
+          <w:sz w:val="16"/>
+          <w:szCs w:val="16"/>
+          <w:shd w:fill="EAF2F3" w:val="clear"/>
+        </w:rPr>
+        <w:t xml:space="preserve">supabase/migrations/20260921000100_atomic_catalog_publication.sql</w:t>
+      </w:r>
+    </w:p>
+    <w:p>
+      <w:pPr>
+        <w:pStyle w:val="ListParagraph"/>
+        <w:numPr>
+          <w:ilvl w:val="0"/>
+          <w:numId w:val="2"/>
+        </w:numPr>
+        <w:spacing w:after="70" w:line="280"/>
+      </w:pPr>
+      <w:r>
+        <w:rPr>
+          <w:rFonts w:ascii="Consolas" w:cs="Consolas" w:eastAsia="Consolas" w:hAnsi="Consolas"/>
+          <w:color w:val="368991"/>
+          <w:sz w:val="16"/>
+          <w:szCs w:val="16"/>
+          <w:shd w:fill="EAF2F3" w:val="clear"/>
+        </w:rPr>
+        <w:t xml:space="preserve">supabase/migrations/20260924000100_user_recommendation_interactions.sql</w:t>
+      </w:r>
+    </w:p>
+    <w:p>
+      <w:pPr>
+        <w:pStyle w:val="Heading2"/>
+        <w:keepNext/>
+        <w:spacing w:after="70" w:before="130"/>
+      </w:pPr>
+      <w:r>
+        <w:rPr>
+          <w:rFonts w:ascii="Cambria" w:cs="Cambria" w:eastAsia="Cambria" w:hAnsi="Cambria"/>
+          <w:b/>
+          <w:bCs/>
+          <w:color w:val="506874"/>
+          <w:sz w:val="22"/>
+          <w:szCs w:val="22"/>
+        </w:rPr>
+        <w:t xml:space="preserve">Alcance y fuente de verdad</w:t>
+      </w:r>
+    </w:p>
+    <w:p>
+      <w:pPr>
+        <w:spacing w:after="90" w:line="270"/>
+        <w:jc w:val="both"/>
       </w:pPr>
       <w:r>
         <w:rPr>
           <w:rFonts w:ascii="Arial" w:cs="Arial" w:eastAsia="Arial" w:hAnsi="Arial"/>
+          <w:color w:val="26343B"/>
+          <w:sz w:val="18"/>
+          <w:szCs w:val="18"/>
+        </w:rPr>
+        <w:t xml:space="preserve">Este documento describe la base de datos del MVP, el significado de sus tablas y columnas, las relaciones, las políticas de acceso y la taxonomía observada. El boceto visual original se utilizó solamente como referencia relacional; los campos de esta base provienen del modelo real </w:t>
+      </w:r>
+      <w:r>
+        <w:rPr>
+          <w:rFonts w:ascii="Consolas" w:cs="Consolas" w:eastAsia="Consolas" w:hAnsi="Consolas"/>
+          <w:color w:val="368991"/>
+          <w:sz w:val="17"/>
+          <w:szCs w:val="17"/>
+          <w:shd w:fill="EAF2F3" w:val="clear"/>
+        </w:rPr>
+        <w:t xml:space="preserve">Event</w:t>
+      </w:r>
+      <w:r>
+        <w:rPr>
+          <w:rFonts w:ascii="Arial" w:cs="Arial" w:eastAsia="Arial" w:hAnsi="Arial"/>
+          <w:color w:val="26343B"/>
+          <w:sz w:val="18"/>
+          <w:szCs w:val="18"/>
+        </w:rPr>
+        <w:t xml:space="preserve"> y de las necesidades operativas del recolector.</w:t>
+      </w:r>
+    </w:p>
+    <w:tbl>
+      <w:tblPr>
+        <w:tblW w:type="dxa" w:w="9500"/>
+        <w:tblBorders>
+          <w:top w:val="single" w:color="auto" w:sz="4"/>
+          <w:left w:val="single" w:color="auto" w:sz="4"/>
+          <w:bottom w:val="single" w:color="auto" w:sz="4"/>
+          <w:right w:val="single" w:color="auto" w:sz="4"/>
+          <w:insideH w:val="single" w:color="auto" w:sz="4"/>
+          <w:insideV w:val="single" w:color="auto" w:sz="4"/>
+        </w:tblBorders>
+      </w:tblPr>
+      <w:tblGrid>
+        <w:gridCol w:w="9500"/>
+      </w:tblGrid>
+      <w:tr>
+        <w:tc>
+          <w:tcPr>
+            <w:tcW w:type="dxa" w:w="9500"/>
+            <w:tcBorders>
+              <w:top w:val="none"/>
+              <w:left w:val="single" w:color="B6975A" w:sz="10"/>
+              <w:bottom w:val="none"/>
+              <w:right w:val="none"/>
+            </w:tcBorders>
+            <w:shd w:fill="F7F9FA" w:val="clear"/>
+            <w:tcMar>
+              <w:top w:type="dxa" w:w="120"/>
+              <w:left w:type="dxa" w:w="160"/>
+              <w:bottom w:type="dxa" w:w="120"/>
+              <w:right w:type="dxa" w:w="160"/>
+            </w:tcMar>
+          </w:tcPr>
+          <w:p>
+            <w:pPr>
+              <w:spacing w:after="0"/>
+            </w:pPr>
+            <w:r>
+              <w:rPr>
+                <w:rFonts w:ascii="Arial" w:cs="Arial" w:eastAsia="Arial" w:hAnsi="Arial"/>
+                <w:b/>
+                <w:bCs/>
+                <w:color w:val="26343B"/>
+                <w:sz w:val="17"/>
+                <w:szCs w:val="17"/>
+              </w:rPr>
+              <w:t xml:space="preserve">Fuente de verdad:</w:t>
+            </w:r>
+            <w:r>
+              <w:rPr>
+                <w:rFonts w:ascii="Arial" w:cs="Arial" w:eastAsia="Arial" w:hAnsi="Arial"/>
+                <w:color w:val="26343B"/>
+                <w:sz w:val="17"/>
+                <w:szCs w:val="17"/>
+              </w:rPr>
+              <w:t xml:space="preserve"> ante cualquier diferencia entre este documento, el DBML y la instalación</w:t>
+            </w:r>
+          </w:p>
+        </w:tc>
+      </w:tr>
+    </w:tbl>
+    <w:tbl>
+      <w:tblPr>
+        <w:tblW w:type="dxa" w:w="9500"/>
+        <w:tblBorders>
+          <w:top w:val="single" w:color="auto" w:sz="4"/>
+          <w:left w:val="single" w:color="auto" w:sz="4"/>
+          <w:bottom w:val="single" w:color="auto" w:sz="4"/>
+          <w:right w:val="single" w:color="auto" w:sz="4"/>
+          <w:insideH w:val="single" w:color="auto" w:sz="4"/>
+          <w:insideV w:val="single" w:color="auto" w:sz="4"/>
+        </w:tblBorders>
+      </w:tblPr>
+      <w:tblGrid>
+        <w:gridCol w:w="9500"/>
+      </w:tblGrid>
+      <w:tr>
+        <w:tc>
+          <w:tcPr>
+            <w:tcW w:type="dxa" w:w="9500"/>
+            <w:tcBorders>
+              <w:top w:val="none"/>
+              <w:left w:val="single" w:color="B6975A" w:sz="10"/>
+              <w:bottom w:val="none"/>
+              <w:right w:val="none"/>
+            </w:tcBorders>
+            <w:shd w:fill="F7F9FA" w:val="clear"/>
+            <w:tcMar>
+              <w:top w:type="dxa" w:w="120"/>
+              <w:left w:type="dxa" w:w="160"/>
+              <w:bottom w:type="dxa" w:w="120"/>
+              <w:right w:type="dxa" w:w="160"/>
+            </w:tcMar>
+          </w:tcPr>
+          <w:p>
+            <w:pPr>
+              <w:spacing w:after="0"/>
+            </w:pPr>
+            <w:r>
+              <w:rPr>
+                <w:rFonts w:ascii="Arial" w:cs="Arial" w:eastAsia="Arial" w:hAnsi="Arial"/>
+                <w:color w:val="26343B"/>
+                <w:sz w:val="17"/>
+                <w:szCs w:val="17"/>
+              </w:rPr>
+              <w:t xml:space="preserve">remota, prevalece el conjunto ordenado de migraciones SQL versionadas. La migración del 24 de</w:t>
+            </w:r>
+          </w:p>
+        </w:tc>
+      </w:tr>
+    </w:tbl>
+    <w:tbl>
+      <w:tblPr>
+        <w:tblW w:type="dxa" w:w="9500"/>
+        <w:tblBorders>
+          <w:top w:val="single" w:color="auto" w:sz="4"/>
+          <w:left w:val="single" w:color="auto" w:sz="4"/>
+          <w:bottom w:val="single" w:color="auto" w:sz="4"/>
+          <w:right w:val="single" w:color="auto" w:sz="4"/>
+          <w:insideH w:val="single" w:color="auto" w:sz="4"/>
+          <w:insideV w:val="single" w:color="auto" w:sz="4"/>
+        </w:tblBorders>
+      </w:tblPr>
+      <w:tblGrid>
+        <w:gridCol w:w="9500"/>
+      </w:tblGrid>
+      <w:tr>
+        <w:tc>
+          <w:tcPr>
+            <w:tcW w:type="dxa" w:w="9500"/>
+            <w:tcBorders>
+              <w:top w:val="none"/>
+              <w:left w:val="single" w:color="B6975A" w:sz="10"/>
+              <w:bottom w:val="none"/>
+              <w:right w:val="none"/>
+            </w:tcBorders>
+            <w:shd w:fill="F7F9FA" w:val="clear"/>
+            <w:tcMar>
+              <w:top w:type="dxa" w:w="120"/>
+              <w:left w:type="dxa" w:w="160"/>
+              <w:bottom w:type="dxa" w:w="120"/>
+              <w:right w:type="dxa" w:w="160"/>
+            </w:tcMar>
+          </w:tcPr>
+          <w:p>
+            <w:pPr>
+              <w:spacing w:after="0"/>
+            </w:pPr>
+            <w:r>
+              <w:rPr>
+                <w:rFonts w:ascii="Arial" w:cs="Arial" w:eastAsia="Arial" w:hAnsi="Arial"/>
+                <w:color w:val="26343B"/>
+                <w:sz w:val="17"/>
+                <w:szCs w:val="17"/>
+              </w:rPr>
+              <w:t xml:space="preserve">septiembre reemplazó definitivamente </w:t>
+            </w:r>
+            <w:r>
+              <w:rPr>
+                <w:rFonts w:ascii="Consolas" w:cs="Consolas" w:eastAsia="Consolas" w:hAnsi="Consolas"/>
+                <w:color w:val="368991"/>
+                <w:sz w:val="16"/>
+                <w:szCs w:val="16"/>
+                <w:shd w:fill="EAF2F3" w:val="clear"/>
+              </w:rPr>
+              <w:t xml:space="preserve">favorites</w:t>
+            </w:r>
+            <w:r>
+              <w:rPr>
+                <w:rFonts w:ascii="Arial" w:cs="Arial" w:eastAsia="Arial" w:hAnsi="Arial"/>
+                <w:color w:val="26343B"/>
+                <w:sz w:val="17"/>
+                <w:szCs w:val="17"/>
+              </w:rPr>
+              <w:t xml:space="preserve"> por </w:t>
+            </w:r>
+            <w:r>
+              <w:rPr>
+                <w:rFonts w:ascii="Consolas" w:cs="Consolas" w:eastAsia="Consolas" w:hAnsi="Consolas"/>
+                <w:color w:val="368991"/>
+                <w:sz w:val="16"/>
+                <w:szCs w:val="16"/>
+                <w:shd w:fill="EAF2F3" w:val="clear"/>
+              </w:rPr>
+              <w:t xml:space="preserve">user_event_interactions</w:t>
+            </w:r>
+            <w:r>
+              <w:rPr>
+                <w:rFonts w:ascii="Arial" w:cs="Arial" w:eastAsia="Arial" w:hAnsi="Arial"/>
+                <w:color w:val="26343B"/>
+                <w:sz w:val="17"/>
+                <w:szCs w:val="17"/>
+              </w:rPr>
+              <w:t xml:space="preserve">.</w:t>
+            </w:r>
+          </w:p>
+        </w:tc>
+      </w:tr>
+    </w:tbl>
+    <w:p>
+      <w:pPr>
+        <w:pStyle w:val="Heading2"/>
+        <w:keepNext/>
+        <w:spacing w:after="70" w:before="130"/>
+      </w:pPr>
+      <w:r>
+        <w:rPr>
+          <w:rFonts w:ascii="Cambria" w:cs="Cambria" w:eastAsia="Cambria" w:hAnsi="Cambria"/>
           <w:b/>
           <w:bCs/>
-          <w:color w:val="368991"/>
-          <w:sz w:val="16"/>
-          <w:szCs w:val="16"/>
+          <w:color w:val="506874"/>
+          <w:sz w:val="22"/>
+          <w:szCs w:val="22"/>
         </w:rPr>
         <w:t xml:space="preserve">Estado del modelo</w:t>
       </w:r>
     </w:p>
     <w:p>
+      <w:pPr>
+        <w:spacing w:after="90" w:line="270"/>
+        <w:jc w:val="both"/>
+      </w:pPr>
       <w:r>
         <w:rPr>
           <w:rFonts w:ascii="Arial" w:cs="Arial" w:eastAsia="Arial" w:hAnsi="Arial"/>
-          <w:color w:val="78848A"/>
-          <w:sz w:val="15"/>
-          <w:szCs w:val="15"/>
+          <w:color w:val="26343B"/>
+          <w:sz w:val="18"/>
+          <w:szCs w:val="18"/>
         </w:rPr>
-        <w:t xml:space="preserve">La versión vigente reemplaza favorites por user_event_interactions y publica el catálogo mediante staging y una RPC transaccional.</w:t>
+        <w:t xml:space="preserve">La versión vigente reemplaza </w:t>
       </w:r>
-    </w:p>
-    <w:p>
       <w:r>
-        <w:br w:type="page"/>
+        <w:rPr>
+          <w:rFonts w:ascii="Consolas" w:cs="Consolas" w:eastAsia="Consolas" w:hAnsi="Consolas"/>
+          <w:color w:val="368991"/>
+          <w:sz w:val="17"/>
+          <w:szCs w:val="17"/>
+          <w:shd w:fill="EAF2F3" w:val="clear"/>
+        </w:rPr>
+        <w:t xml:space="preserve">favorites</w:t>
+      </w:r>
+      <w:r>
+        <w:rPr>
+          <w:rFonts w:ascii="Arial" w:cs="Arial" w:eastAsia="Arial" w:hAnsi="Arial"/>
+          <w:color w:val="26343B"/>
+          <w:sz w:val="18"/>
+          <w:szCs w:val="18"/>
+        </w:rPr>
+        <w:t xml:space="preserve"> por </w:t>
+      </w:r>
+      <w:r>
+        <w:rPr>
+          <w:rFonts w:ascii="Consolas" w:cs="Consolas" w:eastAsia="Consolas" w:hAnsi="Consolas"/>
+          <w:color w:val="368991"/>
+          <w:sz w:val="17"/>
+          <w:szCs w:val="17"/>
+          <w:shd w:fill="EAF2F3" w:val="clear"/>
+        </w:rPr>
+        <w:t xml:space="preserve">user_event_interactions</w:t>
+      </w:r>
+      <w:r>
+        <w:rPr>
+          <w:rFonts w:ascii="Arial" w:cs="Arial" w:eastAsia="Arial" w:hAnsi="Arial"/>
+          <w:color w:val="26343B"/>
+          <w:sz w:val="18"/>
+          <w:szCs w:val="18"/>
+        </w:rPr>
+        <w:t xml:space="preserve"> y publica el catálogo mediante </w:t>
+      </w:r>
+      <w:r>
+        <w:rPr>
+          <w:rFonts w:ascii="Consolas" w:cs="Consolas" w:eastAsia="Consolas" w:hAnsi="Consolas"/>
+          <w:color w:val="368991"/>
+          <w:sz w:val="17"/>
+          <w:szCs w:val="17"/>
+          <w:shd w:fill="EAF2F3" w:val="clear"/>
+        </w:rPr>
+        <w:t xml:space="preserve">catalog_staging</w:t>
+      </w:r>
+      <w:r>
+        <w:rPr>
+          <w:rFonts w:ascii="Arial" w:cs="Arial" w:eastAsia="Arial" w:hAnsi="Arial"/>
+          <w:color w:val="26343B"/>
+          <w:sz w:val="18"/>
+          <w:szCs w:val="18"/>
+        </w:rPr>
+        <w:t xml:space="preserve"> y la función transaccional </w:t>
+      </w:r>
+      <w:r>
+        <w:rPr>
+          <w:rFonts w:ascii="Consolas" w:cs="Consolas" w:eastAsia="Consolas" w:hAnsi="Consolas"/>
+          <w:color w:val="368991"/>
+          <w:sz w:val="17"/>
+          <w:szCs w:val="17"/>
+          <w:shd w:fill="EAF2F3" w:val="clear"/>
+        </w:rPr>
+        <w:t xml:space="preserve">publish_staged_catalog(...)</w:t>
+      </w:r>
+      <w:r>
+        <w:rPr>
+          <w:rFonts w:ascii="Arial" w:cs="Arial" w:eastAsia="Arial" w:hAnsi="Arial"/>
+          <w:color w:val="26343B"/>
+          <w:sz w:val="18"/>
+          <w:szCs w:val="18"/>
+        </w:rPr>
+        <w:t xml:space="preserve">.</w:t>
       </w:r>
     </w:p>
     <w:p>
@@ -32496,7 +33866,7 @@
         <w:sz w:val="10"/>
         <w:szCs w:val="10"/>
       </w:rPr>
-      <w:t xml:space="preserve">EVENTO CULTURAL  ·  DOCUMENTACIÓN 2026</w:t>
+      <w:t xml:space="preserve">EVENTO CULTURAL · DOCUMENTACIÓN 2026</w:t>
     </w:r>
   </w:p>
 </w:hdr>

</xml_diff>

<commit_message>
feat: integra limpieza protegida y documenta optimizaciones del scraper
</commit_message>
<xml_diff>
--- a/docs/Documentacion_Base_de_Datos_Eventos_Culturales.docx
+++ b/docs/Documentacion_Base_de_Datos_Eventos_Culturales.docx
@@ -75,7 +75,7 @@
           <w:color w:val="5E6B78"/>
           <w:sz w:val="21"/>
         </w:rPr>
-        <w:t>Versión documentada: 3 de octubre de 2026</w:t>
+        <w:t>Versión documentada: 20 de octubre de 2026</w:t>
       </w:r>
     </w:p>
     <w:p>
@@ -89,7 +89,7 @@
           <w:color w:val="5E6B78"/>
           <w:sz w:val="18"/>
         </w:rPr>
-        <w:t>Migraciones: 20260831000100 · 20260902000100 · 20260911000100 · 20260912000100 · 20260921000100 · 20260924000100</w:t>
+        <w:t>Migraciones: 20260831000100 · 20260902000100 · 20260911000100 · 20260912000100 · 20260921000100 · 20260924000100 · 20261020000100 · 20261020000200 · 20261020000300</w:t>
       </w:r>
     </w:p>
     <w:p>
@@ -380,6 +380,30 @@
           <w:color w:val="17324D"/>
           <w:sz w:val="22"/>
         </w:rPr>
+        <w:t xml:space="preserve">   Validación de migraciones</w:t>
+      </w:r>
+    </w:p>
+    <w:p>
+      <w:pPr>
+        <w:spacing w:after="100"/>
+        <w:ind w:left="216"/>
+      </w:pPr>
+      <w:r>
+        <w:rPr>
+          <w:rFonts w:ascii="Calibri" w:hAnsi="Calibri"/>
+          <w:b/>
+          <w:color w:val="B8871B"/>
+          <w:sz w:val="19"/>
+        </w:rPr>
+        <w:t>11</w:t>
+      </w:r>
+      <w:r>
+        <w:rPr>
+          <w:rFonts w:ascii="Calibri" w:hAnsi="Calibri"/>
+          <w:b/>
+          <w:color w:val="17324D"/>
+          <w:sz w:val="22"/>
+        </w:rPr>
         <w:t xml:space="preserve">   Limitaciones conocidas</w:t>
       </w:r>
     </w:p>
@@ -738,7 +762,7 @@
                 <w:rFonts w:ascii="Calibri" w:hAnsi="Calibri"/>
                 <w:sz w:val="18"/>
               </w:rPr>
-              <w:t>3 de octubre de 2026</w:t>
+              <w:t>20 de octubre de 2026</w:t>
             </w:r>
           </w:p>
         </w:tc>
@@ -1188,6 +1212,57 @@
     </w:p>
     <w:p>
       <w:pPr>
+        <w:numPr>
+          <w:ilvl w:val="0"/>
+          <w:numId w:val="10"/>
+        </w:numPr>
+      </w:pPr>
+      <w:r>
+        <w:rPr>
+          <w:rFonts w:ascii="Consolas" w:hAnsi="Consolas"/>
+          <w:color w:val="1F4D78"/>
+          <w:sz w:val="19"/>
+          <w:shd w:fill="EEF2F6"/>
+        </w:rPr>
+        <w:t>supabase/migrations/20261020000100_cleanup_expired_events.sql</w:t>
+      </w:r>
+    </w:p>
+    <w:p>
+      <w:pPr>
+        <w:numPr>
+          <w:ilvl w:val="0"/>
+          <w:numId w:val="10"/>
+        </w:numPr>
+      </w:pPr>
+      <w:r>
+        <w:rPr>
+          <w:rFonts w:ascii="Consolas" w:hAnsi="Consolas"/>
+          <w:color w:val="1F4D78"/>
+          <w:sz w:val="19"/>
+          <w:shd w:fill="EEF2F6"/>
+        </w:rPr>
+        <w:t>supabase/migrations/20261020000200_optimize_event_matching.sql</w:t>
+      </w:r>
+    </w:p>
+    <w:p>
+      <w:pPr>
+        <w:numPr>
+          <w:ilvl w:val="0"/>
+          <w:numId w:val="10"/>
+        </w:numPr>
+      </w:pPr>
+      <w:r>
+        <w:rPr>
+          <w:rFonts w:ascii="Consolas" w:hAnsi="Consolas"/>
+          <w:color w:val="1F4D78"/>
+          <w:sz w:val="19"/>
+          <w:shd w:fill="EEF2F6"/>
+        </w:rPr>
+        <w:t>supabase/migrations/20261020000300_integrate_expired_cleanup.sql</w:t>
+      </w:r>
+    </w:p>
+    <w:p>
+      <w:pPr>
         <w:pStyle w:val="Heading2"/>
       </w:pPr>
       <w:r>
@@ -1389,7 +1464,444 @@
         <w:rPr>
           <w:rFonts w:ascii="Calibri" w:hAnsi="Calibri"/>
         </w:rPr>
-        <w:t>.</w:t>
+        <w:t xml:space="preserve">. La revisión del 20 de octubre añade </w:t>
+      </w:r>
+      <w:r>
+        <w:rPr>
+          <w:rFonts w:ascii="Consolas" w:hAnsi="Consolas"/>
+          <w:color w:val="1F4D78"/>
+          <w:sz w:val="19"/>
+          <w:shd w:fill="EEF2F6"/>
+        </w:rPr>
+        <w:t>cleanup_expired_events()</w:t>
+      </w:r>
+      <w:r>
+        <w:rPr>
+          <w:rFonts w:ascii="Calibri" w:hAnsi="Calibri"/>
+        </w:rPr>
+        <w:t>, optimiza la búsqueda previa a IA con dos índices de URL y conecta la limpieza protegida con la publicación. No añade tablas ni columnas, por lo que el modelo ER conserva sus entidades y relaciones.</w:t>
+      </w:r>
+    </w:p>
+    <w:p>
+      <w:pPr>
+        <w:pStyle w:val="Heading2"/>
+      </w:pPr>
+      <w:r>
+        <w:t>Registro de cambios del 20 de octubre de 2026</w:t>
+      </w:r>
+    </w:p>
+    <w:tbl>
+      <w:tblPr>
+        <w:tblW w:type="dxa" w:w="9360"/>
+        <w:jc w:val="left"/>
+        <w:tblLayout w:type="fixed"/>
+        <w:tblLook w:firstColumn="1" w:firstRow="1" w:lastColumn="0" w:lastRow="0" w:noHBand="0" w:noVBand="1" w:val="04A0"/>
+        <w:tblInd w:w="120" w:type="dxa"/>
+        <w:tblBorders>
+          <w:top w:val="single" w:sz="4" w:space="0" w:color="C9D3DE"/>
+          <w:left w:val="single" w:sz="4" w:space="0" w:color="C9D3DE"/>
+          <w:bottom w:val="single" w:sz="4" w:space="0" w:color="C9D3DE"/>
+          <w:right w:val="single" w:sz="4" w:space="0" w:color="C9D3DE"/>
+          <w:insideH w:val="single" w:sz="4" w:space="0" w:color="C9D3DE"/>
+          <w:insideV w:val="single" w:sz="4" w:space="0" w:color="C9D3DE"/>
+        </w:tblBorders>
+      </w:tblPr>
+      <w:tblGrid>
+        <w:gridCol w:w="1700"/>
+        <w:gridCol w:w="4500"/>
+        <w:gridCol w:w="3160"/>
+      </w:tblGrid>
+      <w:tr>
+        <w:trPr>
+          <w:cantSplit/>
+          <w:tblHeader w:val="true"/>
+        </w:trPr>
+        <w:tc>
+          <w:tcPr>
+            <w:tcW w:type="dxa" w:w="1700"/>
+            <w:tcMar>
+              <w:top w:w="80" w:type="dxa"/>
+              <w:start w:w="120" w:type="dxa"/>
+              <w:bottom w:w="80" w:type="dxa"/>
+              <w:end w:w="120" w:type="dxa"/>
+            </w:tcMar>
+            <w:vAlign w:val="center"/>
+            <w:shd w:fill="E8EEF5"/>
+          </w:tcPr>
+          <w:p>
+            <w:pPr>
+              <w:keepNext/>
+              <w:spacing w:before="0" w:after="0" w:line="259" w:lineRule="auto"/>
+            </w:pPr>
+            <w:r>
+              <w:rPr>
+                <w:rFonts w:ascii="Calibri" w:hAnsi="Calibri"/>
+                <w:b/>
+                <w:color w:val="17324D"/>
+                <w:sz w:val="18"/>
+              </w:rPr>
+              <w:t>Migración</w:t>
+            </w:r>
+          </w:p>
+        </w:tc>
+        <w:tc>
+          <w:tcPr>
+            <w:tcW w:type="dxa" w:w="4500"/>
+            <w:tcMar>
+              <w:top w:w="80" w:type="dxa"/>
+              <w:start w:w="120" w:type="dxa"/>
+              <w:bottom w:w="80" w:type="dxa"/>
+              <w:end w:w="120" w:type="dxa"/>
+            </w:tcMar>
+            <w:vAlign w:val="center"/>
+            <w:shd w:fill="E8EEF5"/>
+          </w:tcPr>
+          <w:p>
+            <w:pPr>
+              <w:keepNext/>
+              <w:spacing w:before="0" w:after="0" w:line="259" w:lineRule="auto"/>
+              <w:jc w:val="center"/>
+            </w:pPr>
+            <w:r>
+              <w:rPr>
+                <w:rFonts w:ascii="Calibri" w:hAnsi="Calibri"/>
+                <w:b/>
+                <w:color w:val="17324D"/>
+                <w:sz w:val="18"/>
+              </w:rPr>
+              <w:t>Cambio</w:t>
+            </w:r>
+          </w:p>
+        </w:tc>
+        <w:tc>
+          <w:tcPr>
+            <w:tcW w:type="dxa" w:w="3160"/>
+            <w:tcMar>
+              <w:top w:w="80" w:type="dxa"/>
+              <w:start w:w="120" w:type="dxa"/>
+              <w:bottom w:w="80" w:type="dxa"/>
+              <w:end w:w="120" w:type="dxa"/>
+            </w:tcMar>
+            <w:vAlign w:val="center"/>
+            <w:shd w:fill="E8EEF5"/>
+          </w:tcPr>
+          <w:p>
+            <w:pPr>
+              <w:keepNext/>
+              <w:spacing w:before="0" w:after="0" w:line="259" w:lineRule="auto"/>
+            </w:pPr>
+            <w:r>
+              <w:rPr>
+                <w:rFonts w:ascii="Calibri" w:hAnsi="Calibri"/>
+                <w:b/>
+                <w:color w:val="17324D"/>
+                <w:sz w:val="18"/>
+              </w:rPr>
+              <w:t>Efecto al instalar</w:t>
+            </w:r>
+          </w:p>
+        </w:tc>
+      </w:tr>
+      <w:tr>
+        <w:trPr>
+          <w:cantSplit/>
+        </w:trPr>
+        <w:tc>
+          <w:tcPr>
+            <w:tcW w:type="dxa" w:w="1700"/>
+            <w:tcMar>
+              <w:top w:w="80" w:type="dxa"/>
+              <w:start w:w="120" w:type="dxa"/>
+              <w:bottom w:w="80" w:type="dxa"/>
+              <w:end w:w="120" w:type="dxa"/>
+            </w:tcMar>
+            <w:vAlign w:val="center"/>
+          </w:tcPr>
+          <w:p>
+            <w:pPr>
+              <w:spacing w:before="0" w:after="0" w:line="259" w:lineRule="auto"/>
+            </w:pPr>
+            <w:r>
+              <w:rPr>
+                <w:rFonts w:ascii="Consolas" w:hAnsi="Consolas"/>
+                <w:color w:val="1F4D78"/>
+                <w:sz w:val="17"/>
+                <w:shd w:fill="EEF2F6"/>
+              </w:rPr>
+              <w:t>20261020000100</w:t>
+            </w:r>
+          </w:p>
+        </w:tc>
+        <w:tc>
+          <w:tcPr>
+            <w:tcW w:type="dxa" w:w="4500"/>
+            <w:tcMar>
+              <w:top w:w="80" w:type="dxa"/>
+              <w:start w:w="120" w:type="dxa"/>
+              <w:bottom w:w="80" w:type="dxa"/>
+              <w:end w:w="120" w:type="dxa"/>
+            </w:tcMar>
+            <w:vAlign w:val="center"/>
+          </w:tcPr>
+          <w:p>
+            <w:pPr>
+              <w:spacing w:before="0" w:after="0" w:line="259" w:lineRule="auto"/>
+              <w:jc w:val="center"/>
+            </w:pPr>
+            <w:r>
+              <w:rPr>
+                <w:rFonts w:ascii="Calibri" w:hAnsi="Calibri"/>
+                <w:sz w:val="18"/>
+              </w:rPr>
+              <w:t xml:space="preserve">Crea la RPC privada </w:t>
+            </w:r>
+            <w:r>
+              <w:rPr>
+                <w:rFonts w:ascii="Consolas" w:hAnsi="Consolas"/>
+                <w:color w:val="1F4D78"/>
+                <w:sz w:val="17"/>
+                <w:shd w:fill="EEF2F6"/>
+              </w:rPr>
+              <w:t>cleanup_expired_events()</w:t>
+            </w:r>
+            <w:r>
+              <w:rPr>
+                <w:rFonts w:ascii="Calibri" w:hAnsi="Calibri"/>
+                <w:sz w:val="18"/>
+              </w:rPr>
+              <w:t xml:space="preserve"> para eventos manuales y extraídos. Usa la hora del servidor y protege supresiones e interacciones.</w:t>
+            </w:r>
+          </w:p>
+        </w:tc>
+        <w:tc>
+          <w:tcPr>
+            <w:tcW w:type="dxa" w:w="3160"/>
+            <w:tcMar>
+              <w:top w:w="80" w:type="dxa"/>
+              <w:start w:w="120" w:type="dxa"/>
+              <w:bottom w:w="80" w:type="dxa"/>
+              <w:end w:w="120" w:type="dxa"/>
+            </w:tcMar>
+            <w:vAlign w:val="center"/>
+          </w:tcPr>
+          <w:p>
+            <w:pPr>
+              <w:spacing w:before="0" w:after="0" w:line="259" w:lineRule="auto"/>
+            </w:pPr>
+            <w:r>
+              <w:rPr>
+                <w:rFonts w:ascii="Calibri" w:hAnsi="Calibri"/>
+                <w:sz w:val="18"/>
+              </w:rPr>
+              <w:t>Crea la función y sus permisos; no borra eventos.</w:t>
+            </w:r>
+          </w:p>
+        </w:tc>
+      </w:tr>
+      <w:tr>
+        <w:trPr>
+          <w:cantSplit/>
+        </w:trPr>
+        <w:tc>
+          <w:tcPr>
+            <w:tcW w:type="dxa" w:w="1700"/>
+            <w:tcMar>
+              <w:top w:w="80" w:type="dxa"/>
+              <w:start w:w="120" w:type="dxa"/>
+              <w:bottom w:w="80" w:type="dxa"/>
+              <w:end w:w="120" w:type="dxa"/>
+            </w:tcMar>
+            <w:vAlign w:val="center"/>
+          </w:tcPr>
+          <w:p>
+            <w:pPr>
+              <w:spacing w:before="0" w:after="0" w:line="259" w:lineRule="auto"/>
+            </w:pPr>
+            <w:r>
+              <w:rPr>
+                <w:rFonts w:ascii="Consolas" w:hAnsi="Consolas"/>
+                <w:color w:val="1F4D78"/>
+                <w:sz w:val="17"/>
+                <w:shd w:fill="EEF2F6"/>
+              </w:rPr>
+              <w:t>20261020000200</w:t>
+            </w:r>
+          </w:p>
+        </w:tc>
+        <w:tc>
+          <w:tcPr>
+            <w:tcW w:type="dxa" w:w="4500"/>
+            <w:tcMar>
+              <w:top w:w="80" w:type="dxa"/>
+              <w:start w:w="120" w:type="dxa"/>
+              <w:bottom w:w="80" w:type="dxa"/>
+              <w:end w:w="120" w:type="dxa"/>
+            </w:tcMar>
+            <w:vAlign w:val="center"/>
+          </w:tcPr>
+          <w:p>
+            <w:pPr>
+              <w:spacing w:before="0" w:after="0" w:line="259" w:lineRule="auto"/>
+              <w:jc w:val="center"/>
+            </w:pPr>
+            <w:r>
+              <w:rPr>
+                <w:rFonts w:ascii="Calibri" w:hAnsi="Calibri"/>
+                <w:sz w:val="18"/>
+              </w:rPr>
+              <w:t xml:space="preserve">Añade índices de URL y reescribe </w:t>
+            </w:r>
+            <w:r>
+              <w:rPr>
+                <w:rFonts w:ascii="Consolas" w:hAnsi="Consolas"/>
+                <w:color w:val="1F4D78"/>
+                <w:sz w:val="17"/>
+                <w:shd w:fill="EEF2F6"/>
+              </w:rPr>
+              <w:t>match_existing_events(jsonb)</w:t>
+            </w:r>
+            <w:r>
+              <w:rPr>
+                <w:rFonts w:ascii="Calibri" w:hAnsi="Calibri"/>
+                <w:sz w:val="18"/>
+              </w:rPr>
+              <w:t xml:space="preserve"> sin cambiar su contrato REST.</w:t>
+            </w:r>
+          </w:p>
+        </w:tc>
+        <w:tc>
+          <w:tcPr>
+            <w:tcW w:type="dxa" w:w="3160"/>
+            <w:tcMar>
+              <w:top w:w="80" w:type="dxa"/>
+              <w:start w:w="120" w:type="dxa"/>
+              <w:bottom w:w="80" w:type="dxa"/>
+              <w:end w:w="120" w:type="dxa"/>
+            </w:tcMar>
+            <w:vAlign w:val="center"/>
+          </w:tcPr>
+          <w:p>
+            <w:pPr>
+              <w:spacing w:before="0" w:after="0" w:line="259" w:lineRule="auto"/>
+            </w:pPr>
+            <w:r>
+              <w:rPr>
+                <w:rFonts w:ascii="Calibri" w:hAnsi="Calibri"/>
+                <w:sz w:val="18"/>
+              </w:rPr>
+              <w:t>Construye índices y reemplaza la consulta; no modifica filas del catálogo.</w:t>
+            </w:r>
+          </w:p>
+        </w:tc>
+      </w:tr>
+      <w:tr>
+        <w:trPr>
+          <w:cantSplit/>
+        </w:trPr>
+        <w:tc>
+          <w:tcPr>
+            <w:tcW w:type="dxa" w:w="1700"/>
+            <w:tcMar>
+              <w:top w:w="80" w:type="dxa"/>
+              <w:start w:w="120" w:type="dxa"/>
+              <w:bottom w:w="80" w:type="dxa"/>
+              <w:end w:w="120" w:type="dxa"/>
+            </w:tcMar>
+            <w:vAlign w:val="center"/>
+          </w:tcPr>
+          <w:p>
+            <w:pPr>
+              <w:spacing w:before="0" w:after="0" w:line="259" w:lineRule="auto"/>
+            </w:pPr>
+            <w:r>
+              <w:rPr>
+                <w:rFonts w:ascii="Consolas" w:hAnsi="Consolas"/>
+                <w:color w:val="1F4D78"/>
+                <w:sz w:val="17"/>
+                <w:shd w:fill="EEF2F6"/>
+              </w:rPr>
+              <w:t>20261020000300</w:t>
+            </w:r>
+          </w:p>
+        </w:tc>
+        <w:tc>
+          <w:tcPr>
+            <w:tcW w:type="dxa" w:w="4500"/>
+            <w:tcMar>
+              <w:top w:w="80" w:type="dxa"/>
+              <w:start w:w="120" w:type="dxa"/>
+              <w:bottom w:w="80" w:type="dxa"/>
+              <w:end w:w="120" w:type="dxa"/>
+            </w:tcMar>
+            <w:vAlign w:val="center"/>
+          </w:tcPr>
+          <w:p>
+            <w:pPr>
+              <w:spacing w:before="0" w:after="0" w:line="259" w:lineRule="auto"/>
+              <w:jc w:val="center"/>
+            </w:pPr>
+            <w:r>
+              <w:rPr>
+                <w:rFonts w:ascii="Calibri" w:hAnsi="Calibri"/>
+                <w:sz w:val="18"/>
+              </w:rPr>
+              <w:t xml:space="preserve">Integra la limpieza en </w:t>
+            </w:r>
+            <w:r>
+              <w:rPr>
+                <w:rFonts w:ascii="Consolas" w:hAnsi="Consolas"/>
+                <w:color w:val="1F4D78"/>
+                <w:sz w:val="17"/>
+                <w:shd w:fill="EEF2F6"/>
+              </w:rPr>
+              <w:t>publish_staged_catalog(...)</w:t>
+            </w:r>
+            <w:r>
+              <w:rPr>
+                <w:rFonts w:ascii="Calibri" w:hAnsi="Calibri"/>
+                <w:sz w:val="18"/>
+              </w:rPr>
+              <w:t xml:space="preserve"> y protege la conciliación frente a eventos manuales o con interacciones.</w:t>
+            </w:r>
+          </w:p>
+        </w:tc>
+        <w:tc>
+          <w:tcPr>
+            <w:tcW w:type="dxa" w:w="3160"/>
+            <w:tcMar>
+              <w:top w:w="80" w:type="dxa"/>
+              <w:start w:w="120" w:type="dxa"/>
+              <w:bottom w:w="80" w:type="dxa"/>
+              <w:end w:w="120" w:type="dxa"/>
+            </w:tcMar>
+            <w:vAlign w:val="center"/>
+          </w:tcPr>
+          <w:p>
+            <w:pPr>
+              <w:spacing w:before="0" w:after="0" w:line="259" w:lineRule="auto"/>
+            </w:pPr>
+            <w:r>
+              <w:rPr>
+                <w:rFonts w:ascii="Calibri" w:hAnsi="Calibri"/>
+                <w:sz w:val="18"/>
+              </w:rPr>
+              <w:t>Reemplaza la función de publicación; no la ejecuta.</w:t>
+            </w:r>
+          </w:p>
+        </w:tc>
+      </w:tr>
+    </w:tbl>
+    <w:p>
+      <w:pPr>
+        <w:spacing w:after="40"/>
+      </w:pPr>
+    </w:p>
+    <w:p>
+      <w:r>
+        <w:rPr>
+          <w:rFonts w:ascii="Calibri" w:hAnsi="Calibri"/>
+        </w:rPr>
+        <w:t>Las nueve migraciones locales y remotas quedaron sincronizadas el 20 de octubre. La aplicación de estas migraciones no ejecutó el scraper ni una limpieza sobre el catálogo existente. El nuevo comportamiento se utiliza en la siguiente publicación que termine correctamente.</w:t>
       </w:r>
     </w:p>
     <w:p>
@@ -2906,7 +3418,7 @@
                 <w:rFonts w:ascii="Calibri" w:hAnsi="Calibri"/>
                 <w:sz w:val="18"/>
               </w:rPr>
-              <w:t>RPC privada</w:t>
+              <w:t>RPC privada de lectura</w:t>
             </w:r>
           </w:p>
         </w:tc>
@@ -2930,7 +3442,7 @@
                 <w:rFonts w:ascii="Calibri" w:hAnsi="Calibri"/>
                 <w:sz w:val="18"/>
               </w:rPr>
-              <w:t>Detecta coincidencias antes de OCR y redacción, y reutiliza procedencia editorial existente.</w:t>
+              <w:t>Detecta coincidencias por clave externa o URL antes de OCR y redacción; utiliza índices y devuelve una coincidencia por clave local.</w:t>
             </w:r>
           </w:p>
         </w:tc>
@@ -3091,6 +3603,102 @@
                 <w:sz w:val="18"/>
               </w:rPr>
               <w:t>Publica un lote completo desde staging, reconcilia registros obsoletos y elimina eventos vencidos.</w:t>
+            </w:r>
+          </w:p>
+        </w:tc>
+      </w:tr>
+      <w:tr>
+        <w:trPr>
+          <w:cantSplit/>
+        </w:trPr>
+        <w:tc>
+          <w:tcPr>
+            <w:tcW w:type="dxa" w:w="2100"/>
+            <w:tcMar>
+              <w:top w:w="80" w:type="dxa"/>
+              <w:start w:w="120" w:type="dxa"/>
+              <w:bottom w:w="80" w:type="dxa"/>
+              <w:end w:w="120" w:type="dxa"/>
+            </w:tcMar>
+            <w:vAlign w:val="center"/>
+          </w:tcPr>
+          <w:p>
+            <w:pPr>
+              <w:spacing w:before="0" w:after="0" w:line="259" w:lineRule="auto"/>
+            </w:pPr>
+            <w:r>
+              <w:rPr>
+                <w:rFonts w:ascii="Consolas" w:hAnsi="Consolas"/>
+                <w:color w:val="1F4D78"/>
+                <w:sz w:val="17"/>
+                <w:shd w:fill="EEF2F6"/>
+              </w:rPr>
+              <w:t>cleanup_expired_events()</w:t>
+            </w:r>
+          </w:p>
+        </w:tc>
+        <w:tc>
+          <w:tcPr>
+            <w:tcW w:type="dxa" w:w="1500"/>
+            <w:tcMar>
+              <w:top w:w="80" w:type="dxa"/>
+              <w:start w:w="120" w:type="dxa"/>
+              <w:bottom w:w="80" w:type="dxa"/>
+              <w:end w:w="120" w:type="dxa"/>
+            </w:tcMar>
+            <w:vAlign w:val="center"/>
+          </w:tcPr>
+          <w:p>
+            <w:pPr>
+              <w:spacing w:before="0" w:after="0" w:line="259" w:lineRule="auto"/>
+              <w:jc w:val="center"/>
+            </w:pPr>
+            <w:r>
+              <w:rPr>
+                <w:rFonts w:ascii="Calibri" w:hAnsi="Calibri"/>
+                <w:sz w:val="18"/>
+              </w:rPr>
+              <w:t>RPC privada</w:t>
+            </w:r>
+          </w:p>
+        </w:tc>
+        <w:tc>
+          <w:tcPr>
+            <w:tcW w:type="dxa" w:w="5760"/>
+            <w:tcMar>
+              <w:top w:w="80" w:type="dxa"/>
+              <w:start w:w="120" w:type="dxa"/>
+              <w:bottom w:w="80" w:type="dxa"/>
+              <w:end w:w="120" w:type="dxa"/>
+            </w:tcMar>
+            <w:vAlign w:val="center"/>
+          </w:tcPr>
+          <w:p>
+            <w:pPr>
+              <w:spacing w:before="0" w:after="0" w:line="259" w:lineRule="auto"/>
+            </w:pPr>
+            <w:r>
+              <w:rPr>
+                <w:rFonts w:ascii="Calibri" w:hAnsi="Calibri"/>
+                <w:sz w:val="18"/>
+              </w:rPr>
+              <w:t xml:space="preserve">Devuelve la cantidad eliminada como </w:t>
+            </w:r>
+            <w:r>
+              <w:rPr>
+                <w:rFonts w:ascii="Consolas" w:hAnsi="Consolas"/>
+                <w:color w:val="1F4D78"/>
+                <w:sz w:val="17"/>
+                <w:shd w:fill="EEF2F6"/>
+              </w:rPr>
+              <w:t>bigint</w:t>
+            </w:r>
+            <w:r>
+              <w:rPr>
+                <w:rFonts w:ascii="Calibri" w:hAnsi="Calibri"/>
+                <w:sz w:val="18"/>
+              </w:rPr>
+              <w:t>. Limpia vencidos usando el reloj de PostgreSQL y conserva supresiones e interacciones.</w:t>
             </w:r>
           </w:p>
         </w:tc>
@@ -14691,7 +15299,39 @@
                 <w:rFonts w:ascii="Calibri" w:hAnsi="Calibri"/>
                 <w:sz w:val="18"/>
               </w:rPr>
-              <w:t>, repositorio, ID de GitHub Actions, commit y evento disparador.</w:t>
+              <w:t xml:space="preserve">, repositorio, ID de GitHub Actions, commit y evento disparador. En publicaciones exitosas incluye </w:t>
+            </w:r>
+            <w:r>
+              <w:rPr>
+                <w:rFonts w:ascii="Consolas" w:hAnsi="Consolas"/>
+                <w:color w:val="1F4D78"/>
+                <w:sz w:val="17"/>
+                <w:shd w:fill="EEF2F6"/>
+              </w:rPr>
+              <w:t>removed_stale</w:t>
+            </w:r>
+            <w:r>
+              <w:rPr>
+                <w:rFonts w:ascii="Calibri" w:hAnsi="Calibri"/>
+                <w:sz w:val="18"/>
+              </w:rPr>
+              <w:t xml:space="preserve"> y </w:t>
+            </w:r>
+            <w:r>
+              <w:rPr>
+                <w:rFonts w:ascii="Consolas" w:hAnsi="Consolas"/>
+                <w:color w:val="1F4D78"/>
+                <w:sz w:val="17"/>
+                <w:shd w:fill="EEF2F6"/>
+              </w:rPr>
+              <w:t>removed_expired</w:t>
+            </w:r>
+            <w:r>
+              <w:rPr>
+                <w:rFonts w:ascii="Calibri" w:hAnsi="Calibri"/>
+                <w:sz w:val="18"/>
+              </w:rPr>
+              <w:t>.</w:t>
             </w:r>
           </w:p>
         </w:tc>
@@ -14737,7 +15377,37 @@
         <w:rPr>
           <w:rFonts w:ascii="Calibri" w:hAnsi="Calibri"/>
         </w:rPr>
-        <w:t xml:space="preserve"> aplica el catálogo, relaciones y limpieza dentro de una única transacción; si falla, las tablas públicas conservan el estado anterior.</w:t>
+        <w:t xml:space="preserve"> aplica el catálogo, relaciones y limpieza dentro de una única transacción; si falla, las tablas públicas conservan el estado anterior. </w:t>
+      </w:r>
+      <w:r>
+        <w:rPr>
+          <w:rFonts w:ascii="Consolas" w:hAnsi="Consolas"/>
+          <w:color w:val="1F4D78"/>
+          <w:sz w:val="19"/>
+          <w:shd w:fill="EEF2F6"/>
+        </w:rPr>
+        <w:t>removed_stale</w:t>
+      </w:r>
+      <w:r>
+        <w:rPr>
+          <w:rFonts w:ascii="Calibri" w:hAnsi="Calibri"/>
+        </w:rPr>
+        <w:t xml:space="preserve"> cuenta los registros retirados por ausencia en fuentes conciliadas; </w:t>
+      </w:r>
+      <w:r>
+        <w:rPr>
+          <w:rFonts w:ascii="Consolas" w:hAnsi="Consolas"/>
+          <w:color w:val="1F4D78"/>
+          <w:sz w:val="19"/>
+          <w:shd w:fill="EEF2F6"/>
+        </w:rPr>
+        <w:t>removed_expired</w:t>
+      </w:r>
+      <w:r>
+        <w:rPr>
+          <w:rFonts w:ascii="Calibri" w:hAnsi="Calibri"/>
+        </w:rPr>
+        <w:t>, los borrados después por vencimiento. No representan el total restante de la base. Las ejecuciones históricas pueden no tener estas claves. La bitácora de éxito se actualiza después de la RPC: si falla esa escritura, no revierte una publicación ya confirmada.</w:t>
       </w:r>
     </w:p>
     <w:p>
@@ -18198,6 +18868,174 @@
     </w:p>
     <w:p>
       <w:pPr>
+        <w:pStyle w:val="Heading2"/>
+      </w:pPr>
+      <w:r>
+        <w:t>Índices de deduplicación previa a IA</w:t>
+      </w:r>
+    </w:p>
+    <w:p>
+      <w:r>
+        <w:rPr>
+          <w:rFonts w:ascii="Consolas" w:hAnsi="Consolas"/>
+          <w:color w:val="1F4D78"/>
+          <w:sz w:val="19"/>
+          <w:shd w:fill="EEF2F6"/>
+        </w:rPr>
+        <w:t>events_match_source_url_idx</w:t>
+      </w:r>
+      <w:r>
+        <w:rPr>
+          <w:rFonts w:ascii="Calibri" w:hAnsi="Calibri"/>
+        </w:rPr>
+        <w:t xml:space="preserve"> y </w:t>
+      </w:r>
+      <w:r>
+        <w:rPr>
+          <w:rFonts w:ascii="Consolas" w:hAnsi="Consolas"/>
+          <w:color w:val="1F4D78"/>
+          <w:sz w:val="19"/>
+          <w:shd w:fill="EEF2F6"/>
+        </w:rPr>
+        <w:t>events_match_official_url_idx</w:t>
+      </w:r>
+      <w:r>
+        <w:rPr>
+          <w:rFonts w:ascii="Calibri" w:hAnsi="Calibri"/>
+        </w:rPr>
+        <w:t xml:space="preserve"> son índices B-tree de expresión. Ambos utilizan </w:t>
+      </w:r>
+      <w:r>
+        <w:rPr>
+          <w:rFonts w:ascii="Consolas" w:hAnsi="Consolas"/>
+          <w:color w:val="1F4D78"/>
+          <w:sz w:val="19"/>
+          <w:shd w:fill="EEF2F6"/>
+        </w:rPr>
+        <w:t>lower(split_part(rtrim(url, '/'), '#', 1))</w:t>
+      </w:r>
+      <w:r>
+        <w:rPr>
+          <w:rFonts w:ascii="Calibri" w:hAnsi="Calibri"/>
+        </w:rPr>
+        <w:t xml:space="preserve">, sustituyendo </w:t>
+      </w:r>
+      <w:r>
+        <w:rPr>
+          <w:rFonts w:ascii="Consolas" w:hAnsi="Consolas"/>
+          <w:color w:val="1F4D78"/>
+          <w:sz w:val="19"/>
+          <w:shd w:fill="EEF2F6"/>
+        </w:rPr>
+        <w:t>url</w:t>
+      </w:r>
+      <w:r>
+        <w:rPr>
+          <w:rFonts w:ascii="Calibri" w:hAnsi="Calibri"/>
+        </w:rPr>
+        <w:t xml:space="preserve"> por su columna respectiva. El cliente envía la URL candidata normalizada; la consulta mantiene exactamente la misma expresión en el lado almacenado para poder utilizar esos índices. La clave </w:t>
+      </w:r>
+      <w:r>
+        <w:rPr>
+          <w:rFonts w:ascii="Consolas" w:hAnsi="Consolas"/>
+          <w:color w:val="1F4D78"/>
+          <w:sz w:val="19"/>
+          <w:shd w:fill="EEF2F6"/>
+        </w:rPr>
+        <w:t>external_key</w:t>
+      </w:r>
+      <w:r>
+        <w:rPr>
+          <w:rFonts w:ascii="Calibri" w:hAnsi="Calibri"/>
+        </w:rPr>
+        <w:t xml:space="preserve"> conserva el índice único que ya tenía.</w:t>
+      </w:r>
+    </w:p>
+    <w:p>
+      <w:r>
+        <w:rPr>
+          <w:rFonts w:ascii="Calibri" w:hAnsi="Calibri"/>
+        </w:rPr>
+        <w:t xml:space="preserve">La RPC separa las búsquedas por clave, URL de extracción y URL oficial mediante </w:t>
+      </w:r>
+      <w:r>
+        <w:rPr>
+          <w:rFonts w:ascii="Consolas" w:hAnsi="Consolas"/>
+          <w:color w:val="1F4D78"/>
+          <w:sz w:val="19"/>
+          <w:shd w:fill="EEF2F6"/>
+        </w:rPr>
+        <w:t>UNION ALL</w:t>
+      </w:r>
+      <w:r>
+        <w:rPr>
+          <w:rFonts w:ascii="Calibri" w:hAnsi="Calibri"/>
+        </w:rPr>
+        <w:t xml:space="preserve">. Después conserva la coincidencia con </w:t>
+      </w:r>
+      <w:r>
+        <w:rPr>
+          <w:rFonts w:ascii="Consolas" w:hAnsi="Consolas"/>
+          <w:color w:val="1F4D78"/>
+          <w:sz w:val="19"/>
+          <w:shd w:fill="EEF2F6"/>
+        </w:rPr>
+        <w:t>last_seen_at</w:t>
+      </w:r>
+      <w:r>
+        <w:rPr>
+          <w:rFonts w:ascii="Calibri" w:hAnsi="Calibri"/>
+        </w:rPr>
+        <w:t xml:space="preserve"> más reciente por </w:t>
+      </w:r>
+      <w:r>
+        <w:rPr>
+          <w:rFonts w:ascii="Consolas" w:hAnsi="Consolas"/>
+          <w:color w:val="1F4D78"/>
+          <w:sz w:val="19"/>
+          <w:shd w:fill="EEF2F6"/>
+        </w:rPr>
+        <w:t>local_key</w:t>
+      </w:r>
+      <w:r>
+        <w:rPr>
+          <w:rFonts w:ascii="Calibri" w:hAnsi="Calibri"/>
+        </w:rPr>
+        <w:t xml:space="preserve">; ante empate, ordena por </w:t>
+      </w:r>
+      <w:r>
+        <w:rPr>
+          <w:rFonts w:ascii="Consolas" w:hAnsi="Consolas"/>
+          <w:color w:val="1F4D78"/>
+          <w:sz w:val="19"/>
+          <w:shd w:fill="EEF2F6"/>
+        </w:rPr>
+        <w:t>events.id</w:t>
+      </w:r>
+      <w:r>
+        <w:rPr>
+          <w:rFonts w:ascii="Calibri" w:hAnsi="Calibri"/>
+        </w:rPr>
+        <w:t xml:space="preserve">. Sigue devolviendo los textos editoriales, el OCR, la procedencia y la supresión existentes. Es </w:t>
+      </w:r>
+      <w:r>
+        <w:rPr>
+          <w:rFonts w:ascii="Consolas" w:hAnsi="Consolas"/>
+          <w:color w:val="1F4D78"/>
+          <w:sz w:val="19"/>
+          <w:shd w:fill="EEF2F6"/>
+        </w:rPr>
+        <w:t>STABLE</w:t>
+      </w:r>
+      <w:r>
+        <w:rPr>
+          <w:rFonts w:ascii="Calibri" w:hAnsi="Calibri"/>
+        </w:rPr>
+        <w:t>, no modifica datos y mantiene la firma REST anterior.</w:t>
+      </w:r>
+    </w:p>
+    <w:p>
+      <w:pPr>
         <w:pStyle w:val="Heading1"/>
       </w:pPr>
       <w:r>
@@ -25001,6 +25839,21 @@
         <w:rPr>
           <w:rFonts w:ascii="Calibri" w:hAnsi="Calibri"/>
         </w:rPr>
+        <w:t xml:space="preserve">, </w:t>
+      </w:r>
+      <w:r>
+        <w:rPr>
+          <w:rFonts w:ascii="Consolas" w:hAnsi="Consolas"/>
+          <w:color w:val="1F4D78"/>
+          <w:sz w:val="19"/>
+          <w:shd w:fill="EEF2F6"/>
+        </w:rPr>
+        <w:t>cleanup_expired_events()</w:t>
+      </w:r>
+      <w:r>
+        <w:rPr>
+          <w:rFonts w:ascii="Calibri" w:hAnsi="Calibri"/>
+        </w:rPr>
         <w:t xml:space="preserve"> y </w:t>
       </w:r>
       <w:r>
@@ -25061,7 +25914,7 @@
       <w:pPr>
         <w:numPr>
           <w:ilvl w:val="0"/>
-          <w:numId w:val="11"/>
+          <w:numId w:val="12"/>
         </w:numPr>
       </w:pPr>
       <w:r>
@@ -25075,7 +25928,7 @@
       <w:pPr>
         <w:numPr>
           <w:ilvl w:val="0"/>
-          <w:numId w:val="11"/>
+          <w:numId w:val="12"/>
         </w:numPr>
       </w:pPr>
       <w:r>
@@ -25104,7 +25957,7 @@
       <w:pPr>
         <w:numPr>
           <w:ilvl w:val="0"/>
-          <w:numId w:val="11"/>
+          <w:numId w:val="12"/>
         </w:numPr>
       </w:pPr>
       <w:r>
@@ -25118,7 +25971,7 @@
       <w:pPr>
         <w:numPr>
           <w:ilvl w:val="0"/>
-          <w:numId w:val="11"/>
+          <w:numId w:val="12"/>
         </w:numPr>
       </w:pPr>
       <w:r>
@@ -25132,35 +25985,35 @@
       <w:pPr>
         <w:numPr>
           <w:ilvl w:val="0"/>
-          <w:numId w:val="11"/>
+          <w:numId w:val="12"/>
         </w:numPr>
       </w:pPr>
       <w:r>
         <w:rPr>
           <w:rFonts w:ascii="Calibri" w:hAnsi="Calibri"/>
         </w:rPr>
-        <w:t>Supabase identifica coincidencias por URL original o clave título-fecha-lugar y devuelve los organizadores bloqueados.</w:t>
+        <w:t>Supabase identifica coincidencias por clave externa o URL original/oficial y devuelve los organizadores bloqueados. La clave externa procede de la consolidación título-fecha-lugar.</w:t>
       </w:r>
     </w:p>
     <w:p>
       <w:pPr>
         <w:numPr>
           <w:ilvl w:val="0"/>
-          <w:numId w:val="11"/>
+          <w:numId w:val="12"/>
         </w:numPr>
       </w:pPr>
       <w:r>
         <w:rPr>
           <w:rFonts w:ascii="Calibri" w:hAnsi="Calibri"/>
         </w:rPr>
-        <w:t>Solo los eventos nuevos pasan por OCR, redacción editorial y normalización NVIDIA.</w:t>
+        <w:t>Solo los eventos nuevos, modificados o con enriquecimiento pendiente pasan por OCR, redacción editorial y normalización NVIDIA. Los que no cambiaron reutilizan los resultados guardados.</w:t>
       </w:r>
     </w:p>
     <w:p>
       <w:pPr>
         <w:numPr>
           <w:ilvl w:val="0"/>
-          <w:numId w:val="11"/>
+          <w:numId w:val="12"/>
         </w:numPr>
       </w:pPr>
       <w:r>
@@ -25174,7 +26027,7 @@
       <w:pPr>
         <w:numPr>
           <w:ilvl w:val="0"/>
-          <w:numId w:val="11"/>
+          <w:numId w:val="12"/>
         </w:numPr>
       </w:pPr>
       <w:r>
@@ -25188,7 +26041,7 @@
       <w:pPr>
         <w:numPr>
           <w:ilvl w:val="0"/>
-          <w:numId w:val="11"/>
+          <w:numId w:val="12"/>
         </w:numPr>
       </w:pPr>
       <w:r>
@@ -25232,7 +26085,7 @@
       <w:pPr>
         <w:numPr>
           <w:ilvl w:val="0"/>
-          <w:numId w:val="11"/>
+          <w:numId w:val="12"/>
         </w:numPr>
       </w:pPr>
       <w:r>
@@ -25261,21 +26114,45 @@
       <w:pPr>
         <w:numPr>
           <w:ilvl w:val="0"/>
-          <w:numId w:val="11"/>
+          <w:numId w:val="12"/>
         </w:numPr>
       </w:pPr>
       <w:r>
         <w:rPr>
+          <w:rFonts w:ascii="Consolas" w:hAnsi="Consolas"/>
+          <w:color w:val="1F4D78"/>
+          <w:sz w:val="19"/>
+          <w:shd w:fill="EEF2F6"/>
+        </w:rPr>
+        <w:t>publish_staged_catalog(...)</w:t>
+      </w:r>
+      <w:r>
+        <w:rPr>
           <w:rFonts w:ascii="Calibri" w:hAnsi="Calibri"/>
         </w:rPr>
-        <w:t>Una RPC transaccional publica entidades, eventos, procedencia, relaciones y limpieza.</w:t>
+        <w:t xml:space="preserve"> publica entidades, eventos, procedencia y relaciones; concilia ausencias y, si está habilitado, llama a </w:t>
+      </w:r>
+      <w:r>
+        <w:rPr>
+          <w:rFonts w:ascii="Consolas" w:hAnsi="Consolas"/>
+          <w:color w:val="1F4D78"/>
+          <w:sz w:val="19"/>
+          <w:shd w:fill="EEF2F6"/>
+        </w:rPr>
+        <w:t>cleanup_expired_events()</w:t>
+      </w:r>
+      <w:r>
+        <w:rPr>
+          <w:rFonts w:ascii="Calibri" w:hAnsi="Calibri"/>
+        </w:rPr>
+        <w:t xml:space="preserve"> en la misma transacción.</w:t>
       </w:r>
     </w:p>
     <w:p>
       <w:pPr>
         <w:numPr>
           <w:ilvl w:val="0"/>
-          <w:numId w:val="11"/>
+          <w:numId w:val="12"/>
         </w:numPr>
       </w:pPr>
       <w:r>
@@ -25348,7 +26225,7 @@
         <w:rPr>
           <w:rFonts w:ascii="Calibri" w:hAnsi="Calibri"/>
         </w:rPr>
-        <w:t xml:space="preserve"> controla la cantidad máxima por solicitud REST. Todas las operaciones NVIDIA comparten el límite </w:t>
+        <w:t xml:space="preserve"> controla los fragmentos de carga. Para las consultas de coincidencias, el cliente acota cada lote entre 1 y 500 candidatos, incluso si la configuración es mayor; el workflow utiliza 200. Así evita que una respuesta de más de 1.000 coincidencias se trunque con el límite habitual de filas de PostgREST. Todas las operaciones NVIDIA comparten el límite </w:t>
       </w:r>
       <w:r>
         <w:rPr>
@@ -25364,6 +26241,439 @@
           <w:rFonts w:ascii="Calibri" w:hAnsi="Calibri"/>
         </w:rPr>
         <w:t>; con el valor 40 se fuerza un intervalo seguro de al menos 1,55 segundos entre inicios de solicitudes.</w:t>
+      </w:r>
+    </w:p>
+    <w:p>
+      <w:pPr>
+        <w:pStyle w:val="Heading2"/>
+      </w:pPr>
+      <w:r>
+        <w:t>Reglas de limpieza por vencimiento</w:t>
+      </w:r>
+    </w:p>
+    <w:p>
+      <w:r>
+        <w:rPr>
+          <w:rFonts w:ascii="Calibri" w:hAnsi="Calibri"/>
+        </w:rPr>
+        <w:t xml:space="preserve">Con </w:t>
+      </w:r>
+      <w:r>
+        <w:rPr>
+          <w:rFonts w:ascii="Consolas" w:hAnsi="Consolas"/>
+          <w:color w:val="1F4D78"/>
+          <w:sz w:val="19"/>
+          <w:shd w:fill="EEF2F6"/>
+        </w:rPr>
+        <w:t>SUPABASE_DELETE_EXPIRED=true</w:t>
+      </w:r>
+      <w:r>
+        <w:rPr>
+          <w:rFonts w:ascii="Calibri" w:hAnsi="Calibri"/>
+        </w:rPr>
+        <w:t xml:space="preserve">, la publicación invoca </w:t>
+      </w:r>
+      <w:r>
+        <w:rPr>
+          <w:rFonts w:ascii="Consolas" w:hAnsi="Consolas"/>
+          <w:color w:val="1F4D78"/>
+          <w:sz w:val="19"/>
+          <w:shd w:fill="EEF2F6"/>
+        </w:rPr>
+        <w:t>cleanup_expired_events()</w:t>
+      </w:r>
+      <w:r>
+        <w:rPr>
+          <w:rFonts w:ascii="Calibri" w:hAnsi="Calibri"/>
+        </w:rPr>
+        <w:t xml:space="preserve"> después de la conciliación. Es una función PostgreSQL invocable por RPC, no un trigger ni un </w:t>
+      </w:r>
+      <w:r>
+        <w:rPr>
+          <w:rFonts w:ascii="Consolas" w:hAnsi="Consolas"/>
+          <w:color w:val="1F4D78"/>
+          <w:sz w:val="19"/>
+          <w:shd w:fill="EEF2F6"/>
+        </w:rPr>
+        <w:t>PROCEDURE</w:t>
+      </w:r>
+      <w:r>
+        <w:rPr>
+          <w:rFonts w:ascii="Calibri" w:hAnsi="Calibri"/>
+        </w:rPr>
+        <w:t xml:space="preserve"> que requiera </w:t>
+      </w:r>
+      <w:r>
+        <w:rPr>
+          <w:rFonts w:ascii="Consolas" w:hAnsi="Consolas"/>
+          <w:color w:val="1F4D78"/>
+          <w:sz w:val="19"/>
+          <w:shd w:fill="EEF2F6"/>
+        </w:rPr>
+        <w:t>CALL</w:t>
+      </w:r>
+      <w:r>
+        <w:rPr>
+          <w:rFonts w:ascii="Calibri" w:hAnsi="Calibri"/>
+        </w:rPr>
+        <w:t xml:space="preserve">. Su reloj de referencia es </w:t>
+      </w:r>
+      <w:r>
+        <w:rPr>
+          <w:rFonts w:ascii="Consolas" w:hAnsi="Consolas"/>
+          <w:color w:val="1F4D78"/>
+          <w:sz w:val="19"/>
+          <w:shd w:fill="EEF2F6"/>
+        </w:rPr>
+        <w:t>now()</w:t>
+      </w:r>
+      <w:r>
+        <w:rPr>
+          <w:rFonts w:ascii="Calibri" w:hAnsi="Calibri"/>
+        </w:rPr>
+        <w:t xml:space="preserve"> del servidor, correspondiente al inicio de la transacción. La firma antigua de publicación conserva </w:t>
+      </w:r>
+      <w:r>
+        <w:rPr>
+          <w:rFonts w:ascii="Consolas" w:hAnsi="Consolas"/>
+          <w:color w:val="1F4D78"/>
+          <w:sz w:val="19"/>
+          <w:shd w:fill="EEF2F6"/>
+        </w:rPr>
+        <w:t>p_current_time</w:t>
+      </w:r>
+      <w:r>
+        <w:rPr>
+          <w:rFonts w:ascii="Calibri" w:hAnsi="Calibri"/>
+        </w:rPr>
+        <w:t xml:space="preserve"> y </w:t>
+      </w:r>
+      <w:r>
+        <w:rPr>
+          <w:rFonts w:ascii="Consolas" w:hAnsi="Consolas"/>
+          <w:color w:val="1F4D78"/>
+          <w:sz w:val="19"/>
+          <w:shd w:fill="EEF2F6"/>
+        </w:rPr>
+        <w:t>p_day_start</w:t>
+      </w:r>
+      <w:r>
+        <w:rPr>
+          <w:rFonts w:ascii="Calibri" w:hAnsi="Calibri"/>
+        </w:rPr>
+        <w:t xml:space="preserve"> por compatibilidad, pero ya no los utiliza para decidir el vencimiento.</w:t>
+      </w:r>
+    </w:p>
+    <w:p>
+      <w:pPr>
+        <w:numPr>
+          <w:ilvl w:val="0"/>
+          <w:numId w:val="10"/>
+        </w:numPr>
+      </w:pPr>
+      <w:r>
+        <w:rPr>
+          <w:rFonts w:ascii="Calibri" w:hAnsi="Calibri"/>
+        </w:rPr>
+        <w:t xml:space="preserve">Si existe </w:t>
+      </w:r>
+      <w:r>
+        <w:rPr>
+          <w:rFonts w:ascii="Consolas" w:hAnsi="Consolas"/>
+          <w:color w:val="1F4D78"/>
+          <w:sz w:val="19"/>
+          <w:shd w:fill="EEF2F6"/>
+        </w:rPr>
+        <w:t>end_at</w:t>
+      </w:r>
+      <w:r>
+        <w:rPr>
+          <w:rFonts w:ascii="Calibri" w:hAnsi="Calibri"/>
+        </w:rPr>
+        <w:t xml:space="preserve">, elimina solo cuando </w:t>
+      </w:r>
+      <w:r>
+        <w:rPr>
+          <w:rFonts w:ascii="Consolas" w:hAnsi="Consolas"/>
+          <w:color w:val="1F4D78"/>
+          <w:sz w:val="19"/>
+          <w:shd w:fill="EEF2F6"/>
+        </w:rPr>
+        <w:t>end_at &lt; now()</w:t>
+      </w:r>
+      <w:r>
+        <w:rPr>
+          <w:rFonts w:ascii="Calibri" w:hAnsi="Calibri"/>
+        </w:rPr>
+        <w:t>.</w:t>
+      </w:r>
+    </w:p>
+    <w:p>
+      <w:pPr>
+        <w:numPr>
+          <w:ilvl w:val="0"/>
+          <w:numId w:val="10"/>
+        </w:numPr>
+      </w:pPr>
+      <w:r>
+        <w:rPr>
+          <w:rFonts w:ascii="Calibri" w:hAnsi="Calibri"/>
+        </w:rPr>
+        <w:t xml:space="preserve">Si no existe </w:t>
+      </w:r>
+      <w:r>
+        <w:rPr>
+          <w:rFonts w:ascii="Consolas" w:hAnsi="Consolas"/>
+          <w:color w:val="1F4D78"/>
+          <w:sz w:val="19"/>
+          <w:shd w:fill="EEF2F6"/>
+        </w:rPr>
+        <w:t>end_at</w:t>
+      </w:r>
+      <w:r>
+        <w:rPr>
+          <w:rFonts w:ascii="Calibri" w:hAnsi="Calibri"/>
+        </w:rPr>
+        <w:t xml:space="preserve">, elimina solo cuando </w:t>
+      </w:r>
+      <w:r>
+        <w:rPr>
+          <w:rFonts w:ascii="Consolas" w:hAnsi="Consolas"/>
+          <w:color w:val="1F4D78"/>
+          <w:sz w:val="19"/>
+          <w:shd w:fill="EEF2F6"/>
+        </w:rPr>
+        <w:t>start_at</w:t>
+      </w:r>
+      <w:r>
+        <w:rPr>
+          <w:rFonts w:ascii="Calibri" w:hAnsi="Calibri"/>
+        </w:rPr>
+        <w:t xml:space="preserve"> es anterior al comienzo del día actual en </w:t>
+      </w:r>
+      <w:r>
+        <w:rPr>
+          <w:rFonts w:ascii="Consolas" w:hAnsi="Consolas"/>
+          <w:color w:val="1F4D78"/>
+          <w:sz w:val="19"/>
+          <w:shd w:fill="EEF2F6"/>
+        </w:rPr>
+        <w:t>America/Santiago</w:t>
+      </w:r>
+      <w:r>
+        <w:rPr>
+          <w:rFonts w:ascii="Calibri" w:hAnsi="Calibri"/>
+        </w:rPr>
+        <w:t>; conserva un evento sin término durante todo su día local.</w:t>
+      </w:r>
+    </w:p>
+    <w:p>
+      <w:pPr>
+        <w:numPr>
+          <w:ilvl w:val="0"/>
+          <w:numId w:val="10"/>
+        </w:numPr>
+      </w:pPr>
+      <w:r>
+        <w:rPr>
+          <w:rFonts w:ascii="Calibri" w:hAnsi="Calibri"/>
+        </w:rPr>
+        <w:t xml:space="preserve">Requiere </w:t>
+      </w:r>
+      <w:r>
+        <w:rPr>
+          <w:rFonts w:ascii="Consolas" w:hAnsi="Consolas"/>
+          <w:color w:val="1F4D78"/>
+          <w:sz w:val="19"/>
+          <w:shd w:fill="EEF2F6"/>
+        </w:rPr>
+        <w:t>start_at</w:t>
+      </w:r>
+      <w:r>
+        <w:rPr>
+          <w:rFonts w:ascii="Calibri" w:hAnsi="Calibri"/>
+        </w:rPr>
+        <w:t xml:space="preserve"> no nulo y una cronología coherente: </w:t>
+      </w:r>
+      <w:r>
+        <w:rPr>
+          <w:rFonts w:ascii="Consolas" w:hAnsi="Consolas"/>
+          <w:color w:val="1F4D78"/>
+          <w:sz w:val="19"/>
+          <w:shd w:fill="EEF2F6"/>
+        </w:rPr>
+        <w:t>end_at</w:t>
+      </w:r>
+      <w:r>
+        <w:rPr>
+          <w:rFonts w:ascii="Calibri" w:hAnsi="Calibri"/>
+        </w:rPr>
+        <w:t xml:space="preserve"> nulo o mayor o igual al inicio.</w:t>
+      </w:r>
+    </w:p>
+    <w:p>
+      <w:pPr>
+        <w:numPr>
+          <w:ilvl w:val="0"/>
+          <w:numId w:val="10"/>
+        </w:numPr>
+      </w:pPr>
+      <w:r>
+        <w:rPr>
+          <w:rFonts w:ascii="Calibri" w:hAnsi="Calibri"/>
+        </w:rPr>
+        <w:t>Conserva cualquier evento suprimido o con al menos una interacción de usuario, positiva o negativa. No distingue entre creación manual y extracción para evaluar el vencimiento.</w:t>
+      </w:r>
+    </w:p>
+    <w:p>
+      <w:pPr>
+        <w:numPr>
+          <w:ilvl w:val="0"/>
+          <w:numId w:val="10"/>
+        </w:numPr>
+      </w:pPr>
+      <w:r>
+        <w:rPr>
+          <w:rFonts w:ascii="Calibri" w:hAnsi="Calibri"/>
+        </w:rPr>
+        <w:t>Las categorías asociadas, los medios y la procedencia se eliminan por las cascadas existentes.</w:t>
+      </w:r>
+    </w:p>
+    <w:p>
+      <w:r>
+        <w:rPr>
+          <w:rFonts w:ascii="Calibri" w:hAnsi="Calibri"/>
+        </w:rPr>
+        <w:t xml:space="preserve">La función devuelve el número de eventos borrados y una segunda llamada sin cambios devuelve cero. Aplica un bloqueo </w:t>
+      </w:r>
+      <w:r>
+        <w:rPr>
+          <w:rFonts w:ascii="Consolas" w:hAnsi="Consolas"/>
+          <w:color w:val="1F4D78"/>
+          <w:sz w:val="19"/>
+          <w:shd w:fill="EEF2F6"/>
+        </w:rPr>
+        <w:t>SHARE</w:t>
+      </w:r>
+      <w:r>
+        <w:rPr>
+          <w:rFonts w:ascii="Calibri" w:hAnsi="Calibri"/>
+        </w:rPr>
+        <w:t xml:space="preserve"> sobre </w:t>
+      </w:r>
+      <w:r>
+        <w:rPr>
+          <w:rFonts w:ascii="Consolas" w:hAnsi="Consolas"/>
+          <w:color w:val="1F4D78"/>
+          <w:sz w:val="19"/>
+          <w:shd w:fill="EEF2F6"/>
+        </w:rPr>
+        <w:t>user_event_interactions</w:t>
+      </w:r>
+      <w:r>
+        <w:rPr>
+          <w:rFonts w:ascii="Calibri" w:hAnsi="Calibri"/>
+        </w:rPr>
+        <w:t xml:space="preserve"> para impedir que una interacción concurrente se pierda durante la comprobación y el borrado. El tiempo de espera de bloqueos se limita a cinco segundos. Las inserciones de interacciones pueden esperar mientras dure la transacción de publicación; ante contención no resuelta, la operación falla y se revierte.</w:t>
+      </w:r>
+    </w:p>
+    <w:p>
+      <w:pPr>
+        <w:pStyle w:val="Heading2"/>
+      </w:pPr>
+      <w:r>
+        <w:t>Reglas de conciliación por ausencia</w:t>
+      </w:r>
+    </w:p>
+    <w:p>
+      <w:r>
+        <w:rPr>
+          <w:rFonts w:ascii="Calibri" w:hAnsi="Calibri"/>
+        </w:rPr>
+        <w:t xml:space="preserve">Con </w:t>
+      </w:r>
+      <w:r>
+        <w:rPr>
+          <w:rFonts w:ascii="Consolas" w:hAnsi="Consolas"/>
+          <w:color w:val="1F4D78"/>
+          <w:sz w:val="19"/>
+          <w:shd w:fill="EEF2F6"/>
+        </w:rPr>
+        <w:t>SUPABASE_RECONCILE_STALE=true</w:t>
+      </w:r>
+      <w:r>
+        <w:rPr>
+          <w:rFonts w:ascii="Calibri" w:hAnsi="Calibri"/>
+        </w:rPr>
+        <w:t xml:space="preserve">, la publicación retira filas de las fuentes autorizadas para conciliar cuyo </w:t>
+      </w:r>
+      <w:r>
+        <w:rPr>
+          <w:rFonts w:ascii="Consolas" w:hAnsi="Consolas"/>
+          <w:color w:val="1F4D78"/>
+          <w:sz w:val="19"/>
+          <w:shd w:fill="EEF2F6"/>
+        </w:rPr>
+        <w:t>last_seen_at</w:t>
+      </w:r>
+      <w:r>
+        <w:rPr>
+          <w:rFonts w:ascii="Calibri" w:hAnsi="Calibri"/>
+        </w:rPr>
+        <w:t xml:space="preserve"> es anterior a </w:t>
+      </w:r>
+      <w:r>
+        <w:rPr>
+          <w:rFonts w:ascii="Consolas" w:hAnsi="Consolas"/>
+          <w:color w:val="1F4D78"/>
+          <w:sz w:val="19"/>
+          <w:shd w:fill="EEF2F6"/>
+        </w:rPr>
+        <w:t>p_seen_at</w:t>
+      </w:r>
+      <w:r>
+        <w:rPr>
+          <w:rFonts w:ascii="Calibri" w:hAnsi="Calibri"/>
+        </w:rPr>
+        <w:t xml:space="preserve">. Además exige procedencia en </w:t>
+      </w:r>
+      <w:r>
+        <w:rPr>
+          <w:rFonts w:ascii="Consolas" w:hAnsi="Consolas"/>
+          <w:color w:val="1F4D78"/>
+          <w:sz w:val="19"/>
+          <w:shd w:fill="EEF2F6"/>
+        </w:rPr>
+        <w:t>event_provenance</w:t>
+      </w:r>
+      <w:r>
+        <w:rPr>
+          <w:rFonts w:ascii="Calibri" w:hAnsi="Calibri"/>
+        </w:rPr>
+        <w:t xml:space="preserve">, un método distinto de </w:t>
+      </w:r>
+      <w:r>
+        <w:rPr>
+          <w:rFonts w:ascii="Consolas" w:hAnsi="Consolas"/>
+          <w:color w:val="1F4D78"/>
+          <w:sz w:val="19"/>
+          <w:shd w:fill="EEF2F6"/>
+        </w:rPr>
+        <w:t>manual</w:t>
+      </w:r>
+      <w:r>
+        <w:rPr>
+          <w:rFonts w:ascii="Calibri" w:hAnsi="Calibri"/>
+        </w:rPr>
+        <w:t>, ausencia de supresión y ausencia de interacciones. Los eventos manuales no desaparecen por faltar en una página extraída.</w:t>
+      </w:r>
+    </w:p>
+    <w:p>
+      <w:r>
+        <w:rPr>
+          <w:rFonts w:ascii="Calibri" w:hAnsi="Calibri"/>
+        </w:rPr>
+        <w:t>Una fuente completa o vacía de forma confirmada puede autorizar esta conciliación; una fuente parcial o fallida no la autoriza. Las fuentes retiradas explícitamente en configuración también pueden conciliarse. Esta regla es independiente del vencimiento: una ficha ausente puede retirarse aunque tuviera fecha futura. Ambas rutas de borrado son parte de la misma transacción; si falla cualquier paso, se revierten publicación, relaciones y borrados, y se conserva staging.</w:t>
       </w:r>
     </w:p>
     <w:p>
@@ -25427,7 +26737,95 @@
           <w:color w:val="17324D"/>
           <w:sz w:val="17"/>
         </w:rPr>
-        <w:t xml:space="preserve">  and (end_at &gt;= now() or (end_at is null and start_at &gt;= now()))</w:t>
+        <w:t xml:space="preserve">  and start_at is not null</w:t>
+      </w:r>
+      <w:r>
+        <w:br/>
+      </w:r>
+      <w:r>
+        <w:rPr>
+          <w:rFonts w:ascii="Consolas" w:hAnsi="Consolas"/>
+          <w:color w:val="17324D"/>
+          <w:sz w:val="17"/>
+        </w:rPr>
+        <w:t xml:space="preserve">  and not is_suppressed</w:t>
+      </w:r>
+      <w:r>
+        <w:br/>
+      </w:r>
+      <w:r>
+        <w:rPr>
+          <w:rFonts w:ascii="Consolas" w:hAnsi="Consolas"/>
+          <w:color w:val="17324D"/>
+          <w:sz w:val="17"/>
+        </w:rPr>
+        <w:t xml:space="preserve">  and (end_at is null or end_at &gt;= start_at)</w:t>
+      </w:r>
+      <w:r>
+        <w:br/>
+      </w:r>
+      <w:r>
+        <w:rPr>
+          <w:rFonts w:ascii="Consolas" w:hAnsi="Consolas"/>
+          <w:color w:val="17324D"/>
+          <w:sz w:val="17"/>
+        </w:rPr>
+        <w:t xml:space="preserve">  and (</w:t>
+      </w:r>
+      <w:r>
+        <w:br/>
+      </w:r>
+      <w:r>
+        <w:rPr>
+          <w:rFonts w:ascii="Consolas" w:hAnsi="Consolas"/>
+          <w:color w:val="17324D"/>
+          <w:sz w:val="17"/>
+        </w:rPr>
+        <w:t xml:space="preserve">    end_at &gt;= now()</w:t>
+      </w:r>
+      <w:r>
+        <w:br/>
+      </w:r>
+      <w:r>
+        <w:rPr>
+          <w:rFonts w:ascii="Consolas" w:hAnsi="Consolas"/>
+          <w:color w:val="17324D"/>
+          <w:sz w:val="17"/>
+        </w:rPr>
+        <w:t xml:space="preserve">    or (end_at is null and start_at &gt;=</w:t>
+      </w:r>
+      <w:r>
+        <w:br/>
+      </w:r>
+      <w:r>
+        <w:rPr>
+          <w:rFonts w:ascii="Consolas" w:hAnsi="Consolas"/>
+          <w:color w:val="17324D"/>
+          <w:sz w:val="17"/>
+        </w:rPr>
+        <w:t xml:space="preserve">      (date_trunc('day', now() at time zone 'America/Santiago')</w:t>
+      </w:r>
+      <w:r>
+        <w:br/>
+      </w:r>
+      <w:r>
+        <w:rPr>
+          <w:rFonts w:ascii="Consolas" w:hAnsi="Consolas"/>
+          <w:color w:val="17324D"/>
+          <w:sz w:val="17"/>
+        </w:rPr>
+        <w:t xml:space="preserve">        at time zone 'America/Santiago'))</w:t>
+      </w:r>
+      <w:r>
+        <w:br/>
+      </w:r>
+      <w:r>
+        <w:rPr>
+          <w:rFonts w:ascii="Consolas" w:hAnsi="Consolas"/>
+          <w:color w:val="17324D"/>
+          <w:sz w:val="17"/>
+        </w:rPr>
+        <w:t xml:space="preserve">  )</w:t>
       </w:r>
       <w:r>
         <w:br/>
@@ -25677,10 +27075,227 @@
     </w:p>
     <w:p>
       <w:pPr>
+        <w:pStyle w:val="Heading2"/>
+      </w:pPr>
+      <w:r>
+        <w:t>Borrados registrados por sincronización</w:t>
+      </w:r>
+    </w:p>
+    <w:p>
+      <w:pPr>
+        <w:spacing w:before="60" w:after="160" w:line="252" w:lineRule="auto"/>
+        <w:ind w:left="216" w:right="216"/>
+        <w:shd w:fill="F1F3F5"/>
+      </w:pPr>
+      <w:r>
+        <w:rPr>
+          <w:rFonts w:ascii="Consolas" w:hAnsi="Consolas"/>
+          <w:color w:val="17324D"/>
+          <w:sz w:val="17"/>
+        </w:rPr>
+        <w:t>select started_at, status, events_count,</w:t>
+      </w:r>
+      <w:r>
+        <w:br/>
+      </w:r>
+      <w:r>
+        <w:rPr>
+          <w:rFonts w:ascii="Consolas" w:hAnsi="Consolas"/>
+          <w:color w:val="17324D"/>
+          <w:sz w:val="17"/>
+        </w:rPr>
+        <w:t xml:space="preserve">       metadata -&gt;&gt; 'removed_stale' as removed_stale,</w:t>
+      </w:r>
+      <w:r>
+        <w:br/>
+      </w:r>
+      <w:r>
+        <w:rPr>
+          <w:rFonts w:ascii="Consolas" w:hAnsi="Consolas"/>
+          <w:color w:val="17324D"/>
+          <w:sz w:val="17"/>
+        </w:rPr>
+        <w:t xml:space="preserve">       metadata -&gt;&gt; 'removed_expired' as removed_expired</w:t>
+      </w:r>
+      <w:r>
+        <w:br/>
+      </w:r>
+      <w:r>
+        <w:rPr>
+          <w:rFonts w:ascii="Consolas" w:hAnsi="Consolas"/>
+          <w:color w:val="17324D"/>
+          <w:sz w:val="17"/>
+        </w:rPr>
+        <w:t>from public.scrape_runs</w:t>
+      </w:r>
+      <w:r>
+        <w:br/>
+      </w:r>
+      <w:r>
+        <w:rPr>
+          <w:rFonts w:ascii="Consolas" w:hAnsi="Consolas"/>
+          <w:color w:val="17324D"/>
+          <w:sz w:val="17"/>
+        </w:rPr>
+        <w:t>order by started_at desc</w:t>
+      </w:r>
+      <w:r>
+        <w:br/>
+      </w:r>
+      <w:r>
+        <w:rPr>
+          <w:rFonts w:ascii="Consolas" w:hAnsi="Consolas"/>
+          <w:color w:val="17324D"/>
+          <w:sz w:val="17"/>
+        </w:rPr>
+        <w:t>limit 20;</w:t>
+      </w:r>
+    </w:p>
+    <w:p>
+      <w:r>
+        <w:rPr>
+          <w:rFonts w:ascii="Calibri" w:hAnsi="Calibri"/>
+        </w:rPr>
+        <w:t xml:space="preserve">Esta consulta es administrativa; </w:t>
+      </w:r>
+      <w:r>
+        <w:rPr>
+          <w:rFonts w:ascii="Consolas" w:hAnsi="Consolas"/>
+          <w:color w:val="1F4D78"/>
+          <w:sz w:val="19"/>
+          <w:shd w:fill="EEF2F6"/>
+        </w:rPr>
+        <w:t>scrape_runs</w:t>
+      </w:r>
+      <w:r>
+        <w:rPr>
+          <w:rFonts w:ascii="Calibri" w:hAnsi="Calibri"/>
+        </w:rPr>
+        <w:t xml:space="preserve"> no tiene lectura pública.</w:t>
+      </w:r>
+    </w:p>
+    <w:p>
+      <w:pPr>
         <w:pStyle w:val="Heading1"/>
       </w:pPr>
       <w:r>
-        <w:t>10. Limitaciones conocidas</w:t>
+        <w:t>10. Validación de migraciones</w:t>
+      </w:r>
+    </w:p>
+    <w:p>
+      <w:r>
+        <w:rPr>
+          <w:rFonts w:ascii="Consolas" w:hAnsi="Consolas"/>
+          <w:color w:val="1F4D78"/>
+          <w:sz w:val="19"/>
+          <w:shd w:fill="EEF2F6"/>
+        </w:rPr>
+        <w:t>tools/test_database.sh</w:t>
+      </w:r>
+      <w:r>
+        <w:rPr>
+          <w:rFonts w:ascii="Calibri" w:hAnsi="Calibri"/>
+        </w:rPr>
+        <w:t xml:space="preserve"> instala todas las migraciones ordenadas y ejecuta los archivos SQL de </w:t>
+      </w:r>
+      <w:r>
+        <w:rPr>
+          <w:rFonts w:ascii="Consolas" w:hAnsi="Consolas"/>
+          <w:color w:val="1F4D78"/>
+          <w:sz w:val="19"/>
+          <w:shd w:fill="EEF2F6"/>
+        </w:rPr>
+        <w:t>supabase/tests/</w:t>
+      </w:r>
+      <w:r>
+        <w:rPr>
+          <w:rFonts w:ascii="Calibri" w:hAnsi="Calibri"/>
+        </w:rPr>
+        <w:t xml:space="preserve"> sobre una base temporal vacía llamada </w:t>
+      </w:r>
+      <w:r>
+        <w:rPr>
+          <w:rFonts w:ascii="Consolas" w:hAnsi="Consolas"/>
+          <w:color w:val="1F4D78"/>
+          <w:sz w:val="19"/>
+          <w:shd w:fill="EEF2F6"/>
+        </w:rPr>
+        <w:t>eventos_test</w:t>
+      </w:r>
+      <w:r>
+        <w:rPr>
+          <w:rFonts w:ascii="Calibri" w:hAnsi="Calibri"/>
+        </w:rPr>
+        <w:t xml:space="preserve">. El fixture mínimo de Auth simula usuarios y roles para probar el catálogo; no valida el servicio Supabase Auth real. El script no lee </w:t>
+      </w:r>
+      <w:r>
+        <w:rPr>
+          <w:rFonts w:ascii="Consolas" w:hAnsi="Consolas"/>
+          <w:color w:val="1F4D78"/>
+          <w:sz w:val="19"/>
+          <w:shd w:fill="EEF2F6"/>
+        </w:rPr>
+        <w:t>.env</w:t>
+      </w:r>
+      <w:r>
+        <w:rPr>
+          <w:rFonts w:ascii="Calibri" w:hAnsi="Calibri"/>
+        </w:rPr>
+        <w:t>. Nunca se debe apuntar a la base de producción.</w:t>
+      </w:r>
+    </w:p>
+    <w:p>
+      <w:r>
+        <w:rPr>
+          <w:rFonts w:ascii="Calibri" w:hAnsi="Calibri"/>
+        </w:rPr>
+        <w:t xml:space="preserve">Las pruebas cubren vencimiento con y sin término, día local chileno, fechas incoherentes, supresiones, señales positivas y negativas, cascadas, idempotencia, permisos privados, búsqueda por clave/URL, lotes de 1.205 candidatos y rollback de publicación después de un fallo forzado. El workflow añade un trabajo </w:t>
+      </w:r>
+      <w:r>
+        <w:rPr>
+          <w:rFonts w:ascii="Consolas" w:hAnsi="Consolas"/>
+          <w:color w:val="1F4D78"/>
+          <w:sz w:val="19"/>
+          <w:shd w:fill="EEF2F6"/>
+        </w:rPr>
+        <w:t>validate</w:t>
+      </w:r>
+      <w:r>
+        <w:rPr>
+          <w:rFonts w:ascii="Calibri" w:hAnsi="Calibri"/>
+        </w:rPr>
+        <w:t xml:space="preserve"> con PostgreSQL 17 temporal y exige su éxito antes de ejecutar </w:t>
+      </w:r>
+      <w:r>
+        <w:rPr>
+          <w:rFonts w:ascii="Consolas" w:hAnsi="Consolas"/>
+          <w:color w:val="1F4D78"/>
+          <w:sz w:val="19"/>
+          <w:shd w:fill="EEF2F6"/>
+        </w:rPr>
+        <w:t>scrape</w:t>
+      </w:r>
+      <w:r>
+        <w:rPr>
+          <w:rFonts w:ascii="Calibri" w:hAnsi="Calibri"/>
+        </w:rPr>
+        <w:t>. No aplica migraciones remotas automáticamente en cada ejecución.</w:t>
+      </w:r>
+    </w:p>
+    <w:p>
+      <w:r>
+        <w:rPr>
+          <w:rFonts w:ascii="Calibri" w:hAnsi="Calibri"/>
+        </w:rPr>
+        <w:t>El 20 de octubre se verificaron localmente las nueve migraciones y las tres suites SQL en PostgreSQL embebido mediante PGlite, con zonas UTC, Santiago y Tokio. Pasaron también las 144 pruebas de Python, incluida la comprobación de que este diccionario referencia todas las migraciones versionadas. Esto no sustituye la primera ejecución del nuevo trabajo en GitHub Actions con PostgreSQL 17; su resultado se consulta en el workflow después del push.</w:t>
+      </w:r>
+    </w:p>
+    <w:p>
+      <w:pPr>
+        <w:pStyle w:val="Heading1"/>
+      </w:pPr>
+      <w:r>
+        <w:t>11. Limitaciones conocidas</w:t>
       </w:r>
     </w:p>
     <w:p>
@@ -25782,52 +27397,21 @@
         <w:rPr>
           <w:rFonts w:ascii="Calibri" w:hAnsi="Calibri"/>
         </w:rPr>
-        <w:t xml:space="preserve">Cada sincronización elimina físicamente los eventos cuyo </w:t>
+        <w:t>La limpieza conserva eventos con interacciones para no perder señales del recomendador. Esta protección es temporal: antes de eliminarlos habrá que desacoplar o agregar esas señales. Conservar una fila no implica que esté vigente; el frontend debe filtrar fechas en sus consultas.</w:t>
       </w:r>
-      <w:r>
-        <w:rPr>
-          <w:rFonts w:ascii="Consolas" w:hAnsi="Consolas"/>
-          <w:color w:val="1F4D78"/>
-          <w:sz w:val="19"/>
-          <w:shd w:fill="EEF2F6"/>
-        </w:rPr>
-        <w:t>end_at</w:t>
-      </w:r>
+    </w:p>
+    <w:p>
+      <w:pPr>
+        <w:numPr>
+          <w:ilvl w:val="0"/>
+          <w:numId w:val="10"/>
+        </w:numPr>
+      </w:pPr>
       <w:r>
         <w:rPr>
           <w:rFonts w:ascii="Calibri" w:hAnsi="Calibri"/>
         </w:rPr>
-        <w:t xml:space="preserve"> ya pasó. Cuando </w:t>
-      </w:r>
-      <w:r>
-        <w:rPr>
-          <w:rFonts w:ascii="Consolas" w:hAnsi="Consolas"/>
-          <w:color w:val="1F4D78"/>
-          <w:sz w:val="19"/>
-          <w:shd w:fill="EEF2F6"/>
-        </w:rPr>
-        <w:t>end_at</w:t>
-      </w:r>
-      <w:r>
-        <w:rPr>
-          <w:rFonts w:ascii="Calibri" w:hAnsi="Calibri"/>
-        </w:rPr>
-        <w:t xml:space="preserve"> es nulo, se utiliza </w:t>
-      </w:r>
-      <w:r>
-        <w:rPr>
-          <w:rFonts w:ascii="Consolas" w:hAnsi="Consolas"/>
-          <w:color w:val="1F4D78"/>
-          <w:sz w:val="19"/>
-          <w:shd w:fill="EEF2F6"/>
-        </w:rPr>
-        <w:t>start_at</w:t>
-      </w:r>
-      <w:r>
-        <w:rPr>
-          <w:rFonts w:ascii="Calibri" w:hAnsi="Calibri"/>
-        </w:rPr>
-        <w:t>; las relaciones dependientes se eliminan en cascada. Los registros sin inicio válido no entran al catálogo.</w:t>
+        <w:t>Las supresiones y las fechas incompletas o incoherentes se conservan para control o revisión; la función no corrige automáticamente fechas erróneas.</w:t>
       </w:r>
     </w:p>
     <w:p>
@@ -26172,6 +27756,54 @@
       </w:rPr>
     </w:lvl>
   </w:abstractNum>
+  <w:abstractNum w:abstractNumId="9">
+    <w:multiLevelType w:val="singleLevel"/>
+    <w:lvl w:ilvl="0">
+      <w:start w:val="1"/>
+      <w:numFmt w:val="bullet"/>
+      <w:lvlText w:val="•"/>
+      <w:lvlJc w:val="left"/>
+      <w:pPr>
+        <w:tabs>
+          <w:tab w:val="num" w:pos="540"/>
+        </w:tabs>
+        <w:ind w:left="540" w:hanging="270"/>
+        <w:spacing w:after="80" w:line="300" w:lineRule="auto"/>
+      </w:pPr>
+    </w:lvl>
+  </w:abstractNum>
+  <w:abstractNum w:abstractNumId="10">
+    <w:multiLevelType w:val="singleLevel"/>
+    <w:lvl w:ilvl="0">
+      <w:start w:val="1"/>
+      <w:numFmt w:val="decimal"/>
+      <w:lvlText w:val="%1."/>
+      <w:lvlJc w:val="left"/>
+      <w:pPr>
+        <w:tabs>
+          <w:tab w:val="num" w:pos="540"/>
+        </w:tabs>
+        <w:ind w:left="540" w:hanging="270"/>
+        <w:spacing w:after="80" w:line="300" w:lineRule="auto"/>
+      </w:pPr>
+    </w:lvl>
+  </w:abstractNum>
+  <w:abstractNum w:abstractNumId="11">
+    <w:multiLevelType w:val="singleLevel"/>
+    <w:lvl w:ilvl="0">
+      <w:start w:val="1"/>
+      <w:numFmt w:val="decimal"/>
+      <w:lvlText w:val="%1."/>
+      <w:lvlJc w:val="left"/>
+      <w:pPr>
+        <w:tabs>
+          <w:tab w:val="num" w:pos="540"/>
+        </w:tabs>
+        <w:ind w:left="540" w:hanging="270"/>
+        <w:spacing w:after="80" w:line="300" w:lineRule="auto"/>
+      </w:pPr>
+    </w:lvl>
+  </w:abstractNum>
   <w:num w:numId="1">
     <w:abstractNumId w:val="8"/>
   </w:num>
@@ -26199,43 +27831,14 @@
   <w:num w:numId="9">
     <w:abstractNumId w:val="0"/>
   </w:num>
-  <w:abstractNum w:abstractNumId="9">
-    <w:multiLevelType w:val="singleLevel"/>
-    <w:lvl w:ilvl="0">
-      <w:start w:val="1"/>
-      <w:numFmt w:val="bullet"/>
-      <w:lvlText w:val="•"/>
-      <w:lvlJc w:val="left"/>
-      <w:pPr>
-        <w:tabs>
-          <w:tab w:val="num" w:pos="540"/>
-        </w:tabs>
-        <w:ind w:left="540" w:hanging="270"/>
-        <w:spacing w:after="80" w:line="300" w:lineRule="auto"/>
-      </w:pPr>
-    </w:lvl>
-  </w:abstractNum>
   <w:num w:numId="10">
     <w:abstractNumId w:val="9"/>
   </w:num>
-  <w:abstractNum w:abstractNumId="10">
-    <w:multiLevelType w:val="singleLevel"/>
-    <w:lvl w:ilvl="0">
-      <w:start w:val="1"/>
-      <w:numFmt w:val="decimal"/>
-      <w:lvlText w:val="%1."/>
-      <w:lvlJc w:val="left"/>
-      <w:pPr>
-        <w:tabs>
-          <w:tab w:val="num" w:pos="540"/>
-        </w:tabs>
-        <w:ind w:left="540" w:hanging="270"/>
-        <w:spacing w:after="80" w:line="300" w:lineRule="auto"/>
-      </w:pPr>
-    </w:lvl>
-  </w:abstractNum>
   <w:num w:numId="11">
     <w:abstractNumId w:val="10"/>
+  </w:num>
+  <w:num w:numId="12">
+    <w:abstractNumId w:val="11"/>
   </w:num>
 </w:numbering>
 </file>

</xml_diff>

<commit_message>
fix: normaliza clasificacion cultural y prepara reclasificacion del catalogo
</commit_message>
<xml_diff>
--- a/docs/Documentacion_Base_de_Datos_Eventos_Culturales.docx
+++ b/docs/Documentacion_Base_de_Datos_Eventos_Culturales.docx
@@ -75,7 +75,7 @@
           <w:color w:val="5E6B78"/>
           <w:sz w:val="21"/>
         </w:rPr>
-        <w:t>Versión documentada: 20 de octubre de 2026</w:t>
+        <w:t>Versión documentada: 27 de octubre de 2026</w:t>
       </w:r>
     </w:p>
     <w:p>
@@ -89,7 +89,7 @@
           <w:color w:val="5E6B78"/>
           <w:sz w:val="18"/>
         </w:rPr>
-        <w:t>Migraciones: 20260831000100 · 20260902000100 · 20260911000100 · 20260912000100 · 20260921000100 · 20260924000100 · 20261020000100 · 20261020000200 · 20261020000300</w:t>
+        <w:t>Migraciones: 20260831000100 · 20260902000100 · 20260911000100 · 20260912000100 · 20260921000100 · 20260924000100 · 20261020000100 · 20261020000200 · 20261020000300 · 20261024000100 · 20261027000100</w:t>
       </w:r>
     </w:p>
     <w:p>
@@ -762,7 +762,7 @@
                 <w:rFonts w:ascii="Calibri" w:hAnsi="Calibri"/>
                 <w:sz w:val="18"/>
               </w:rPr>
-              <w:t>20 de octubre de 2026</w:t>
+              <w:t>27 de octubre de 2026</w:t>
             </w:r>
           </w:p>
         </w:tc>
@@ -1259,6 +1259,40 @@
           <w:shd w:fill="EEF2F6"/>
         </w:rPr>
         <w:t>supabase/migrations/20261020000300_integrate_expired_cleanup.sql</w:t>
+      </w:r>
+    </w:p>
+    <w:p>
+      <w:pPr>
+        <w:numPr>
+          <w:ilvl w:val="0"/>
+          <w:numId w:val="10"/>
+        </w:numPr>
+      </w:pPr>
+      <w:r>
+        <w:rPr>
+          <w:rFonts w:ascii="Consolas" w:hAnsi="Consolas"/>
+          <w:color w:val="1F4D78"/>
+          <w:sz w:val="19"/>
+          <w:shd w:fill="EEF2F6"/>
+        </w:rPr>
+        <w:t>supabase/migrations/20261024000100_password_reset_tokens.sql</w:t>
+      </w:r>
+    </w:p>
+    <w:p>
+      <w:pPr>
+        <w:numPr>
+          <w:ilvl w:val="0"/>
+          <w:numId w:val="10"/>
+        </w:numPr>
+      </w:pPr>
+      <w:r>
+        <w:rPr>
+          <w:rFonts w:ascii="Consolas" w:hAnsi="Consolas"/>
+          <w:color w:val="1F4D78"/>
+          <w:sz w:val="19"/>
+          <w:shd w:fill="EEF2F6"/>
+        </w:rPr>
+        <w:t>supabase/migrations/20261027000100_cultural_classification.sql</w:t>
       </w:r>
     </w:p>
     <w:p>
@@ -1902,6 +1936,257 @@
           <w:rFonts w:ascii="Calibri" w:hAnsi="Calibri"/>
         </w:rPr>
         <w:t>Las nueve migraciones locales y remotas quedaron sincronizadas el 20 de octubre. La aplicación de estas migraciones no ejecutó el scraper ni una limpieza sobre el catálogo existente. El nuevo comportamiento se utiliza en la siguiente publicación que termine correctamente.</w:t>
+      </w:r>
+    </w:p>
+    <w:p>
+      <w:pPr>
+        <w:pStyle w:val="Heading2"/>
+      </w:pPr>
+      <w:r>
+        <w:t>Recuperación de contraseñas del 24 de octubre de 2026</w:t>
+      </w:r>
+    </w:p>
+    <w:p>
+      <w:r>
+        <w:rPr>
+          <w:rFonts w:ascii="Calibri" w:hAnsi="Calibri"/>
+        </w:rPr>
+        <w:t xml:space="preserve">La migración </w:t>
+      </w:r>
+      <w:r>
+        <w:rPr>
+          <w:rFonts w:ascii="Consolas" w:hAnsi="Consolas"/>
+          <w:color w:val="1F4D78"/>
+          <w:sz w:val="19"/>
+          <w:shd w:fill="EEF2F6"/>
+        </w:rPr>
+        <w:t>20261024000100_password_reset_tokens.sql</w:t>
+      </w:r>
+      <w:r>
+        <w:rPr>
+          <w:rFonts w:ascii="Calibri" w:hAnsi="Calibri"/>
+        </w:rPr>
+        <w:t xml:space="preserve"> añade una tabla privada de seis columnas para las Edge Functions de recuperación. Mantiene el contrato del SQL de la aplicación y añade una transacción, espera máxima de bloqueos de cinco segundos y permisos explícitos: sin acceso para </w:t>
+      </w:r>
+      <w:r>
+        <w:rPr>
+          <w:rFonts w:ascii="Consolas" w:hAnsi="Consolas"/>
+          <w:color w:val="1F4D78"/>
+          <w:sz w:val="19"/>
+          <w:shd w:fill="EEF2F6"/>
+        </w:rPr>
+        <w:t>PUBLIC</w:t>
+      </w:r>
+      <w:r>
+        <w:rPr>
+          <w:rFonts w:ascii="Calibri" w:hAnsi="Calibri"/>
+        </w:rPr>
+        <w:t xml:space="preserve">, </w:t>
+      </w:r>
+      <w:r>
+        <w:rPr>
+          <w:rFonts w:ascii="Consolas" w:hAnsi="Consolas"/>
+          <w:color w:val="1F4D78"/>
+          <w:sz w:val="19"/>
+          <w:shd w:fill="EEF2F6"/>
+        </w:rPr>
+        <w:t>anon</w:t>
+      </w:r>
+      <w:r>
+        <w:rPr>
+          <w:rFonts w:ascii="Calibri" w:hAnsi="Calibri"/>
+        </w:rPr>
+        <w:t xml:space="preserve"> ni </w:t>
+      </w:r>
+      <w:r>
+        <w:rPr>
+          <w:rFonts w:ascii="Consolas" w:hAnsi="Consolas"/>
+          <w:color w:val="1F4D78"/>
+          <w:sz w:val="19"/>
+          <w:shd w:fill="EEF2F6"/>
+        </w:rPr>
+        <w:t>authenticated</w:t>
+      </w:r>
+      <w:r>
+        <w:rPr>
+          <w:rFonts w:ascii="Calibri" w:hAnsi="Calibri"/>
+        </w:rPr>
+        <w:t xml:space="preserve">; </w:t>
+      </w:r>
+      <w:r>
+        <w:rPr>
+          <w:rFonts w:ascii="Consolas" w:hAnsi="Consolas"/>
+          <w:color w:val="1F4D78"/>
+          <w:sz w:val="19"/>
+          <w:shd w:fill="EEF2F6"/>
+        </w:rPr>
+        <w:t>service_role</w:t>
+      </w:r>
+      <w:r>
+        <w:rPr>
+          <w:rFonts w:ascii="Calibri" w:hAnsi="Calibri"/>
+        </w:rPr>
+        <w:t xml:space="preserve"> dispone de lectura, inserción, actualización y borrado. No modifica eventos, perfiles, contraseñas ni las funciones del scraper.</w:t>
+      </w:r>
+    </w:p>
+    <w:p>
+      <w:r>
+        <w:rPr>
+          <w:rFonts w:ascii="Calibri" w:hAnsi="Calibri"/>
+        </w:rPr>
+        <w:t xml:space="preserve">RLS está activo sin políticas de navegador. El SQL no garantiza por sí solo que un token expire o se consuma una única vez: esos controles pertenecen al backend. La revisión de la función local de confirmación detectó que marca </w:t>
+      </w:r>
+      <w:r>
+        <w:rPr>
+          <w:rFonts w:ascii="Consolas" w:hAnsi="Consolas"/>
+          <w:color w:val="1F4D78"/>
+          <w:sz w:val="19"/>
+          <w:shd w:fill="EEF2F6"/>
+        </w:rPr>
+        <w:t>used_at</w:t>
+      </w:r>
+      <w:r>
+        <w:rPr>
+          <w:rFonts w:ascii="Calibri" w:hAnsi="Calibri"/>
+        </w:rPr>
+        <w:t xml:space="preserve"> después de actualizar la contraseña y no comprueba el error de esa escritura; el consumo atómico y su manejo de fallos requieren una corrección independiente. Instalar la tabla no despliega ni valida el envío de correo.</w:t>
+      </w:r>
+    </w:p>
+    <w:p>
+      <w:pPr>
+        <w:pStyle w:val="Heading2"/>
+      </w:pPr>
+      <w:r>
+        <w:t>Clasificación cultural del 27 de octubre de 2026</w:t>
+      </w:r>
+    </w:p>
+    <w:p>
+      <w:r>
+        <w:rPr>
+          <w:rFonts w:ascii="Calibri" w:hAnsi="Calibri"/>
+        </w:rPr>
+        <w:t xml:space="preserve">La migración </w:t>
+      </w:r>
+      <w:r>
+        <w:rPr>
+          <w:rFonts w:ascii="Consolas" w:hAnsi="Consolas"/>
+          <w:color w:val="1F4D78"/>
+          <w:sz w:val="19"/>
+          <w:shd w:fill="EEF2F6"/>
+        </w:rPr>
+        <w:t>20261027000100_cultural_classification.sql</w:t>
+      </w:r>
+      <w:r>
+        <w:rPr>
+          <w:rFonts w:ascii="Calibri" w:hAnsi="Calibri"/>
+        </w:rPr>
+        <w:t xml:space="preserve"> está preparada y probada localmente; su presencia en el repositorio no acredita que esté aplicada en Supabase. Añade el objeto JSON </w:t>
+      </w:r>
+      <w:r>
+        <w:rPr>
+          <w:rFonts w:ascii="Consolas" w:hAnsi="Consolas"/>
+          <w:color w:val="1F4D78"/>
+          <w:sz w:val="19"/>
+          <w:shd w:fill="EEF2F6"/>
+        </w:rPr>
+        <w:t>event_provenance.classification</w:t>
+      </w:r>
+      <w:r>
+        <w:rPr>
+          <w:rFonts w:ascii="Calibri" w:hAnsi="Calibri"/>
+        </w:rPr>
+        <w:t xml:space="preserve"> y conserva ese objeto durante la publicación atómica. Incluye la RPC privada </w:t>
+      </w:r>
+      <w:r>
+        <w:rPr>
+          <w:rFonts w:ascii="Consolas" w:hAnsi="Consolas"/>
+          <w:color w:val="1F4D78"/>
+          <w:sz w:val="19"/>
+          <w:shd w:fill="EEF2F6"/>
+        </w:rPr>
+        <w:t>apply_catalog_classifications(jsonb,text)</w:t>
+      </w:r>
+      <w:r>
+        <w:rPr>
+          <w:rFonts w:ascii="Calibri" w:hAnsi="Calibri"/>
+        </w:rPr>
+        <w:t xml:space="preserve">, ejecutable solo por </w:t>
+      </w:r>
+      <w:r>
+        <w:rPr>
+          <w:rFonts w:ascii="Consolas" w:hAnsi="Consolas"/>
+          <w:color w:val="1F4D78"/>
+          <w:sz w:val="19"/>
+          <w:shd w:fill="EEF2F6"/>
+        </w:rPr>
+        <w:t>service_role</w:t>
+      </w:r>
+      <w:r>
+        <w:rPr>
+          <w:rFonts w:ascii="Calibri" w:hAnsi="Calibri"/>
+        </w:rPr>
+        <w:t>. Instalarla no reclasifica ni borra eventos. No cambia las políticas de usuarios ni de autenticación.</w:t>
+      </w:r>
+    </w:p>
+    <w:p>
+      <w:r>
+        <w:rPr>
+          <w:rFonts w:ascii="Calibri" w:hAnsi="Calibri"/>
+        </w:rPr>
+        <w:t xml:space="preserve">La taxonomía versionada distingue disciplinas, formatos, públicos y programas; conserva las etiquetas originales y la evidencia. Los directorios de librerías/museos no se consideran eventos. Los casos ambiguos quedan como </w:t>
+      </w:r>
+      <w:r>
+        <w:rPr>
+          <w:rFonts w:ascii="Consolas" w:hAnsi="Consolas"/>
+          <w:color w:val="1F4D78"/>
+          <w:sz w:val="19"/>
+          <w:shd w:fill="EEF2F6"/>
+        </w:rPr>
+        <w:t>draft</w:t>
+      </w:r>
+      <w:r>
+        <w:rPr>
+          <w:rFonts w:ascii="Calibri" w:hAnsi="Calibri"/>
+        </w:rPr>
+        <w:t xml:space="preserve"> y los rechazados se pueden archivar sin borrar filas ni interacciones. La RPC de mantenimiento protege publicaciones manuales, supresiones, organizadores bloqueados, fuentes inactivas y eventos ya cancelados/archivados. No modifica fechas ni textos.</w:t>
+      </w:r>
+    </w:p>
+    <w:p>
+      <w:r>
+        <w:rPr>
+          <w:rFonts w:ascii="Calibri" w:hAnsi="Calibri"/>
+        </w:rPr>
+        <w:t xml:space="preserve">El comando </w:t>
+      </w:r>
+      <w:r>
+        <w:rPr>
+          <w:rFonts w:ascii="Consolas" w:hAnsi="Consolas"/>
+          <w:color w:val="1F4D78"/>
+          <w:sz w:val="19"/>
+          <w:shd w:fill="EEF2F6"/>
+        </w:rPr>
+        <w:t>python -m tools.reclassify_catalog</w:t>
+      </w:r>
+      <w:r>
+        <w:rPr>
+          <w:rFonts w:ascii="Calibri" w:hAnsi="Calibri"/>
+        </w:rPr>
+        <w:t xml:space="preserve"> produce una simulación local sin NVIDIA. Solo </w:t>
+      </w:r>
+      <w:r>
+        <w:rPr>
+          <w:rFonts w:ascii="Consolas" w:hAnsi="Consolas"/>
+          <w:color w:val="1F4D78"/>
+          <w:sz w:val="19"/>
+          <w:shd w:fill="EEF2F6"/>
+        </w:rPr>
+        <w:t>--apply</w:t>
+      </w:r>
+      <w:r>
+        <w:rPr>
+          <w:rFonts w:ascii="Calibri" w:hAnsi="Calibri"/>
+        </w:rPr>
+        <w:t xml:space="preserve"> habilita la escritura después de verificar la migración. Antes de aplicarlo se debe revisar la propuesta, ya que puede reducir considerablemente el catálogo visible. Las categorías sin asociaciones no se borran automáticamente, para no afectar referencias del backend.</w:t>
       </w:r>
     </w:p>
     <w:p>
@@ -2953,6 +3238,61 @@
           </w:p>
         </w:tc>
       </w:tr>
+      <w:tr>
+        <w:trPr>
+          <w:cantSplit/>
+        </w:trPr>
+        <w:tc>
+          <w:tcPr>
+            <w:tcW w:type="dxa" w:w="2700"/>
+            <w:tcMar>
+              <w:top w:w="80" w:type="dxa"/>
+              <w:start w:w="120" w:type="dxa"/>
+              <w:bottom w:w="80" w:type="dxa"/>
+              <w:end w:w="120" w:type="dxa"/>
+            </w:tcMar>
+            <w:vAlign w:val="center"/>
+          </w:tcPr>
+          <w:p>
+            <w:pPr>
+              <w:spacing w:before="0" w:after="0" w:line="259" w:lineRule="auto"/>
+            </w:pPr>
+            <w:r>
+              <w:rPr>
+                <w:rFonts w:ascii="Consolas" w:hAnsi="Consolas"/>
+                <w:color w:val="1F4D78"/>
+                <w:sz w:val="17"/>
+                <w:shd w:fill="EEF2F6"/>
+              </w:rPr>
+              <w:t>password_reset_tokens</w:t>
+            </w:r>
+          </w:p>
+        </w:tc>
+        <w:tc>
+          <w:tcPr>
+            <w:tcW w:type="dxa" w:w="6660"/>
+            <w:tcMar>
+              <w:top w:w="80" w:type="dxa"/>
+              <w:start w:w="120" w:type="dxa"/>
+              <w:bottom w:w="80" w:type="dxa"/>
+              <w:end w:w="120" w:type="dxa"/>
+            </w:tcMar>
+            <w:vAlign w:val="center"/>
+          </w:tcPr>
+          <w:p>
+            <w:pPr>
+              <w:spacing w:before="0" w:after="0" w:line="259" w:lineRule="auto"/>
+            </w:pPr>
+            <w:r>
+              <w:rPr>
+                <w:rFonts w:ascii="Calibri" w:hAnsi="Calibri"/>
+                <w:sz w:val="18"/>
+              </w:rPr>
+              <w:t>Registro privado de identificadores temporales para recuperación de contraseña mediante Edge Functions; no lo procesa el scraper.</w:t>
+            </w:r>
+          </w:p>
+        </w:tc>
+      </w:tr>
     </w:tbl>
     <w:p>
       <w:pPr>
@@ -12805,6 +13145,120 @@
                 <w:sz w:val="17"/>
                 <w:shd w:fill="EEF2F6"/>
               </w:rPr>
+              <w:t>classification</w:t>
+            </w:r>
+          </w:p>
+        </w:tc>
+        <w:tc>
+          <w:tcPr>
+            <w:tcW w:type="dxa" w:w="1400"/>
+            <w:tcMar>
+              <w:top w:w="80" w:type="dxa"/>
+              <w:start w:w="120" w:type="dxa"/>
+              <w:bottom w:w="80" w:type="dxa"/>
+              <w:end w:w="120" w:type="dxa"/>
+            </w:tcMar>
+            <w:vAlign w:val="center"/>
+          </w:tcPr>
+          <w:p>
+            <w:pPr>
+              <w:spacing w:before="0" w:after="0" w:line="259" w:lineRule="auto"/>
+            </w:pPr>
+            <w:r>
+              <w:rPr>
+                <w:rFonts w:ascii="Consolas" w:hAnsi="Consolas"/>
+                <w:color w:val="1F4D78"/>
+                <w:sz w:val="17"/>
+                <w:shd w:fill="EEF2F6"/>
+              </w:rPr>
+              <w:t>jsonb</w:t>
+            </w:r>
+          </w:p>
+        </w:tc>
+        <w:tc>
+          <w:tcPr>
+            <w:tcW w:type="dxa" w:w="1800"/>
+            <w:tcMar>
+              <w:top w:w="80" w:type="dxa"/>
+              <w:start w:w="120" w:type="dxa"/>
+              <w:bottom w:w="80" w:type="dxa"/>
+              <w:end w:w="120" w:type="dxa"/>
+            </w:tcMar>
+            <w:vAlign w:val="center"/>
+          </w:tcPr>
+          <w:p>
+            <w:pPr>
+              <w:spacing w:before="0" w:after="0" w:line="259" w:lineRule="auto"/>
+            </w:pPr>
+            <w:r>
+              <w:rPr>
+                <w:rFonts w:ascii="Calibri" w:hAnsi="Calibri"/>
+                <w:sz w:val="18"/>
+              </w:rPr>
+              <w:t xml:space="preserve">Objeto, predeterminado </w:t>
+            </w:r>
+            <w:r>
+              <w:rPr>
+                <w:rFonts w:ascii="Consolas" w:hAnsi="Consolas"/>
+                <w:color w:val="1F4D78"/>
+                <w:sz w:val="17"/>
+                <w:shd w:fill="EEF2F6"/>
+              </w:rPr>
+              <w:t>{}</w:t>
+            </w:r>
+          </w:p>
+        </w:tc>
+        <w:tc>
+          <w:tcPr>
+            <w:tcW w:type="dxa" w:w="4360"/>
+            <w:tcMar>
+              <w:top w:w="80" w:type="dxa"/>
+              <w:start w:w="120" w:type="dxa"/>
+              <w:bottom w:w="80" w:type="dxa"/>
+              <w:end w:w="120" w:type="dxa"/>
+            </w:tcMar>
+            <w:vAlign w:val="center"/>
+          </w:tcPr>
+          <w:p>
+            <w:pPr>
+              <w:spacing w:before="0" w:after="0" w:line="259" w:lineRule="auto"/>
+            </w:pPr>
+            <w:r>
+              <w:rPr>
+                <w:rFonts w:ascii="Calibri" w:hAnsi="Calibri"/>
+                <w:sz w:val="18"/>
+              </w:rPr>
+              <w:t>Versión, etiquetas originales, disciplinas canónicas, formatos, públicos, programas, evidencia y decisión. Requiere la migración del 27 de octubre.</w:t>
+            </w:r>
+          </w:p>
+        </w:tc>
+      </w:tr>
+      <w:tr>
+        <w:trPr>
+          <w:cantSplit/>
+        </w:trPr>
+        <w:tc>
+          <w:tcPr>
+            <w:tcW w:type="dxa" w:w="1800"/>
+            <w:tcMar>
+              <w:top w:w="80" w:type="dxa"/>
+              <w:start w:w="120" w:type="dxa"/>
+              <w:bottom w:w="80" w:type="dxa"/>
+              <w:end w:w="120" w:type="dxa"/>
+            </w:tcMar>
+            <w:vAlign w:val="center"/>
+          </w:tcPr>
+          <w:p>
+            <w:pPr>
+              <w:spacing w:before="0" w:after="0" w:line="259" w:lineRule="auto"/>
+            </w:pPr>
+            <w:r>
+              <w:rPr>
+                <w:rFonts w:ascii="Consolas" w:hAnsi="Consolas"/>
+                <w:color w:val="1F4D78"/>
+                <w:sz w:val="17"/>
+                <w:shd w:fill="EEF2F6"/>
+              </w:rPr>
               <w:t>updated_at</w:t>
             </w:r>
           </w:p>
@@ -17703,7 +18157,7 @@
         <w:pStyle w:val="Heading2"/>
       </w:pPr>
       <w:r>
-        <w:t>reports</w:t>
+        <w:t>password_reset_tokens</w:t>
       </w:r>
     </w:p>
     <w:p>
@@ -17711,7 +18165,52 @@
         <w:rPr>
           <w:rFonts w:ascii="Calibri" w:hAnsi="Calibri"/>
         </w:rPr>
-        <w:t>Reportes de usuarios sobre un evento, por ejemplo fecha incorrecta, evento cancelado o enlace roto.</w:t>
+        <w:t xml:space="preserve">Tabla privada de soporte a las Edge Functions </w:t>
+      </w:r>
+      <w:r>
+        <w:rPr>
+          <w:rFonts w:ascii="Consolas" w:hAnsi="Consolas"/>
+          <w:color w:val="1F4D78"/>
+          <w:sz w:val="19"/>
+          <w:shd w:fill="EEF2F6"/>
+        </w:rPr>
+        <w:t>reset-password-request</w:t>
+      </w:r>
+      <w:r>
+        <w:rPr>
+          <w:rFonts w:ascii="Calibri" w:hAnsi="Calibri"/>
+        </w:rPr>
+        <w:t xml:space="preserve"> y </w:t>
+      </w:r>
+      <w:r>
+        <w:rPr>
+          <w:rFonts w:ascii="Consolas" w:hAnsi="Consolas"/>
+          <w:color w:val="1F4D78"/>
+          <w:sz w:val="19"/>
+          <w:shd w:fill="EEF2F6"/>
+        </w:rPr>
+        <w:t>reset-password-confirm</w:t>
+      </w:r>
+      <w:r>
+        <w:rPr>
+          <w:rFonts w:ascii="Calibri" w:hAnsi="Calibri"/>
+        </w:rPr>
+        <w:t xml:space="preserve">. No almacena contraseñas ni el JWT firmado completo; almacena su identificador </w:t>
+      </w:r>
+      <w:r>
+        <w:rPr>
+          <w:rFonts w:ascii="Consolas" w:hAnsi="Consolas"/>
+          <w:color w:val="1F4D78"/>
+          <w:sz w:val="19"/>
+          <w:shd w:fill="EEF2F6"/>
+        </w:rPr>
+        <w:t>jti</w:t>
+      </w:r>
+      <w:r>
+        <w:rPr>
+          <w:rFonts w:ascii="Calibri" w:hAnsi="Calibri"/>
+        </w:rPr>
+        <w:t xml:space="preserve"> y el estado operativo. El correo es un dato personal y no se expone al cliente.</w:t>
       </w:r>
     </w:p>
     <w:tbl>
@@ -17880,6 +18379,870 @@
                 <w:sz w:val="17"/>
                 <w:shd w:fill="EEF2F6"/>
               </w:rPr>
+              <w:t>jti</w:t>
+            </w:r>
+          </w:p>
+        </w:tc>
+        <w:tc>
+          <w:tcPr>
+            <w:tcW w:type="dxa" w:w="1400"/>
+            <w:tcMar>
+              <w:top w:w="80" w:type="dxa"/>
+              <w:start w:w="120" w:type="dxa"/>
+              <w:bottom w:w="80" w:type="dxa"/>
+              <w:end w:w="120" w:type="dxa"/>
+            </w:tcMar>
+            <w:vAlign w:val="center"/>
+          </w:tcPr>
+          <w:p>
+            <w:pPr>
+              <w:spacing w:before="0" w:after="0" w:line="259" w:lineRule="auto"/>
+            </w:pPr>
+            <w:r>
+              <w:rPr>
+                <w:rFonts w:ascii="Consolas" w:hAnsi="Consolas"/>
+                <w:color w:val="1F4D78"/>
+                <w:sz w:val="17"/>
+                <w:shd w:fill="EEF2F6"/>
+              </w:rPr>
+              <w:t>uuid</w:t>
+            </w:r>
+          </w:p>
+        </w:tc>
+        <w:tc>
+          <w:tcPr>
+            <w:tcW w:type="dxa" w:w="1800"/>
+            <w:tcMar>
+              <w:top w:w="80" w:type="dxa"/>
+              <w:start w:w="120" w:type="dxa"/>
+              <w:bottom w:w="80" w:type="dxa"/>
+              <w:end w:w="120" w:type="dxa"/>
+            </w:tcMar>
+            <w:vAlign w:val="center"/>
+          </w:tcPr>
+          <w:p>
+            <w:pPr>
+              <w:spacing w:before="0" w:after="0" w:line="259" w:lineRule="auto"/>
+            </w:pPr>
+            <w:r>
+              <w:rPr>
+                <w:rFonts w:ascii="Calibri" w:hAnsi="Calibri"/>
+                <w:sz w:val="18"/>
+              </w:rPr>
+              <w:t>PK obligatoria, sin valor por defecto</w:t>
+            </w:r>
+          </w:p>
+        </w:tc>
+        <w:tc>
+          <w:tcPr>
+            <w:tcW w:type="dxa" w:w="4360"/>
+            <w:tcMar>
+              <w:top w:w="80" w:type="dxa"/>
+              <w:start w:w="120" w:type="dxa"/>
+              <w:bottom w:w="80" w:type="dxa"/>
+              <w:end w:w="120" w:type="dxa"/>
+            </w:tcMar>
+            <w:vAlign w:val="center"/>
+          </w:tcPr>
+          <w:p>
+            <w:pPr>
+              <w:spacing w:before="0" w:after="0" w:line="259" w:lineRule="auto"/>
+            </w:pPr>
+            <w:r>
+              <w:rPr>
+                <w:rFonts w:ascii="Calibri" w:hAnsi="Calibri"/>
+                <w:sz w:val="18"/>
+              </w:rPr>
+              <w:t>Identificador aleatorio generado por el backend para asociar el JWT temporal con una única fila.</w:t>
+            </w:r>
+          </w:p>
+        </w:tc>
+      </w:tr>
+      <w:tr>
+        <w:trPr>
+          <w:cantSplit/>
+        </w:trPr>
+        <w:tc>
+          <w:tcPr>
+            <w:tcW w:type="dxa" w:w="1800"/>
+            <w:tcMar>
+              <w:top w:w="80" w:type="dxa"/>
+              <w:start w:w="120" w:type="dxa"/>
+              <w:bottom w:w="80" w:type="dxa"/>
+              <w:end w:w="120" w:type="dxa"/>
+            </w:tcMar>
+            <w:vAlign w:val="center"/>
+          </w:tcPr>
+          <w:p>
+            <w:pPr>
+              <w:spacing w:before="0" w:after="0" w:line="259" w:lineRule="auto"/>
+            </w:pPr>
+            <w:r>
+              <w:rPr>
+                <w:rFonts w:ascii="Consolas" w:hAnsi="Consolas"/>
+                <w:color w:val="1F4D78"/>
+                <w:sz w:val="17"/>
+                <w:shd w:fill="EEF2F6"/>
+              </w:rPr>
+              <w:t>user_id</w:t>
+            </w:r>
+          </w:p>
+        </w:tc>
+        <w:tc>
+          <w:tcPr>
+            <w:tcW w:type="dxa" w:w="1400"/>
+            <w:tcMar>
+              <w:top w:w="80" w:type="dxa"/>
+              <w:start w:w="120" w:type="dxa"/>
+              <w:bottom w:w="80" w:type="dxa"/>
+              <w:end w:w="120" w:type="dxa"/>
+            </w:tcMar>
+            <w:vAlign w:val="center"/>
+          </w:tcPr>
+          <w:p>
+            <w:pPr>
+              <w:spacing w:before="0" w:after="0" w:line="259" w:lineRule="auto"/>
+            </w:pPr>
+            <w:r>
+              <w:rPr>
+                <w:rFonts w:ascii="Consolas" w:hAnsi="Consolas"/>
+                <w:color w:val="1F4D78"/>
+                <w:sz w:val="17"/>
+                <w:shd w:fill="EEF2F6"/>
+              </w:rPr>
+              <w:t>uuid</w:t>
+            </w:r>
+          </w:p>
+        </w:tc>
+        <w:tc>
+          <w:tcPr>
+            <w:tcW w:type="dxa" w:w="1800"/>
+            <w:tcMar>
+              <w:top w:w="80" w:type="dxa"/>
+              <w:start w:w="120" w:type="dxa"/>
+              <w:bottom w:w="80" w:type="dxa"/>
+              <w:end w:w="120" w:type="dxa"/>
+            </w:tcMar>
+            <w:vAlign w:val="center"/>
+          </w:tcPr>
+          <w:p>
+            <w:pPr>
+              <w:spacing w:before="0" w:after="0" w:line="259" w:lineRule="auto"/>
+            </w:pPr>
+            <w:r>
+              <w:rPr>
+                <w:rFonts w:ascii="Calibri" w:hAnsi="Calibri"/>
+                <w:sz w:val="18"/>
+              </w:rPr>
+              <w:t xml:space="preserve">FK obligatoria → </w:t>
+            </w:r>
+            <w:r>
+              <w:rPr>
+                <w:rFonts w:ascii="Consolas" w:hAnsi="Consolas"/>
+                <w:color w:val="1F4D78"/>
+                <w:sz w:val="17"/>
+                <w:shd w:fill="EEF2F6"/>
+              </w:rPr>
+              <w:t>auth.users.id</w:t>
+            </w:r>
+          </w:p>
+        </w:tc>
+        <w:tc>
+          <w:tcPr>
+            <w:tcW w:type="dxa" w:w="4360"/>
+            <w:tcMar>
+              <w:top w:w="80" w:type="dxa"/>
+              <w:start w:w="120" w:type="dxa"/>
+              <w:bottom w:w="80" w:type="dxa"/>
+              <w:end w:w="120" w:type="dxa"/>
+            </w:tcMar>
+            <w:vAlign w:val="center"/>
+          </w:tcPr>
+          <w:p>
+            <w:pPr>
+              <w:spacing w:before="0" w:after="0" w:line="259" w:lineRule="auto"/>
+            </w:pPr>
+            <w:r>
+              <w:rPr>
+                <w:rFonts w:ascii="Calibri" w:hAnsi="Calibri"/>
+                <w:sz w:val="18"/>
+              </w:rPr>
+              <w:t>Cuenta destinataria; al eliminarla, sus tokens se eliminan en cascada.</w:t>
+            </w:r>
+          </w:p>
+        </w:tc>
+      </w:tr>
+      <w:tr>
+        <w:trPr>
+          <w:cantSplit/>
+        </w:trPr>
+        <w:tc>
+          <w:tcPr>
+            <w:tcW w:type="dxa" w:w="1800"/>
+            <w:tcMar>
+              <w:top w:w="80" w:type="dxa"/>
+              <w:start w:w="120" w:type="dxa"/>
+              <w:bottom w:w="80" w:type="dxa"/>
+              <w:end w:w="120" w:type="dxa"/>
+            </w:tcMar>
+            <w:vAlign w:val="center"/>
+          </w:tcPr>
+          <w:p>
+            <w:pPr>
+              <w:spacing w:before="0" w:after="0" w:line="259" w:lineRule="auto"/>
+            </w:pPr>
+            <w:r>
+              <w:rPr>
+                <w:rFonts w:ascii="Consolas" w:hAnsi="Consolas"/>
+                <w:color w:val="1F4D78"/>
+                <w:sz w:val="17"/>
+                <w:shd w:fill="EEF2F6"/>
+              </w:rPr>
+              <w:t>email</w:t>
+            </w:r>
+          </w:p>
+        </w:tc>
+        <w:tc>
+          <w:tcPr>
+            <w:tcW w:type="dxa" w:w="1400"/>
+            <w:tcMar>
+              <w:top w:w="80" w:type="dxa"/>
+              <w:start w:w="120" w:type="dxa"/>
+              <w:bottom w:w="80" w:type="dxa"/>
+              <w:end w:w="120" w:type="dxa"/>
+            </w:tcMar>
+            <w:vAlign w:val="center"/>
+          </w:tcPr>
+          <w:p>
+            <w:pPr>
+              <w:spacing w:before="0" w:after="0" w:line="259" w:lineRule="auto"/>
+            </w:pPr>
+            <w:r>
+              <w:rPr>
+                <w:rFonts w:ascii="Consolas" w:hAnsi="Consolas"/>
+                <w:color w:val="1F4D78"/>
+                <w:sz w:val="17"/>
+                <w:shd w:fill="EEF2F6"/>
+              </w:rPr>
+              <w:t>text</w:t>
+            </w:r>
+          </w:p>
+        </w:tc>
+        <w:tc>
+          <w:tcPr>
+            <w:tcW w:type="dxa" w:w="1800"/>
+            <w:tcMar>
+              <w:top w:w="80" w:type="dxa"/>
+              <w:start w:w="120" w:type="dxa"/>
+              <w:bottom w:w="80" w:type="dxa"/>
+              <w:end w:w="120" w:type="dxa"/>
+            </w:tcMar>
+            <w:vAlign w:val="center"/>
+          </w:tcPr>
+          <w:p>
+            <w:pPr>
+              <w:spacing w:before="0" w:after="0" w:line="259" w:lineRule="auto"/>
+            </w:pPr>
+            <w:r>
+              <w:rPr>
+                <w:rFonts w:ascii="Calibri" w:hAnsi="Calibri"/>
+                <w:sz w:val="18"/>
+              </w:rPr>
+              <w:t>Obligatorio</w:t>
+            </w:r>
+          </w:p>
+        </w:tc>
+        <w:tc>
+          <w:tcPr>
+            <w:tcW w:type="dxa" w:w="4360"/>
+            <w:tcMar>
+              <w:top w:w="80" w:type="dxa"/>
+              <w:start w:w="120" w:type="dxa"/>
+              <w:bottom w:w="80" w:type="dxa"/>
+              <w:end w:w="120" w:type="dxa"/>
+            </w:tcMar>
+            <w:vAlign w:val="center"/>
+          </w:tcPr>
+          <w:p>
+            <w:pPr>
+              <w:spacing w:before="0" w:after="0" w:line="259" w:lineRule="auto"/>
+            </w:pPr>
+            <w:r>
+              <w:rPr>
+                <w:rFonts w:ascii="Calibri" w:hAnsi="Calibri"/>
+                <w:sz w:val="18"/>
+              </w:rPr>
+              <w:t>Correo asociado a la solicitud, normalizado por el backend.</w:t>
+            </w:r>
+          </w:p>
+        </w:tc>
+      </w:tr>
+      <w:tr>
+        <w:trPr>
+          <w:cantSplit/>
+        </w:trPr>
+        <w:tc>
+          <w:tcPr>
+            <w:tcW w:type="dxa" w:w="1800"/>
+            <w:tcMar>
+              <w:top w:w="80" w:type="dxa"/>
+              <w:start w:w="120" w:type="dxa"/>
+              <w:bottom w:w="80" w:type="dxa"/>
+              <w:end w:w="120" w:type="dxa"/>
+            </w:tcMar>
+            <w:vAlign w:val="center"/>
+          </w:tcPr>
+          <w:p>
+            <w:pPr>
+              <w:spacing w:before="0" w:after="0" w:line="259" w:lineRule="auto"/>
+            </w:pPr>
+            <w:r>
+              <w:rPr>
+                <w:rFonts w:ascii="Consolas" w:hAnsi="Consolas"/>
+                <w:color w:val="1F4D78"/>
+                <w:sz w:val="17"/>
+                <w:shd w:fill="EEF2F6"/>
+              </w:rPr>
+              <w:t>expires_at</w:t>
+            </w:r>
+          </w:p>
+        </w:tc>
+        <w:tc>
+          <w:tcPr>
+            <w:tcW w:type="dxa" w:w="1400"/>
+            <w:tcMar>
+              <w:top w:w="80" w:type="dxa"/>
+              <w:start w:w="120" w:type="dxa"/>
+              <w:bottom w:w="80" w:type="dxa"/>
+              <w:end w:w="120" w:type="dxa"/>
+            </w:tcMar>
+            <w:vAlign w:val="center"/>
+          </w:tcPr>
+          <w:p>
+            <w:pPr>
+              <w:spacing w:before="0" w:after="0" w:line="259" w:lineRule="auto"/>
+            </w:pPr>
+            <w:r>
+              <w:rPr>
+                <w:rFonts w:ascii="Consolas" w:hAnsi="Consolas"/>
+                <w:color w:val="1F4D78"/>
+                <w:sz w:val="17"/>
+                <w:shd w:fill="EEF2F6"/>
+              </w:rPr>
+              <w:t>timestamptz</w:t>
+            </w:r>
+          </w:p>
+        </w:tc>
+        <w:tc>
+          <w:tcPr>
+            <w:tcW w:type="dxa" w:w="1800"/>
+            <w:tcMar>
+              <w:top w:w="80" w:type="dxa"/>
+              <w:start w:w="120" w:type="dxa"/>
+              <w:bottom w:w="80" w:type="dxa"/>
+              <w:end w:w="120" w:type="dxa"/>
+            </w:tcMar>
+            <w:vAlign w:val="center"/>
+          </w:tcPr>
+          <w:p>
+            <w:pPr>
+              <w:spacing w:before="0" w:after="0" w:line="259" w:lineRule="auto"/>
+            </w:pPr>
+            <w:r>
+              <w:rPr>
+                <w:rFonts w:ascii="Calibri" w:hAnsi="Calibri"/>
+                <w:sz w:val="18"/>
+              </w:rPr>
+              <w:t>Obligatorio</w:t>
+            </w:r>
+          </w:p>
+        </w:tc>
+        <w:tc>
+          <w:tcPr>
+            <w:tcW w:type="dxa" w:w="4360"/>
+            <w:tcMar>
+              <w:top w:w="80" w:type="dxa"/>
+              <w:start w:w="120" w:type="dxa"/>
+              <w:bottom w:w="80" w:type="dxa"/>
+              <w:end w:w="120" w:type="dxa"/>
+            </w:tcMar>
+            <w:vAlign w:val="center"/>
+          </w:tcPr>
+          <w:p>
+            <w:pPr>
+              <w:spacing w:before="0" w:after="0" w:line="259" w:lineRule="auto"/>
+            </w:pPr>
+            <w:r>
+              <w:rPr>
+                <w:rFonts w:ascii="Calibri" w:hAnsi="Calibri"/>
+                <w:sz w:val="18"/>
+              </w:rPr>
+              <w:t>Vencimiento que las Edge Functions deben comprobar; la tabla no ejecuta expiración automática.</w:t>
+            </w:r>
+          </w:p>
+        </w:tc>
+      </w:tr>
+      <w:tr>
+        <w:trPr>
+          <w:cantSplit/>
+        </w:trPr>
+        <w:tc>
+          <w:tcPr>
+            <w:tcW w:type="dxa" w:w="1800"/>
+            <w:tcMar>
+              <w:top w:w="80" w:type="dxa"/>
+              <w:start w:w="120" w:type="dxa"/>
+              <w:bottom w:w="80" w:type="dxa"/>
+              <w:end w:w="120" w:type="dxa"/>
+            </w:tcMar>
+            <w:vAlign w:val="center"/>
+          </w:tcPr>
+          <w:p>
+            <w:pPr>
+              <w:spacing w:before="0" w:after="0" w:line="259" w:lineRule="auto"/>
+            </w:pPr>
+            <w:r>
+              <w:rPr>
+                <w:rFonts w:ascii="Consolas" w:hAnsi="Consolas"/>
+                <w:color w:val="1F4D78"/>
+                <w:sz w:val="17"/>
+                <w:shd w:fill="EEF2F6"/>
+              </w:rPr>
+              <w:t>used_at</w:t>
+            </w:r>
+          </w:p>
+        </w:tc>
+        <w:tc>
+          <w:tcPr>
+            <w:tcW w:type="dxa" w:w="1400"/>
+            <w:tcMar>
+              <w:top w:w="80" w:type="dxa"/>
+              <w:start w:w="120" w:type="dxa"/>
+              <w:bottom w:w="80" w:type="dxa"/>
+              <w:end w:w="120" w:type="dxa"/>
+            </w:tcMar>
+            <w:vAlign w:val="center"/>
+          </w:tcPr>
+          <w:p>
+            <w:pPr>
+              <w:spacing w:before="0" w:after="0" w:line="259" w:lineRule="auto"/>
+            </w:pPr>
+            <w:r>
+              <w:rPr>
+                <w:rFonts w:ascii="Consolas" w:hAnsi="Consolas"/>
+                <w:color w:val="1F4D78"/>
+                <w:sz w:val="17"/>
+                <w:shd w:fill="EEF2F6"/>
+              </w:rPr>
+              <w:t>timestamptz</w:t>
+            </w:r>
+          </w:p>
+        </w:tc>
+        <w:tc>
+          <w:tcPr>
+            <w:tcW w:type="dxa" w:w="1800"/>
+            <w:tcMar>
+              <w:top w:w="80" w:type="dxa"/>
+              <w:start w:w="120" w:type="dxa"/>
+              <w:bottom w:w="80" w:type="dxa"/>
+              <w:end w:w="120" w:type="dxa"/>
+            </w:tcMar>
+            <w:vAlign w:val="center"/>
+          </w:tcPr>
+          <w:p>
+            <w:pPr>
+              <w:spacing w:before="0" w:after="0" w:line="259" w:lineRule="auto"/>
+            </w:pPr>
+            <w:r>
+              <w:rPr>
+                <w:rFonts w:ascii="Calibri" w:hAnsi="Calibri"/>
+                <w:sz w:val="18"/>
+              </w:rPr>
+              <w:t>Opcional</w:t>
+            </w:r>
+          </w:p>
+        </w:tc>
+        <w:tc>
+          <w:tcPr>
+            <w:tcW w:type="dxa" w:w="4360"/>
+            <w:tcMar>
+              <w:top w:w="80" w:type="dxa"/>
+              <w:start w:w="120" w:type="dxa"/>
+              <w:bottom w:w="80" w:type="dxa"/>
+              <w:end w:w="120" w:type="dxa"/>
+            </w:tcMar>
+            <w:vAlign w:val="center"/>
+          </w:tcPr>
+          <w:p>
+            <w:pPr>
+              <w:spacing w:before="0" w:after="0" w:line="259" w:lineRule="auto"/>
+            </w:pPr>
+            <w:r>
+              <w:rPr>
+                <w:rFonts w:ascii="Calibri" w:hAnsi="Calibri"/>
+                <w:sz w:val="18"/>
+              </w:rPr>
+              <w:t xml:space="preserve">Marca de consumo; </w:t>
+            </w:r>
+            <w:r>
+              <w:rPr>
+                <w:rFonts w:ascii="Consolas" w:hAnsi="Consolas"/>
+                <w:color w:val="1F4D78"/>
+                <w:sz w:val="17"/>
+                <w:shd w:fill="EEF2F6"/>
+              </w:rPr>
+              <w:t>null</w:t>
+            </w:r>
+            <w:r>
+              <w:rPr>
+                <w:rFonts w:ascii="Calibri" w:hAnsi="Calibri"/>
+                <w:sz w:val="18"/>
+              </w:rPr>
+              <w:t xml:space="preserve"> indica que no se ha registrado su utilización.</w:t>
+            </w:r>
+          </w:p>
+        </w:tc>
+      </w:tr>
+      <w:tr>
+        <w:trPr>
+          <w:cantSplit/>
+        </w:trPr>
+        <w:tc>
+          <w:tcPr>
+            <w:tcW w:type="dxa" w:w="1800"/>
+            <w:tcMar>
+              <w:top w:w="80" w:type="dxa"/>
+              <w:start w:w="120" w:type="dxa"/>
+              <w:bottom w:w="80" w:type="dxa"/>
+              <w:end w:w="120" w:type="dxa"/>
+            </w:tcMar>
+            <w:vAlign w:val="center"/>
+          </w:tcPr>
+          <w:p>
+            <w:pPr>
+              <w:spacing w:before="0" w:after="0" w:line="259" w:lineRule="auto"/>
+            </w:pPr>
+            <w:r>
+              <w:rPr>
+                <w:rFonts w:ascii="Consolas" w:hAnsi="Consolas"/>
+                <w:color w:val="1F4D78"/>
+                <w:sz w:val="17"/>
+                <w:shd w:fill="EEF2F6"/>
+              </w:rPr>
+              <w:t>created_at</w:t>
+            </w:r>
+          </w:p>
+        </w:tc>
+        <w:tc>
+          <w:tcPr>
+            <w:tcW w:type="dxa" w:w="1400"/>
+            <w:tcMar>
+              <w:top w:w="80" w:type="dxa"/>
+              <w:start w:w="120" w:type="dxa"/>
+              <w:bottom w:w="80" w:type="dxa"/>
+              <w:end w:w="120" w:type="dxa"/>
+            </w:tcMar>
+            <w:vAlign w:val="center"/>
+          </w:tcPr>
+          <w:p>
+            <w:pPr>
+              <w:spacing w:before="0" w:after="0" w:line="259" w:lineRule="auto"/>
+            </w:pPr>
+            <w:r>
+              <w:rPr>
+                <w:rFonts w:ascii="Consolas" w:hAnsi="Consolas"/>
+                <w:color w:val="1F4D78"/>
+                <w:sz w:val="17"/>
+                <w:shd w:fill="EEF2F6"/>
+              </w:rPr>
+              <w:t>timestamptz</w:t>
+            </w:r>
+          </w:p>
+        </w:tc>
+        <w:tc>
+          <w:tcPr>
+            <w:tcW w:type="dxa" w:w="1800"/>
+            <w:tcMar>
+              <w:top w:w="80" w:type="dxa"/>
+              <w:start w:w="120" w:type="dxa"/>
+              <w:bottom w:w="80" w:type="dxa"/>
+              <w:end w:w="120" w:type="dxa"/>
+            </w:tcMar>
+            <w:vAlign w:val="center"/>
+          </w:tcPr>
+          <w:p>
+            <w:pPr>
+              <w:spacing w:before="0" w:after="0" w:line="259" w:lineRule="auto"/>
+            </w:pPr>
+            <w:r>
+              <w:rPr>
+                <w:rFonts w:ascii="Calibri" w:hAnsi="Calibri"/>
+                <w:sz w:val="18"/>
+              </w:rPr>
+              <w:t xml:space="preserve">Automático, </w:t>
+            </w:r>
+            <w:r>
+              <w:rPr>
+                <w:rFonts w:ascii="Consolas" w:hAnsi="Consolas"/>
+                <w:color w:val="1F4D78"/>
+                <w:sz w:val="17"/>
+                <w:shd w:fill="EEF2F6"/>
+              </w:rPr>
+              <w:t>now()</w:t>
+            </w:r>
+          </w:p>
+        </w:tc>
+        <w:tc>
+          <w:tcPr>
+            <w:tcW w:type="dxa" w:w="4360"/>
+            <w:tcMar>
+              <w:top w:w="80" w:type="dxa"/>
+              <w:start w:w="120" w:type="dxa"/>
+              <w:bottom w:w="80" w:type="dxa"/>
+              <w:end w:w="120" w:type="dxa"/>
+            </w:tcMar>
+            <w:vAlign w:val="center"/>
+          </w:tcPr>
+          <w:p>
+            <w:pPr>
+              <w:spacing w:before="0" w:after="0" w:line="259" w:lineRule="auto"/>
+            </w:pPr>
+            <w:r>
+              <w:rPr>
+                <w:rFonts w:ascii="Calibri" w:hAnsi="Calibri"/>
+                <w:sz w:val="18"/>
+              </w:rPr>
+              <w:t>Momento de creación; permite contar solicitudes recientes.</w:t>
+            </w:r>
+          </w:p>
+        </w:tc>
+      </w:tr>
+    </w:tbl>
+    <w:p>
+      <w:pPr>
+        <w:spacing w:after="40"/>
+      </w:pPr>
+    </w:p>
+    <w:p>
+      <w:r>
+        <w:rPr>
+          <w:rFonts w:ascii="Calibri" w:hAnsi="Calibri"/>
+        </w:rPr>
+        <w:t xml:space="preserve">La PK impide identificadores duplicados. Los índices </w:t>
+      </w:r>
+      <w:r>
+        <w:rPr>
+          <w:rFonts w:ascii="Consolas" w:hAnsi="Consolas"/>
+          <w:color w:val="1F4D78"/>
+          <w:sz w:val="19"/>
+          <w:shd w:fill="EEF2F6"/>
+        </w:rPr>
+        <w:t>idx_password_reset_tokens_email</w:t>
+      </w:r>
+      <w:r>
+        <w:rPr>
+          <w:rFonts w:ascii="Calibri" w:hAnsi="Calibri"/>
+        </w:rPr>
+        <w:t xml:space="preserve"> y </w:t>
+      </w:r>
+      <w:r>
+        <w:rPr>
+          <w:rFonts w:ascii="Consolas" w:hAnsi="Consolas"/>
+          <w:color w:val="1F4D78"/>
+          <w:sz w:val="19"/>
+          <w:shd w:fill="EEF2F6"/>
+        </w:rPr>
+        <w:t>idx_password_reset_tokens_expira</w:t>
+      </w:r>
+      <w:r>
+        <w:rPr>
+          <w:rFonts w:ascii="Calibri" w:hAnsi="Calibri"/>
+        </w:rPr>
+        <w:t xml:space="preserve"> soportan búsquedas por correo y limpieza por vencimiento. El scraper no carga, concilia ni elimina esta tabla. Su ciclo de vida corresponde al backend de recuperación, sin ampliar los permisos del frontend.</w:t>
+      </w:r>
+    </w:p>
+    <w:p>
+      <w:pPr>
+        <w:pStyle w:val="Heading2"/>
+      </w:pPr>
+      <w:r>
+        <w:t>reports</w:t>
+      </w:r>
+    </w:p>
+    <w:p>
+      <w:r>
+        <w:rPr>
+          <w:rFonts w:ascii="Calibri" w:hAnsi="Calibri"/>
+        </w:rPr>
+        <w:t>Reportes de usuarios sobre un evento, por ejemplo fecha incorrecta, evento cancelado o enlace roto.</w:t>
+      </w:r>
+    </w:p>
+    <w:tbl>
+      <w:tblPr>
+        <w:tblW w:type="dxa" w:w="9360"/>
+        <w:jc w:val="left"/>
+        <w:tblLayout w:type="fixed"/>
+        <w:tblLook w:firstColumn="1" w:firstRow="1" w:lastColumn="0" w:lastRow="0" w:noHBand="0" w:noVBand="1" w:val="04A0"/>
+        <w:tblInd w:w="120" w:type="dxa"/>
+        <w:tblBorders>
+          <w:top w:val="single" w:sz="4" w:space="0" w:color="C9D3DE"/>
+          <w:left w:val="single" w:sz="4" w:space="0" w:color="C9D3DE"/>
+          <w:bottom w:val="single" w:sz="4" w:space="0" w:color="C9D3DE"/>
+          <w:right w:val="single" w:sz="4" w:space="0" w:color="C9D3DE"/>
+          <w:insideH w:val="single" w:sz="4" w:space="0" w:color="C9D3DE"/>
+          <w:insideV w:val="single" w:sz="4" w:space="0" w:color="C9D3DE"/>
+        </w:tblBorders>
+      </w:tblPr>
+      <w:tblGrid>
+        <w:gridCol w:w="1800"/>
+        <w:gridCol w:w="1400"/>
+        <w:gridCol w:w="1800"/>
+        <w:gridCol w:w="4360"/>
+      </w:tblGrid>
+      <w:tr>
+        <w:trPr>
+          <w:cantSplit/>
+          <w:tblHeader w:val="true"/>
+        </w:trPr>
+        <w:tc>
+          <w:tcPr>
+            <w:tcW w:type="dxa" w:w="1800"/>
+            <w:tcMar>
+              <w:top w:w="80" w:type="dxa"/>
+              <w:start w:w="120" w:type="dxa"/>
+              <w:bottom w:w="80" w:type="dxa"/>
+              <w:end w:w="120" w:type="dxa"/>
+            </w:tcMar>
+            <w:vAlign w:val="center"/>
+            <w:shd w:fill="E8EEF5"/>
+          </w:tcPr>
+          <w:p>
+            <w:pPr>
+              <w:keepNext/>
+              <w:spacing w:before="0" w:after="0" w:line="259" w:lineRule="auto"/>
+            </w:pPr>
+            <w:r>
+              <w:rPr>
+                <w:rFonts w:ascii="Calibri" w:hAnsi="Calibri"/>
+                <w:b/>
+                <w:color w:val="17324D"/>
+                <w:sz w:val="18"/>
+              </w:rPr>
+              <w:t>Columna</w:t>
+            </w:r>
+          </w:p>
+        </w:tc>
+        <w:tc>
+          <w:tcPr>
+            <w:tcW w:type="dxa" w:w="1400"/>
+            <w:tcMar>
+              <w:top w:w="80" w:type="dxa"/>
+              <w:start w:w="120" w:type="dxa"/>
+              <w:bottom w:w="80" w:type="dxa"/>
+              <w:end w:w="120" w:type="dxa"/>
+            </w:tcMar>
+            <w:vAlign w:val="center"/>
+            <w:shd w:fill="E8EEF5"/>
+          </w:tcPr>
+          <w:p>
+            <w:pPr>
+              <w:keepNext/>
+              <w:spacing w:before="0" w:after="0" w:line="259" w:lineRule="auto"/>
+            </w:pPr>
+            <w:r>
+              <w:rPr>
+                <w:rFonts w:ascii="Calibri" w:hAnsi="Calibri"/>
+                <w:b/>
+                <w:color w:val="17324D"/>
+                <w:sz w:val="18"/>
+              </w:rPr>
+              <w:t>Tipo</w:t>
+            </w:r>
+          </w:p>
+        </w:tc>
+        <w:tc>
+          <w:tcPr>
+            <w:tcW w:type="dxa" w:w="1800"/>
+            <w:tcMar>
+              <w:top w:w="80" w:type="dxa"/>
+              <w:start w:w="120" w:type="dxa"/>
+              <w:bottom w:w="80" w:type="dxa"/>
+              <w:end w:w="120" w:type="dxa"/>
+            </w:tcMar>
+            <w:vAlign w:val="center"/>
+            <w:shd w:fill="E8EEF5"/>
+          </w:tcPr>
+          <w:p>
+            <w:pPr>
+              <w:keepNext/>
+              <w:spacing w:before="0" w:after="0" w:line="259" w:lineRule="auto"/>
+            </w:pPr>
+            <w:r>
+              <w:rPr>
+                <w:rFonts w:ascii="Calibri" w:hAnsi="Calibri"/>
+                <w:b/>
+                <w:color w:val="17324D"/>
+                <w:sz w:val="18"/>
+              </w:rPr>
+              <w:t>Requisito</w:t>
+            </w:r>
+          </w:p>
+        </w:tc>
+        <w:tc>
+          <w:tcPr>
+            <w:tcW w:type="dxa" w:w="4360"/>
+            <w:tcMar>
+              <w:top w:w="80" w:type="dxa"/>
+              <w:start w:w="120" w:type="dxa"/>
+              <w:bottom w:w="80" w:type="dxa"/>
+              <w:end w:w="120" w:type="dxa"/>
+            </w:tcMar>
+            <w:vAlign w:val="center"/>
+            <w:shd w:fill="E8EEF5"/>
+          </w:tcPr>
+          <w:p>
+            <w:pPr>
+              <w:keepNext/>
+              <w:spacing w:before="0" w:after="0" w:line="259" w:lineRule="auto"/>
+            </w:pPr>
+            <w:r>
+              <w:rPr>
+                <w:rFonts w:ascii="Calibri" w:hAnsi="Calibri"/>
+                <w:b/>
+                <w:color w:val="17324D"/>
+                <w:sz w:val="18"/>
+              </w:rPr>
+              <w:t>Significado</w:t>
+            </w:r>
+          </w:p>
+        </w:tc>
+      </w:tr>
+      <w:tr>
+        <w:trPr>
+          <w:cantSplit/>
+        </w:trPr>
+        <w:tc>
+          <w:tcPr>
+            <w:tcW w:type="dxa" w:w="1800"/>
+            <w:tcMar>
+              <w:top w:w="80" w:type="dxa"/>
+              <w:start w:w="120" w:type="dxa"/>
+              <w:bottom w:w="80" w:type="dxa"/>
+              <w:end w:w="120" w:type="dxa"/>
+            </w:tcMar>
+            <w:vAlign w:val="center"/>
+          </w:tcPr>
+          <w:p>
+            <w:pPr>
+              <w:spacing w:before="0" w:after="0" w:line="259" w:lineRule="auto"/>
+            </w:pPr>
+            <w:r>
+              <w:rPr>
+                <w:rFonts w:ascii="Consolas" w:hAnsi="Consolas"/>
+                <w:color w:val="1F4D78"/>
+                <w:sz w:val="17"/>
+                <w:shd w:fill="EEF2F6"/>
+              </w:rPr>
               <w:t>id</w:t>
             </w:r>
           </w:p>
@@ -19047,20 +20410,60 @@
         <w:rPr>
           <w:rFonts w:ascii="Calibri" w:hAnsi="Calibri"/>
         </w:rPr>
-        <w:t xml:space="preserve">Las categorías son </w:t>
+        <w:t xml:space="preserve">Antes de la revisión del 27 de octubre las categorías eran dinámicas: se copiaban desde las fuentes y se complementaban con reglas locales, mezclando disciplinas con otros conceptos. Con la nueva clasificación, </w:t>
       </w:r>
       <w:r>
         <w:rPr>
-          <w:rFonts w:ascii="Calibri" w:hAnsi="Calibri"/>
-          <w:b/>
+          <w:rFonts w:ascii="Consolas" w:hAnsi="Consolas"/>
+          <w:color w:val="1F4D78"/>
+          <w:sz w:val="19"/>
+          <w:shd w:fill="EEF2F6"/>
         </w:rPr>
-        <w:t>dinámicas</w:t>
+        <w:t>categories</w:t>
       </w:r>
       <w:r>
         <w:rPr>
           <w:rFonts w:ascii="Calibri" w:hAnsi="Calibri"/>
         </w:rPr>
-        <w:t xml:space="preserve">: se copian desde las taxonomías de las fuentes y se complementan con reglas de los conectores. Por ello, esta sección es una </w:t>
+        <w:t xml:space="preserve"> contiene únicamente las 18 disciplinas canónicas de </w:t>
+      </w:r>
+      <w:r>
+        <w:rPr>
+          <w:rFonts w:ascii="Consolas" w:hAnsi="Consolas"/>
+          <w:color w:val="1F4D78"/>
+          <w:sz w:val="19"/>
+          <w:shd w:fill="EEF2F6"/>
+        </w:rPr>
+        <w:t>eventos/classification.py</w:t>
+      </w:r>
+      <w:r>
+        <w:rPr>
+          <w:rFonts w:ascii="Calibri" w:hAnsi="Calibri"/>
+        </w:rPr>
+        <w:t xml:space="preserve">; formatos, públicos, programas y etiquetas originales se conservan en el objeto privado </w:t>
+      </w:r>
+      <w:r>
+        <w:rPr>
+          <w:rFonts w:ascii="Consolas" w:hAnsi="Consolas"/>
+          <w:color w:val="1F4D78"/>
+          <w:sz w:val="19"/>
+          <w:shd w:fill="EEF2F6"/>
+        </w:rPr>
+        <w:t>classification</w:t>
+      </w:r>
+      <w:r>
+        <w:rPr>
+          <w:rFonts w:ascii="Calibri" w:hAnsi="Calibri"/>
+        </w:rPr>
+        <w:t>. No se asigna «Otros» por falta de evidencia: esos casos quedan en revisión como borradores. Las tablas siguientes no son la taxonomía nueva.</w:t>
+      </w:r>
+    </w:p>
+    <w:p>
+      <w:r>
+        <w:rPr>
+          <w:rFonts w:ascii="Calibri" w:hAnsi="Calibri"/>
+        </w:rPr>
+        <w:t xml:space="preserve">Esta sección conserva una </w:t>
       </w:r>
       <w:r>
         <w:rPr>
@@ -25899,7 +27302,67 @@
         <w:rPr>
           <w:rFonts w:ascii="Calibri" w:hAnsi="Calibri"/>
         </w:rPr>
-        <w:t xml:space="preserve"> puede ejecutarse desde las políticas públicas, pero solo devuelve un booleano y no revela el motivo ni la fecha del bloqueo.</w:t>
+        <w:t xml:space="preserve"> puede ejecutarse desde las políticas públicas, pero solo devuelve un booleano y no revela el motivo ni la fecha del bloqueo. </w:t>
+      </w:r>
+      <w:r>
+        <w:rPr>
+          <w:rFonts w:ascii="Consolas" w:hAnsi="Consolas"/>
+          <w:color w:val="1F4D78"/>
+          <w:sz w:val="19"/>
+          <w:shd w:fill="EEF2F6"/>
+        </w:rPr>
+        <w:t>password_reset_tokens</w:t>
+      </w:r>
+      <w:r>
+        <w:rPr>
+          <w:rFonts w:ascii="Calibri" w:hAnsi="Calibri"/>
+        </w:rPr>
+        <w:t xml:space="preserve"> también deniega el acceso de </w:t>
+      </w:r>
+      <w:r>
+        <w:rPr>
+          <w:rFonts w:ascii="Consolas" w:hAnsi="Consolas"/>
+          <w:color w:val="1F4D78"/>
+          <w:sz w:val="19"/>
+          <w:shd w:fill="EEF2F6"/>
+        </w:rPr>
+        <w:t>anon</w:t>
+      </w:r>
+      <w:r>
+        <w:rPr>
+          <w:rFonts w:ascii="Calibri" w:hAnsi="Calibri"/>
+        </w:rPr>
+        <w:t xml:space="preserve"> y </w:t>
+      </w:r>
+      <w:r>
+        <w:rPr>
+          <w:rFonts w:ascii="Consolas" w:hAnsi="Consolas"/>
+          <w:color w:val="1F4D78"/>
+          <w:sz w:val="19"/>
+          <w:shd w:fill="EEF2F6"/>
+        </w:rPr>
+        <w:t>authenticated</w:t>
+      </w:r>
+      <w:r>
+        <w:rPr>
+          <w:rFonts w:ascii="Calibri" w:hAnsi="Calibri"/>
+        </w:rPr>
+        <w:t xml:space="preserve">; sus permisos de lectura y escritura corresponden al backend con </w:t>
+      </w:r>
+      <w:r>
+        <w:rPr>
+          <w:rFonts w:ascii="Consolas" w:hAnsi="Consolas"/>
+          <w:color w:val="1F4D78"/>
+          <w:sz w:val="19"/>
+          <w:shd w:fill="EEF2F6"/>
+        </w:rPr>
+        <w:t>service_role</w:t>
+      </w:r>
+      <w:r>
+        <w:rPr>
+          <w:rFonts w:ascii="Calibri" w:hAnsi="Calibri"/>
+        </w:rPr>
+        <w:t>, no al usuario autenticado.</w:t>
       </w:r>
     </w:p>
     <w:p>
@@ -27288,6 +28751,44 @@
           <w:rFonts w:ascii="Calibri" w:hAnsi="Calibri"/>
         </w:rPr>
         <w:t>El 20 de octubre se verificaron localmente las nueve migraciones y las tres suites SQL en PostgreSQL embebido mediante PGlite, con zonas UTC, Santiago y Tokio. Pasaron también las 144 pruebas de Python, incluida la comprobación de que este diccionario referencia todas las migraciones versionadas. Esto no sustituye la primera ejecución del nuevo trabajo en GitHub Actions con PostgreSQL 17; su resultado se consulta en el workflow después del push.</w:t>
+      </w:r>
+    </w:p>
+    <w:p>
+      <w:r>
+        <w:rPr>
+          <w:rFonts w:ascii="Calibri" w:hAnsi="Calibri"/>
+        </w:rPr>
+        <w:t xml:space="preserve">La regresión SQL añadida el 24 de octubre verifica además el esquema de recuperación: RLS, ausencia de permisos públicos incluso para </w:t>
+      </w:r>
+      <w:r>
+        <w:rPr>
+          <w:rFonts w:ascii="Consolas" w:hAnsi="Consolas"/>
+          <w:color w:val="1F4D78"/>
+          <w:sz w:val="19"/>
+          <w:shd w:fill="EEF2F6"/>
+        </w:rPr>
+        <w:t>TRUNCATE</w:t>
+      </w:r>
+      <w:r>
+        <w:rPr>
+          <w:rFonts w:ascii="Calibri" w:hAnsi="Calibri"/>
+        </w:rPr>
+        <w:t xml:space="preserve">, permisos CRUD del backend, valores predeterminados, unicidad de </w:t>
+      </w:r>
+      <w:r>
+        <w:rPr>
+          <w:rFonts w:ascii="Consolas" w:hAnsi="Consolas"/>
+          <w:color w:val="1F4D78"/>
+          <w:sz w:val="19"/>
+          <w:shd w:fill="EEF2F6"/>
+        </w:rPr>
+        <w:t>jti</w:t>
+      </w:r>
+      <w:r>
+        <w:rPr>
+          <w:rFonts w:ascii="Calibri" w:hAnsi="Calibri"/>
+        </w:rPr>
+        <w:t>, referencia a usuarios y cascada al eliminar el usuario ficticio. Se ejecuta con rollback y no envía correos ni cambia contraseñas reales.</w:t>
       </w:r>
     </w:p>
     <w:p>

</xml_diff>

<commit_message>
fix: publica revisiones vigentes y mejora fuentes y clasificacion
</commit_message>
<xml_diff>
--- a/docs/Documentacion_Base_de_Datos_Eventos_Culturales.docx
+++ b/docs/Documentacion_Base_de_Datos_Eventos_Culturales.docx
@@ -75,7 +75,7 @@
           <w:color w:val="5E6B78"/>
           <w:sz w:val="21"/>
         </w:rPr>
-        <w:t>Versión documentada: 27 de octubre de 2026</w:t>
+        <w:t>Versión documentada: 28 de octubre de 2026</w:t>
       </w:r>
     </w:p>
     <w:p>
@@ -89,7 +89,7 @@
           <w:color w:val="5E6B78"/>
           <w:sz w:val="18"/>
         </w:rPr>
-        <w:t>Migraciones: 20260831000100 · 20260902000100 · 20260911000100 · 20260912000100 · 20260921000100 · 20260924000100 · 20261020000100 · 20261020000200 · 20261020000300 · 20261024000100 · 20261027000100</w:t>
+        <w:t>Migraciones: 20260831000100 · 20260902000100 · 20260911000100 · 20260912000100 · 20260921000100 · 20260924000100 · 20261020000100 · 20261020000200 · 20261020000300 · 20261024000100 · 20261027000100 · 20261028000100</w:t>
       </w:r>
     </w:p>
     <w:p>
@@ -762,7 +762,7 @@
                 <w:rFonts w:ascii="Calibri" w:hAnsi="Calibri"/>
                 <w:sz w:val="18"/>
               </w:rPr>
-              <w:t>27 de octubre de 2026</w:t>
+              <w:t>28 de octubre de 2026</w:t>
             </w:r>
           </w:p>
         </w:tc>
@@ -1293,6 +1293,23 @@
           <w:shd w:fill="EEF2F6"/>
         </w:rPr>
         <w:t>supabase/migrations/20261027000100_cultural_classification.sql</w:t>
+      </w:r>
+    </w:p>
+    <w:p>
+      <w:pPr>
+        <w:numPr>
+          <w:ilvl w:val="0"/>
+          <w:numId w:val="10"/>
+        </w:numPr>
+      </w:pPr>
+      <w:r>
+        <w:rPr>
+          <w:rFonts w:ascii="Consolas" w:hAnsi="Consolas"/>
+          <w:color w:val="1F4D78"/>
+          <w:sz w:val="19"/>
+          <w:shd w:fill="EEF2F6"/>
+        </w:rPr>
+        <w:t>supabase/migrations/20261028000100_publish_existing_reviews.sql</w:t>
       </w:r>
     </w:p>
     <w:p>
@@ -2080,7 +2097,7 @@
         <w:rPr>
           <w:rFonts w:ascii="Calibri" w:hAnsi="Calibri"/>
         </w:rPr>
-        <w:t xml:space="preserve"> está preparada y probada localmente; su presencia en el repositorio no acredita que esté aplicada en Supabase. Añade el objeto JSON </w:t>
+        <w:t xml:space="preserve"> se verificó aplicada en Supabase el 28 de octubre mediante el historial remoto y la consulta del campo. Añade el objeto JSON </w:t>
       </w:r>
       <w:r>
         <w:rPr>
@@ -2133,7 +2150,22 @@
         <w:rPr>
           <w:rFonts w:ascii="Calibri" w:hAnsi="Calibri"/>
         </w:rPr>
-        <w:t xml:space="preserve">La taxonomía versionada distingue disciplinas, formatos, públicos y programas; conserva las etiquetas originales y la evidencia. Los directorios de librerías/museos no se consideran eventos. Los casos ambiguos quedan como </w:t>
+        <w:t xml:space="preserve">La taxonomía versionada distingue disciplinas, formatos, públicos y programas; conserva las etiquetas originales y la evidencia. Los directorios de librerías/museos no se consideran eventos. Con la política restrictiva </w:t>
+      </w:r>
+      <w:r>
+        <w:rPr>
+          <w:rFonts w:ascii="Consolas" w:hAnsi="Consolas"/>
+          <w:color w:val="1F4D78"/>
+          <w:sz w:val="19"/>
+          <w:shd w:fill="EEF2F6"/>
+        </w:rPr>
+        <w:t>quarantine</w:t>
+      </w:r>
+      <w:r>
+        <w:rPr>
+          <w:rFonts w:ascii="Calibri" w:hAnsi="Calibri"/>
+        </w:rPr>
+        <w:t xml:space="preserve">, los casos ambiguos quedan como </w:t>
       </w:r>
       <w:r>
         <w:rPr>
@@ -2148,7 +2180,7 @@
         <w:rPr>
           <w:rFonts w:ascii="Calibri" w:hAnsi="Calibri"/>
         </w:rPr>
-        <w:t xml:space="preserve"> y los rechazados se pueden archivar sin borrar filas ni interacciones. La RPC de mantenimiento protege publicaciones manuales, supresiones, organizadores bloqueados, fuentes inactivas y eventos ya cancelados/archivados. No modifica fechas ni textos.</w:t>
+        <w:t>; los rechazados se pueden archivar sin borrar filas ni interacciones. La RPC de mantenimiento protege publicaciones manuales, supresiones, organizadores bloqueados, fuentes inactivas y eventos ya cancelados/archivados. No modifica fechas ni textos.</w:t>
       </w:r>
     </w:p>
     <w:p>
@@ -2187,6 +2219,256 @@
           <w:rFonts w:ascii="Calibri" w:hAnsi="Calibri"/>
         </w:rPr>
         <w:t xml:space="preserve"> habilita la escritura después de verificar la migración. Antes de aplicarlo se debe revisar la propuesta, ya que puede reducir considerablemente el catálogo visible. Las categorías sin asociaciones no se borran automáticamente, para no afectar referencias del backend.</w:t>
+      </w:r>
+    </w:p>
+    <w:p>
+      <w:pPr>
+        <w:pStyle w:val="Heading2"/>
+      </w:pPr>
+      <w:r>
+        <w:t>Visibilidad de revisiones del 28 de octubre de 2026</w:t>
+      </w:r>
+    </w:p>
+    <w:p>
+      <w:r>
+        <w:rPr>
+          <w:rFonts w:ascii="Calibri" w:hAnsi="Calibri"/>
+        </w:rPr>
+        <w:t xml:space="preserve">La configuración activa del scraper usa </w:t>
+      </w:r>
+      <w:r>
+        <w:rPr>
+          <w:rFonts w:ascii="Consolas" w:hAnsi="Consolas"/>
+          <w:color w:val="1F4D78"/>
+          <w:sz w:val="19"/>
+          <w:shd w:fill="EEF2F6"/>
+        </w:rPr>
+        <w:t>cultural_review_action=keep</w:t>
+      </w:r>
+      <w:r>
+        <w:rPr>
+          <w:rFonts w:ascii="Calibri" w:hAnsi="Calibri"/>
+        </w:rPr>
+        <w:t xml:space="preserve">. Un candidato vigente puede estar publicado y seguir clasificado como </w:t>
+      </w:r>
+      <w:r>
+        <w:rPr>
+          <w:rFonts w:ascii="Consolas" w:hAnsi="Consolas"/>
+          <w:color w:val="1F4D78"/>
+          <w:sz w:val="19"/>
+          <w:shd w:fill="EEF2F6"/>
+        </w:rPr>
+        <w:t>review</w:t>
+      </w:r>
+      <w:r>
+        <w:rPr>
+          <w:rFonts w:ascii="Calibri" w:hAnsi="Calibri"/>
+        </w:rPr>
+        <w:t xml:space="preserve">: visibilidad y clasificación son dimensiones distintas. </w:t>
+      </w:r>
+      <w:r>
+        <w:rPr>
+          <w:rFonts w:ascii="Consolas" w:hAnsi="Consolas"/>
+          <w:color w:val="1F4D78"/>
+          <w:sz w:val="19"/>
+          <w:shd w:fill="EEF2F6"/>
+        </w:rPr>
+        <w:t>classification.review_action</w:t>
+      </w:r>
+      <w:r>
+        <w:rPr>
+          <w:rFonts w:ascii="Calibri" w:hAnsi="Calibri"/>
+        </w:rPr>
+        <w:t xml:space="preserve"> registra la política aplicada y </w:t>
+      </w:r>
+      <w:r>
+        <w:rPr>
+          <w:rFonts w:ascii="Consolas" w:hAnsi="Consolas"/>
+          <w:color w:val="1F4D78"/>
+          <w:sz w:val="19"/>
+          <w:shd w:fill="EEF2F6"/>
+        </w:rPr>
+        <w:t>classification.publication_status</w:t>
+      </w:r>
+      <w:r>
+        <w:rPr>
+          <w:rFonts w:ascii="Calibri" w:hAnsi="Calibri"/>
+        </w:rPr>
+        <w:t xml:space="preserve"> el destino automático; </w:t>
+      </w:r>
+      <w:r>
+        <w:rPr>
+          <w:rFonts w:ascii="Consolas" w:hAnsi="Consolas"/>
+          <w:color w:val="1F4D78"/>
+          <w:sz w:val="19"/>
+          <w:shd w:fill="EEF2F6"/>
+        </w:rPr>
+        <w:t>events.is_suppressed</w:t>
+      </w:r>
+      <w:r>
+        <w:rPr>
+          <w:rFonts w:ascii="Calibri" w:hAnsi="Calibri"/>
+        </w:rPr>
+        <w:t xml:space="preserve"> conserva la ocultación administrativa persistente y no es sobrescrita por el scraper. El panel debe gestionar esa marca mediante un backend autorizado para </w:t>
+      </w:r>
+      <w:r>
+        <w:rPr>
+          <w:rFonts w:ascii="Consolas" w:hAnsi="Consolas"/>
+          <w:color w:val="1F4D78"/>
+          <w:sz w:val="19"/>
+          <w:shd w:fill="EEF2F6"/>
+        </w:rPr>
+        <w:t>admin</w:t>
+      </w:r>
+      <w:r>
+        <w:rPr>
+          <w:rFonts w:ascii="Calibri" w:hAnsi="Calibri"/>
+        </w:rPr>
+        <w:t>; estos cambios no implementan el panel.</w:t>
+      </w:r>
+    </w:p>
+    <w:p>
+      <w:r>
+        <w:rPr>
+          <w:rFonts w:ascii="Calibri" w:hAnsi="Calibri"/>
+        </w:rPr>
+        <w:t xml:space="preserve">La migración </w:t>
+      </w:r>
+      <w:r>
+        <w:rPr>
+          <w:rFonts w:ascii="Consolas" w:hAnsi="Consolas"/>
+          <w:color w:val="1F4D78"/>
+          <w:sz w:val="19"/>
+          <w:shd w:fill="EEF2F6"/>
+        </w:rPr>
+        <w:t>20261028000100_publish_existing_reviews.sql</w:t>
+      </w:r>
+      <w:r>
+        <w:rPr>
+          <w:rFonts w:ascii="Calibri" w:hAnsi="Calibri"/>
+        </w:rPr>
+        <w:t xml:space="preserve"> aplica una actualización de datos acotada y atómica, sin tablas, columnas, índices ni permisos nuevos. Publica únicamente borradores extraídos cuya procedencia acredita </w:t>
+      </w:r>
+      <w:r>
+        <w:rPr>
+          <w:rFonts w:ascii="Consolas" w:hAnsi="Consolas"/>
+          <w:color w:val="1F4D78"/>
+          <w:sz w:val="19"/>
+          <w:shd w:fill="EEF2F6"/>
+        </w:rPr>
+        <w:t>decision=review</w:t>
+      </w:r>
+      <w:r>
+        <w:rPr>
+          <w:rFonts w:ascii="Calibri" w:hAnsi="Calibri"/>
+        </w:rPr>
+        <w:t xml:space="preserve">, </w:t>
+      </w:r>
+      <w:r>
+        <w:rPr>
+          <w:rFonts w:ascii="Consolas" w:hAnsi="Consolas"/>
+          <w:color w:val="1F4D78"/>
+          <w:sz w:val="19"/>
+          <w:shd w:fill="EEF2F6"/>
+        </w:rPr>
+        <w:t>content_kind=event</w:t>
+      </w:r>
+      <w:r>
+        <w:rPr>
+          <w:rFonts w:ascii="Calibri" w:hAnsi="Calibri"/>
+        </w:rPr>
+        <w:t xml:space="preserve"> y destino previo </w:t>
+      </w:r>
+      <w:r>
+        <w:rPr>
+          <w:rFonts w:ascii="Consolas" w:hAnsi="Consolas"/>
+          <w:color w:val="1F4D78"/>
+          <w:sz w:val="19"/>
+          <w:shd w:fill="EEF2F6"/>
+        </w:rPr>
+        <w:t>draft</w:t>
+      </w:r>
+      <w:r>
+        <w:rPr>
+          <w:rFonts w:ascii="Calibri" w:hAnsi="Calibri"/>
+        </w:rPr>
+        <w:t>, de la versión conocida del clasificador. Comprueba vigencia con el reloj de PostgreSQL y el inicio del día en Santiago. Excluye fechas inconsistentes, eventos sin inicio, borradores manuales, supresiones, organizadores bloqueados y fuentes inactivas o retiradas. No restaura archivados/cancelados ni cambia categorías, textos, OCR o interacciones. Su repetición no vuelve a modificar las filas ya publicadas.</w:t>
+      </w:r>
+    </w:p>
+    <w:p>
+      <w:r>
+        <w:rPr>
+          <w:rFonts w:ascii="Calibri" w:hAnsi="Calibri"/>
+        </w:rPr>
+        <w:t>Se aplicó y verificó en Supabase el 28 de octubre: 369 revisiones pasaron de borrador a publicadas, manteniendo su decisión y evidencia. El conteo observado pasó de 577 publicados/371 borradores a 946 publicados/2 borradores; los 289 archivados y el total de 1.237 registros se conservaron. Son cifras de esa comprobación, no cantidades fijas del catálogo.</w:t>
+      </w:r>
+    </w:p>
+    <w:p>
+      <w:r>
+        <w:rPr>
+          <w:rFonts w:ascii="Calibri" w:hAnsi="Calibri"/>
+        </w:rPr>
+        <w:t xml:space="preserve">La RPC y la herramienta </w:t>
+      </w:r>
+      <w:r>
+        <w:rPr>
+          <w:rFonts w:ascii="Consolas" w:hAnsi="Consolas"/>
+          <w:color w:val="1F4D78"/>
+          <w:sz w:val="19"/>
+          <w:shd w:fill="EEF2F6"/>
+        </w:rPr>
+        <w:t>tools.reclassify_catalog</w:t>
+      </w:r>
+      <w:r>
+        <w:rPr>
+          <w:rFonts w:ascii="Calibri" w:hAnsi="Calibri"/>
+        </w:rPr>
+        <w:t xml:space="preserve"> mantienen el modo conservador </w:t>
+      </w:r>
+      <w:r>
+        <w:rPr>
+          <w:rFonts w:ascii="Consolas" w:hAnsi="Consolas"/>
+          <w:color w:val="1F4D78"/>
+          <w:sz w:val="19"/>
+          <w:shd w:fill="EEF2F6"/>
+        </w:rPr>
+        <w:t>quarantine</w:t>
+      </w:r>
+      <w:r>
+        <w:rPr>
+          <w:rFonts w:ascii="Calibri" w:hAnsi="Calibri"/>
+        </w:rPr>
+        <w:t xml:space="preserve">; no deben ejecutarse con </w:t>
+      </w:r>
+      <w:r>
+        <w:rPr>
+          <w:rFonts w:ascii="Consolas" w:hAnsi="Consolas"/>
+          <w:color w:val="1F4D78"/>
+          <w:sz w:val="19"/>
+          <w:shd w:fill="EEF2F6"/>
+        </w:rPr>
+        <w:t>--apply</w:t>
+      </w:r>
+      <w:r>
+        <w:rPr>
+          <w:rFonts w:ascii="Calibri" w:hAnsi="Calibri"/>
+        </w:rPr>
+        <w:t xml:space="preserve"> para publicar pendientes. Las siguientes sincronizaciones normales aplican </w:t>
+      </w:r>
+      <w:r>
+        <w:rPr>
+          <w:rFonts w:ascii="Consolas" w:hAnsi="Consolas"/>
+          <w:color w:val="1F4D78"/>
+          <w:sz w:val="19"/>
+          <w:shd w:fill="EEF2F6"/>
+        </w:rPr>
+        <w:t>keep</w:t>
+      </w:r>
+      <w:r>
+        <w:rPr>
+          <w:rFonts w:ascii="Calibri" w:hAnsi="Calibri"/>
+        </w:rPr>
+        <w:t>, respetando las supresiones administrativas y los demás controles.</w:t>
       </w:r>
     </w:p>
     <w:p>
@@ -10539,7 +10821,7 @@
                 <w:rFonts w:ascii="Calibri" w:hAnsi="Calibri"/>
                 <w:sz w:val="18"/>
               </w:rPr>
-              <w:t xml:space="preserve">. El scraper actual carga como </w:t>
+              <w:t xml:space="preserve">. Con </w:t>
             </w:r>
             <w:r>
               <w:rPr>
@@ -10548,14 +10830,14 @@
                 <w:sz w:val="17"/>
                 <w:shd w:fill="EEF2F6"/>
               </w:rPr>
-              <w:t>published</w:t>
-            </w:r>
-            <w:r>
-              <w:rPr>
-                <w:rFonts w:ascii="Calibri" w:hAnsi="Calibri"/>
-                <w:sz w:val="18"/>
-              </w:rPr>
-              <w:t>.</w:t>
+              <w:t>keep</w:t>
+            </w:r>
+            <w:r>
+              <w:rPr>
+                <w:rFonts w:ascii="Calibri" w:hAnsi="Calibri"/>
+                <w:sz w:val="18"/>
+              </w:rPr>
+              <w:t>, los candidatos aceptados y en revisión pueden publicarse; no sustituye la clasificación ni la supresión administrativa.</w:t>
             </w:r>
           </w:p>
         </w:tc>
@@ -20455,7 +20737,52 @@
         <w:rPr>
           <w:rFonts w:ascii="Calibri" w:hAnsi="Calibri"/>
         </w:rPr>
-        <w:t>. No se asigna «Otros» por falta de evidencia: esos casos quedan en revisión como borradores. Las tablas siguientes no son la taxonomía nueva.</w:t>
+        <w:t xml:space="preserve">. No se asigna «Otros» por falta de evidencia: esos casos quedan clasificados como </w:t>
+      </w:r>
+      <w:r>
+        <w:rPr>
+          <w:rFonts w:ascii="Consolas" w:hAnsi="Consolas"/>
+          <w:color w:val="1F4D78"/>
+          <w:sz w:val="19"/>
+          <w:shd w:fill="EEF2F6"/>
+        </w:rPr>
+        <w:t>review</w:t>
+      </w:r>
+      <w:r>
+        <w:rPr>
+          <w:rFonts w:ascii="Calibri" w:hAnsi="Calibri"/>
+        </w:rPr>
+        <w:t xml:space="preserve">, visibles con </w:t>
+      </w:r>
+      <w:r>
+        <w:rPr>
+          <w:rFonts w:ascii="Consolas" w:hAnsi="Consolas"/>
+          <w:color w:val="1F4D78"/>
+          <w:sz w:val="19"/>
+          <w:shd w:fill="EEF2F6"/>
+        </w:rPr>
+        <w:t>keep</w:t>
+      </w:r>
+      <w:r>
+        <w:rPr>
+          <w:rFonts w:ascii="Calibri" w:hAnsi="Calibri"/>
+        </w:rPr>
+        <w:t xml:space="preserve"> o como borradores con </w:t>
+      </w:r>
+      <w:r>
+        <w:rPr>
+          <w:rFonts w:ascii="Consolas" w:hAnsi="Consolas"/>
+          <w:color w:val="1F4D78"/>
+          <w:sz w:val="19"/>
+          <w:shd w:fill="EEF2F6"/>
+        </w:rPr>
+        <w:t>quarantine</w:t>
+      </w:r>
+      <w:r>
+        <w:rPr>
+          <w:rFonts w:ascii="Calibri" w:hAnsi="Calibri"/>
+        </w:rPr>
+        <w:t>. Las tablas siguientes no son la taxonomía nueva.</w:t>
       </w:r>
     </w:p>
     <w:p>

</xml_diff>